<commit_message>
Refresh FixLab publication and rollout docs
Co-authored-by: Copilot <223556219+Copilot@users.noreply.github.com>

Copilot-Session: c265b72a-dff3-42ec-a21a-f06fc9eaf770
</commit_message>
<xml_diff>
--- a/docs/FixLab-Installation-and-Smoke-Test.docx
+++ b/docs/FixLab-Installation-and-Smoke-Test.docx
@@ -277,6 +277,7 @@
           <w:rFonts w:ascii="Consolas" w:hAnsi="Consolas"/>
           <w:sz w:val="18"/>
         </w:rPr>
+        <w:lastRenderedPageBreak/>
         <w:t>fixlab --help</w:t>
       </w:r>
     </w:p>
@@ -497,6 +498,7 @@
     </w:p>
     <w:p>
       <w:r>
+        <w:lastRenderedPageBreak/>
         <w:t>Do not add credentials, access tokens, cookies, browser-state contents, customer data, or production endpoints to the profile.</w:t>
       </w:r>
     </w:p>
@@ -773,6 +775,7 @@
         </w:numPr>
       </w:pPr>
       <w:r>
+        <w:lastRenderedPageBreak/>
         <w:t>No commit, push, or pull-request update occurs in validation-only mode.</w:t>
       </w:r>
     </w:p>
@@ -901,6 +904,25 @@
     <w:p>
       <w:r>
         <w:t>Document prepared from the FixLab installation, getting-started, and team-rollout guidance.</w:t>
+      </w:r>
+    </w:p>
+    <w:p/>
+    <w:p>
+      <w:pPr>
+        <w:pStyle w:val="Heading1"/>
+      </w:pPr>
+      <w:r>
+        <w:t>Current publication status</w:t>
+      </w:r>
+    </w:p>
+    <w:p>
+      <w:r>
+        <w:t>The current GitHub release is v0.5.4. FixLab is installed directly from https://github.com/MonaDevAI/FixLab. The @fixlab/cli package is not published to the public npm registry, and FixLab is not yet listed in the official GitHub Copilot plugin marketplace. Marketplace installation becomes available only after a separate pull request to github/copilot-plugins is reviewed and merged.</w:t>
+      </w:r>
+    </w:p>
+    <w:p>
+      <w:r>
+        <w:t>Release: https://github.com/MonaDevAI/FixLab/releases/tag/v0.5.4</w:t>
       </w:r>
     </w:p>
     <w:p/>

</xml_diff>

<commit_message>
Add chat-driven bug workflow guide
Co-authored-by: Copilot <223556219+Copilot@users.noreply.github.com>

Copilot-Session: 9168917c-fadb-448b-afda-9613a02dd02d
</commit_message>
<xml_diff>
--- a/docs/FixLab-Installation-and-Smoke-Test.docx
+++ b/docs/FixLab-Installation-and-Smoke-Test.docx
@@ -5,131 +5,219 @@
     <w:p>
       <w:pPr>
         <w:pStyle w:val="Title"/>
-      </w:pPr>
-      <w:r>
-        <w:t>FixLab Installation and Smoke Test</w:t>
-      </w:r>
-    </w:p>
-    <w:p>
-      <w:pPr>
-        <w:pStyle w:val="Subtitle"/>
-      </w:pPr>
-      <w:r>
-        <w:t>GitHub Copilot CLI and Agency Copilot installation paths</w:t>
+        <w:spacing w:after="120"/>
+        <w:rPr>
+          <w:rFonts w:ascii="Aptos" w:hAnsi="Aptos"/>
+          <w:sz w:val="22"/>
+        </w:rPr>
+      </w:pPr>
+      <w:r>
+        <w:rPr>
+          <w:rFonts w:ascii="Aptos" w:hAnsi="Aptos"/>
+          <w:sz w:val="22"/>
+        </w:rPr>
+        <w:t>FixLab Chat-First Installation, Onboarding, Bug Validation, and Pull Request Guide</w:t>
       </w:r>
     </w:p>
     <w:p>
       <w:pPr>
         <w:pStyle w:val="Heading1"/>
-      </w:pPr>
-      <w:r>
+        <w:spacing w:after="120"/>
+        <w:rPr>
+          <w:rFonts w:ascii="Aptos" w:hAnsi="Aptos"/>
+          <w:sz w:val="22"/>
+        </w:rPr>
+      </w:pPr>
+      <w:r>
+        <w:rPr>
+          <w:rFonts w:ascii="Aptos" w:hAnsi="Aptos"/>
+          <w:sz w:val="22"/>
+        </w:rPr>
+        <w:t>React frontends and optional .NET backends</w:t>
+      </w:r>
+    </w:p>
+    <w:p>
+      <w:pPr>
+        <w:pStyle w:val="Heading1"/>
+        <w:spacing w:after="120"/>
+        <w:rPr>
+          <w:rFonts w:ascii="Aptos" w:hAnsi="Aptos"/>
+          <w:sz w:val="22"/>
+        </w:rPr>
+      </w:pPr>
+      <w:r>
+        <w:rPr>
+          <w:rFonts w:ascii="Aptos" w:hAnsi="Aptos"/>
+          <w:sz w:val="22"/>
+        </w:rPr>
         <w:t>Purpose</w:t>
       </w:r>
     </w:p>
     <w:p>
-      <w:r>
-        <w:t>This guide helps a developer install FixLab using either GitHub Copilot CLI or Agency Copilot, verify the local machine, and run a small validation-only test. FixLab runs locally and uses repository-owned configuration.</w:t>
+      <w:pPr>
+        <w:spacing w:after="120"/>
+        <w:rPr>
+          <w:rFonts w:ascii="Aptos" w:hAnsi="Aptos"/>
+          <w:sz w:val="22"/>
+        </w:rPr>
+      </w:pPr>
+      <w:r>
+        <w:rPr>
+          <w:rFonts w:ascii="Aptos" w:hAnsi="Aptos"/>
+          <w:sz w:val="22"/>
+        </w:rPr>
+        <w:t>This guide explains the complete developer workflow for installing FixLab, selecting or onboarding a repository through chat, opening the dashboard, submitting UI or API bugs, validating the fix, recovering interrupted work, and creating or updating a pull request.</w:t>
       </w:r>
     </w:p>
     <w:p>
       <w:pPr>
         <w:pStyle w:val="Heading1"/>
-      </w:pPr>
-      <w:r>
-        <w:t>Common prerequisites</w:t>
-      </w:r>
-    </w:p>
-    <w:p>
-      <w:pPr>
-        <w:pStyle w:val="ListParagraph"/>
-        <w:numPr>
-          <w:ilvl w:val="0"/>
-          <w:numId w:val="1"/>
-        </w:numPr>
-      </w:pPr>
-      <w:r>
-        <w:t>Windows developer machine with access to the target source repository.</w:t>
-      </w:r>
-    </w:p>
-    <w:p>
-      <w:pPr>
-        <w:pStyle w:val="ListParagraph"/>
-        <w:numPr>
-          <w:ilvl w:val="0"/>
-          <w:numId w:val="1"/>
-        </w:numPr>
-      </w:pPr>
-      <w:r>
-        <w:t>Git.</w:t>
-      </w:r>
-    </w:p>
-    <w:p>
-      <w:pPr>
-        <w:pStyle w:val="ListParagraph"/>
-        <w:numPr>
-          <w:ilvl w:val="0"/>
-          <w:numId w:val="1"/>
-        </w:numPr>
-      </w:pPr>
-      <w:r>
-        <w:t>Node.js 18 or later. npm is normally installed with Node.js.</w:t>
-      </w:r>
-    </w:p>
-    <w:p>
-      <w:pPr>
-        <w:pStyle w:val="ListParagraph"/>
-        <w:numPr>
-          <w:ilvl w:val="0"/>
-          <w:numId w:val="1"/>
-        </w:numPr>
-      </w:pPr>
-      <w:r>
-        <w:t>PowerShell 7.</w:t>
-      </w:r>
-    </w:p>
-    <w:p>
-      <w:pPr>
-        <w:pStyle w:val="ListParagraph"/>
-        <w:numPr>
-          <w:ilvl w:val="0"/>
-          <w:numId w:val="1"/>
-        </w:numPr>
-      </w:pPr>
-      <w:r>
-        <w:t>The .NET SDK required by the target repository.</w:t>
-      </w:r>
-    </w:p>
-    <w:p>
-      <w:pPr>
-        <w:pStyle w:val="ListParagraph"/>
-        <w:numPr>
-          <w:ilvl w:val="0"/>
-          <w:numId w:val="1"/>
-        </w:numPr>
-      </w:pPr>
-      <w:r>
-        <w:t>A repository-local Playwright package and an approved browser such as Microsoft Edge.</w:t>
-      </w:r>
-    </w:p>
-    <w:p>
-      <w:pPr>
-        <w:pStyle w:val="ListParagraph"/>
-        <w:numPr>
-          <w:ilvl w:val="0"/>
-          <w:numId w:val="1"/>
-        </w:numPr>
-      </w:pPr>
-      <w:r>
-        <w:t>Access to an approved non-production validation environment.</w:t>
-      </w:r>
-    </w:p>
-    <w:p>
-      <w:r>
-        <w:t>Verify the common tools:</w:t>
-      </w:r>
-    </w:p>
-    <w:p>
-      <w:pPr>
+        <w:spacing w:after="120"/>
+        <w:rPr>
+          <w:rFonts w:ascii="Aptos" w:hAnsi="Aptos"/>
+          <w:sz w:val="22"/>
+        </w:rPr>
+      </w:pPr>
+      <w:r>
+        <w:rPr>
+          <w:rFonts w:ascii="Aptos" w:hAnsi="Aptos"/>
+          <w:sz w:val="22"/>
+        </w:rPr>
+        <w:t>1. Prerequisites</w:t>
+      </w:r>
+    </w:p>
+    <w:p>
+      <w:pPr>
+        <w:spacing w:after="120"/>
+        <w:rPr>
+          <w:rFonts w:ascii="Aptos" w:hAnsi="Aptos"/>
+          <w:sz w:val="22"/>
+        </w:rPr>
+      </w:pPr>
+      <w:r>
+        <w:rPr>
+          <w:rFonts w:ascii="Aptos" w:hAnsi="Aptos"/>
+          <w:sz w:val="22"/>
+        </w:rPr>
+        <w:t>- Windows developer machine with access to the target source repository.</w:t>
+      </w:r>
+    </w:p>
+    <w:p>
+      <w:pPr>
+        <w:spacing w:after="120"/>
+        <w:rPr>
+          <w:rFonts w:ascii="Aptos" w:hAnsi="Aptos"/>
+          <w:sz w:val="22"/>
+        </w:rPr>
+      </w:pPr>
+      <w:r>
+        <w:rPr>
+          <w:rFonts w:ascii="Aptos" w:hAnsi="Aptos"/>
+          <w:sz w:val="22"/>
+        </w:rPr>
+        <w:t>- Git.</w:t>
+      </w:r>
+    </w:p>
+    <w:p>
+      <w:pPr>
+        <w:spacing w:after="120"/>
+        <w:rPr>
+          <w:rFonts w:ascii="Aptos" w:hAnsi="Aptos"/>
+          <w:sz w:val="22"/>
+        </w:rPr>
+      </w:pPr>
+      <w:r>
+        <w:rPr>
+          <w:rFonts w:ascii="Aptos" w:hAnsi="Aptos"/>
+          <w:sz w:val="22"/>
+        </w:rPr>
+        <w:t>- Node.js 18 or later with npm.</w:t>
+      </w:r>
+    </w:p>
+    <w:p>
+      <w:pPr>
+        <w:spacing w:after="120"/>
+        <w:rPr>
+          <w:rFonts w:ascii="Aptos" w:hAnsi="Aptos"/>
+          <w:sz w:val="22"/>
+        </w:rPr>
+      </w:pPr>
+      <w:r>
+        <w:rPr>
+          <w:rFonts w:ascii="Aptos" w:hAnsi="Aptos"/>
+          <w:sz w:val="22"/>
+        </w:rPr>
+        <w:t>- GitHub Copilot CLI or Agency Copilot, installed and authenticated.</w:t>
+      </w:r>
+    </w:p>
+    <w:p>
+      <w:pPr>
+        <w:spacing w:after="120"/>
+        <w:rPr>
+          <w:rFonts w:ascii="Aptos" w:hAnsi="Aptos"/>
+          <w:sz w:val="22"/>
+        </w:rPr>
+      </w:pPr>
+      <w:r>
+        <w:rPr>
+          <w:rFonts w:ascii="Aptos" w:hAnsi="Aptos"/>
+          <w:sz w:val="22"/>
+        </w:rPr>
+        <w:t>- The .NET SDK required by the repository when a backend is present.</w:t>
+      </w:r>
+    </w:p>
+    <w:p>
+      <w:pPr>
+        <w:spacing w:after="120"/>
+        <w:rPr>
+          <w:rFonts w:ascii="Aptos" w:hAnsi="Aptos"/>
+          <w:sz w:val="22"/>
+        </w:rPr>
+      </w:pPr>
+      <w:r>
+        <w:rPr>
+          <w:rFonts w:ascii="Aptos" w:hAnsi="Aptos"/>
+          <w:sz w:val="22"/>
+        </w:rPr>
+        <w:t>- Repository-local Playwright and an approved browser for UI validation.</w:t>
+      </w:r>
+    </w:p>
+    <w:p>
+      <w:pPr>
+        <w:spacing w:after="120"/>
+        <w:rPr>
+          <w:rFonts w:ascii="Aptos" w:hAnsi="Aptos"/>
+          <w:sz w:val="22"/>
+        </w:rPr>
+      </w:pPr>
+      <w:r>
+        <w:rPr>
+          <w:rFonts w:ascii="Aptos" w:hAnsi="Aptos"/>
+          <w:sz w:val="22"/>
+        </w:rPr>
+        <w:t>- Access to an approved non-production validation environment and safe test data.</w:t>
+      </w:r>
+    </w:p>
+    <w:p>
+      <w:pPr>
+        <w:pStyle w:val="Heading2"/>
+        <w:spacing w:after="120"/>
+        <w:rPr>
+          <w:rFonts w:ascii="Aptos" w:hAnsi="Aptos"/>
+          <w:sz w:val="22"/>
+        </w:rPr>
+      </w:pPr>
+      <w:r>
+        <w:rPr>
+          <w:rFonts w:ascii="Aptos" w:hAnsi="Aptos"/>
+          <w:sz w:val="22"/>
+        </w:rPr>
+        <w:t>Verify the tools:</w:t>
+      </w:r>
+    </w:p>
+    <w:p>
+      <w:pPr>
+        <w:spacing w:after="120"/>
         <w:ind w:left="360"/>
         <w:rPr>
           <w:rFonts w:ascii="Consolas" w:hAnsi="Consolas"/>
@@ -141,11 +229,29 @@
           <w:rFonts w:ascii="Consolas" w:hAnsi="Consolas"/>
           <w:sz w:val="18"/>
         </w:rPr>
+        <w:t>git --version</w:t>
+      </w:r>
+    </w:p>
+    <w:p>
+      <w:pPr>
+        <w:spacing w:after="120"/>
+        <w:ind w:left="360"/>
+        <w:rPr>
+          <w:rFonts w:ascii="Consolas" w:hAnsi="Consolas"/>
+          <w:sz w:val="18"/>
+        </w:rPr>
+      </w:pPr>
+      <w:r>
+        <w:rPr>
+          <w:rFonts w:ascii="Consolas" w:hAnsi="Consolas"/>
+          <w:sz w:val="18"/>
+        </w:rPr>
         <w:t>node --version</w:t>
       </w:r>
     </w:p>
     <w:p>
       <w:pPr>
+        <w:spacing w:after="120"/>
         <w:ind w:left="360"/>
         <w:rPr>
           <w:rFonts w:ascii="Consolas" w:hAnsi="Consolas"/>
@@ -162,6 +268,7 @@
     </w:p>
     <w:p>
       <w:pPr>
+        <w:spacing w:after="120"/>
         <w:ind w:left="360"/>
         <w:rPr>
           <w:rFonts w:ascii="Consolas" w:hAnsi="Consolas"/>
@@ -173,11 +280,45 @@
           <w:rFonts w:ascii="Consolas" w:hAnsi="Consolas"/>
           <w:sz w:val="18"/>
         </w:rPr>
-        <w:t>git --version</w:t>
-      </w:r>
-    </w:p>
-    <w:p>
-      <w:pPr>
+        <w:t>copilot --version</w:t>
+      </w:r>
+    </w:p>
+    <w:p>
+      <w:pPr>
+        <w:pStyle w:val="Heading1"/>
+        <w:spacing w:after="120"/>
+        <w:rPr>
+          <w:rFonts w:ascii="Aptos" w:hAnsi="Aptos"/>
+          <w:sz w:val="22"/>
+        </w:rPr>
+      </w:pPr>
+      <w:r>
+        <w:rPr>
+          <w:rFonts w:ascii="Aptos" w:hAnsi="Aptos"/>
+          <w:sz w:val="22"/>
+        </w:rPr>
+        <w:t>2. Install or update FixLab</w:t>
+      </w:r>
+    </w:p>
+    <w:p>
+      <w:pPr>
+        <w:spacing w:after="120"/>
+        <w:rPr>
+          <w:rFonts w:ascii="Aptos" w:hAnsi="Aptos"/>
+          <w:sz w:val="22"/>
+        </w:rPr>
+      </w:pPr>
+      <w:r>
+        <w:rPr>
+          <w:rFonts w:ascii="Aptos" w:hAnsi="Aptos"/>
+          <w:sz w:val="22"/>
+        </w:rPr>
+        <w:t>FixLab is currently installed directly from its GitHub repository:</w:t>
+      </w:r>
+    </w:p>
+    <w:p>
+      <w:pPr>
+        <w:spacing w:after="120"/>
         <w:ind w:left="360"/>
         <w:rPr>
           <w:rFonts w:ascii="Consolas" w:hAnsi="Consolas"/>
@@ -189,11 +330,12 @@
           <w:rFonts w:ascii="Consolas" w:hAnsi="Consolas"/>
           <w:sz w:val="18"/>
         </w:rPr>
-        <w:t>pwsh --version</w:t>
-      </w:r>
-    </w:p>
-    <w:p>
-      <w:pPr>
+        <w:t>npm install --global github:MonaDevAI/FixLab</w:t>
+      </w:r>
+    </w:p>
+    <w:p>
+      <w:pPr>
+        <w:spacing w:after="120"/>
         <w:ind w:left="360"/>
         <w:rPr>
           <w:rFonts w:ascii="Consolas" w:hAnsi="Consolas"/>
@@ -205,27 +347,128 @@
           <w:rFonts w:ascii="Consolas" w:hAnsi="Consolas"/>
           <w:sz w:val="18"/>
         </w:rPr>
-        <w:t>dotnet --version</w:t>
+        <w:t>fixlab --help</w:t>
+      </w:r>
+    </w:p>
+    <w:p>
+      <w:pPr>
+        <w:spacing w:after="120"/>
+        <w:rPr>
+          <w:rFonts w:ascii="Aptos" w:hAnsi="Aptos"/>
+          <w:sz w:val="22"/>
+        </w:rPr>
+      </w:pPr>
+      <w:r>
+        <w:rPr>
+          <w:rFonts w:ascii="Aptos" w:hAnsi="Aptos"/>
+          <w:sz w:val="22"/>
+        </w:rPr>
+        <w:t>Run the same npm install command later to update the local FixLab CLI.</w:t>
       </w:r>
     </w:p>
     <w:p>
       <w:pPr>
         <w:pStyle w:val="Heading1"/>
-      </w:pPr>
-      <w:r>
-        <w:t>Option A - Install with GitHub Copilot CLI</w:t>
+        <w:spacing w:after="120"/>
+        <w:rPr>
+          <w:rFonts w:ascii="Aptos" w:hAnsi="Aptos"/>
+          <w:sz w:val="22"/>
+        </w:rPr>
+      </w:pPr>
+      <w:r>
+        <w:rPr>
+          <w:rFonts w:ascii="Aptos" w:hAnsi="Aptos"/>
+          <w:sz w:val="22"/>
+        </w:rPr>
+        <w:t>3. Start chat and select a repository</w:t>
+      </w:r>
+    </w:p>
+    <w:p>
+      <w:pPr>
+        <w:spacing w:after="120"/>
+        <w:ind w:left="360"/>
+        <w:rPr>
+          <w:rFonts w:ascii="Consolas" w:hAnsi="Consolas"/>
+          <w:sz w:val="18"/>
+        </w:rPr>
+      </w:pPr>
+      <w:r>
+        <w:rPr>
+          <w:rFonts w:ascii="Consolas" w:hAnsi="Consolas"/>
+          <w:sz w:val="18"/>
+        </w:rPr>
+        <w:t>fixlab chat --runtime copilot</w:t>
+      </w:r>
+    </w:p>
+    <w:p>
+      <w:pPr>
+        <w:spacing w:after="120"/>
+        <w:rPr>
+          <w:rFonts w:ascii="Aptos" w:hAnsi="Aptos"/>
+          <w:sz w:val="22"/>
+        </w:rPr>
+      </w:pPr>
+      <w:r>
+        <w:rPr>
+          <w:rFonts w:ascii="Aptos" w:hAnsi="Aptos"/>
+          <w:sz w:val="22"/>
+        </w:rPr>
+        <w:t>If no dashboard is running, FixLab asks for the local repository path. You may also provide it directly:</w:t>
+      </w:r>
+    </w:p>
+    <w:p>
+      <w:pPr>
+        <w:spacing w:after="120"/>
+        <w:ind w:left="360"/>
+        <w:rPr>
+          <w:rFonts w:ascii="Consolas" w:hAnsi="Consolas"/>
+          <w:sz w:val="18"/>
+        </w:rPr>
+      </w:pPr>
+      <w:r>
+        <w:rPr>
+          <w:rFonts w:ascii="Consolas" w:hAnsi="Consolas"/>
+          <w:sz w:val="18"/>
+        </w:rPr>
+        <w:t>fixlab chat C:\source\application --runtime copilot</w:t>
+      </w:r>
+    </w:p>
+    <w:p>
+      <w:pPr>
+        <w:spacing w:after="120"/>
+        <w:rPr>
+          <w:rFonts w:ascii="Aptos" w:hAnsi="Aptos"/>
+          <w:sz w:val="22"/>
+        </w:rPr>
+      </w:pPr>
+      <w:r>
+        <w:rPr>
+          <w:rFonts w:ascii="Aptos" w:hAnsi="Aptos"/>
+          <w:sz w:val="22"/>
+        </w:rPr>
+        <w:t>When a dashboard is already running, chat displays the connected repository. Press Enter to keep it or enter another repository path. FixLab starts another repository on the next available loopback port.</w:t>
       </w:r>
     </w:p>
     <w:p>
       <w:pPr>
         <w:pStyle w:val="Heading2"/>
-      </w:pPr>
-      <w:r>
-        <w:t>1. Install and authenticate GitHub Copilot CLI according to your organization's supported process.</w:t>
-      </w:r>
-    </w:p>
-    <w:p>
-      <w:pPr>
+        <w:spacing w:after="120"/>
+        <w:rPr>
+          <w:rFonts w:ascii="Aptos" w:hAnsi="Aptos"/>
+          <w:sz w:val="22"/>
+        </w:rPr>
+      </w:pPr>
+      <w:r>
+        <w:rPr>
+          <w:rFonts w:ascii="Aptos" w:hAnsi="Aptos"/>
+          <w:sz w:val="22"/>
+        </w:rPr>
+        <w:t>The following natural-language commands execute immediately:</w:t>
+      </w:r>
+    </w:p>
+    <w:p>
+      <w:pPr>
+        <w:spacing w:after="120"/>
         <w:ind w:left="360"/>
         <w:rPr>
           <w:rFonts w:ascii="Consolas" w:hAnsi="Consolas"/>
@@ -237,19 +480,443 @@
           <w:rFonts w:ascii="Consolas" w:hAnsi="Consolas"/>
           <w:sz w:val="18"/>
         </w:rPr>
-        <w:t>copilot --help</w:t>
+        <w:t>start dashboard</w:t>
+      </w:r>
+    </w:p>
+    <w:p>
+      <w:pPr>
+        <w:spacing w:after="120"/>
+        <w:ind w:left="360"/>
+        <w:rPr>
+          <w:rFonts w:ascii="Consolas" w:hAnsi="Consolas"/>
+          <w:sz w:val="18"/>
+        </w:rPr>
+      </w:pPr>
+      <w:r>
+        <w:rPr>
+          <w:rFonts w:ascii="Consolas" w:hAnsi="Consolas"/>
+          <w:sz w:val="18"/>
+        </w:rPr>
+        <w:t>show status</w:t>
+      </w:r>
+    </w:p>
+    <w:p>
+      <w:pPr>
+        <w:spacing w:after="120"/>
+        <w:ind w:left="360"/>
+        <w:rPr>
+          <w:rFonts w:ascii="Consolas" w:hAnsi="Consolas"/>
+          <w:sz w:val="18"/>
+        </w:rPr>
+      </w:pPr>
+      <w:r>
+        <w:rPr>
+          <w:rFonts w:ascii="Consolas" w:hAnsi="Consolas"/>
+          <w:sz w:val="18"/>
+        </w:rPr>
+        <w:t>show logs 50</w:t>
+      </w:r>
+    </w:p>
+    <w:p>
+      <w:pPr>
+        <w:spacing w:after="120"/>
+        <w:ind w:left="360"/>
+        <w:rPr>
+          <w:rFonts w:ascii="Consolas" w:hAnsi="Consolas"/>
+          <w:sz w:val="18"/>
+        </w:rPr>
+      </w:pPr>
+      <w:r>
+        <w:rPr>
+          <w:rFonts w:ascii="Consolas" w:hAnsi="Consolas"/>
+          <w:sz w:val="18"/>
+        </w:rPr>
+        <w:t>show pull request</w:t>
+      </w:r>
+    </w:p>
+    <w:p>
+      <w:pPr>
+        <w:spacing w:after="120"/>
+        <w:ind w:left="360"/>
+        <w:rPr>
+          <w:rFonts w:ascii="Consolas" w:hAnsi="Consolas"/>
+          <w:sz w:val="18"/>
+        </w:rPr>
+      </w:pPr>
+      <w:r>
+        <w:rPr>
+          <w:rFonts w:ascii="Consolas" w:hAnsi="Consolas"/>
+          <w:sz w:val="18"/>
+        </w:rPr>
+        <w:t>show evidence</w:t>
+      </w:r>
+    </w:p>
+    <w:p>
+      <w:pPr>
+        <w:spacing w:after="120"/>
+        <w:ind w:left="360"/>
+        <w:rPr>
+          <w:rFonts w:ascii="Consolas" w:hAnsi="Consolas"/>
+          <w:sz w:val="18"/>
+        </w:rPr>
+      </w:pPr>
+      <w:r>
+        <w:rPr>
+          <w:rFonts w:ascii="Consolas" w:hAnsi="Consolas"/>
+          <w:sz w:val="18"/>
+        </w:rPr>
+        <w:t>switch repository</w:t>
+      </w:r>
+    </w:p>
+    <w:p>
+      <w:pPr>
+        <w:spacing w:after="120"/>
+        <w:ind w:left="360"/>
+        <w:rPr>
+          <w:rFonts w:ascii="Consolas" w:hAnsi="Consolas"/>
+          <w:sz w:val="18"/>
+        </w:rPr>
+      </w:pPr>
+      <w:r>
+        <w:rPr>
+          <w:rFonts w:ascii="Consolas" w:hAnsi="Consolas"/>
+          <w:sz w:val="18"/>
+        </w:rPr>
+        <w:t>switch repository to C:\source\another-application</w:t>
+      </w:r>
+    </w:p>
+    <w:p>
+      <w:pPr>
+        <w:spacing w:after="120"/>
+        <w:ind w:left="360"/>
+        <w:rPr>
+          <w:rFonts w:ascii="Consolas" w:hAnsi="Consolas"/>
+          <w:sz w:val="18"/>
+        </w:rPr>
+      </w:pPr>
+      <w:r>
+        <w:rPr>
+          <w:rFonts w:ascii="Consolas" w:hAnsi="Consolas"/>
+          <w:sz w:val="18"/>
+        </w:rPr>
+        <w:t>help</w:t>
+      </w:r>
+    </w:p>
+    <w:p>
+      <w:pPr>
+        <w:spacing w:after="120"/>
+        <w:rPr>
+          <w:rFonts w:ascii="Aptos" w:hAnsi="Aptos"/>
+          <w:sz w:val="22"/>
+        </w:rPr>
+      </w:pPr>
+      <w:r>
+        <w:rPr>
+          <w:rFonts w:ascii="Aptos" w:hAnsi="Aptos"/>
+          <w:sz w:val="22"/>
+        </w:rPr>
+        <w:t>Other text is sent to the active FixLab agent. If the agent is working, that guidance is queued for its next turn.</w:t>
+      </w:r>
+    </w:p>
+    <w:p>
+      <w:pPr>
+        <w:pStyle w:val="Heading1"/>
+        <w:spacing w:after="120"/>
+        <w:rPr>
+          <w:rFonts w:ascii="Aptos" w:hAnsi="Aptos"/>
+          <w:sz w:val="22"/>
+        </w:rPr>
+      </w:pPr>
+      <w:r>
+        <w:rPr>
+          <w:rFonts w:ascii="Aptos" w:hAnsi="Aptos"/>
+          <w:sz w:val="22"/>
+        </w:rPr>
+        <w:t>4. Onboard a React frontend and .NET backend</w:t>
+      </w:r>
+    </w:p>
+    <w:p>
+      <w:pPr>
+        <w:spacing w:after="120"/>
+        <w:rPr>
+          <w:rFonts w:ascii="Aptos" w:hAnsi="Aptos"/>
+          <w:sz w:val="22"/>
+        </w:rPr>
+      </w:pPr>
+      <w:r>
+        <w:rPr>
+          <w:rFonts w:ascii="Aptos" w:hAnsi="Aptos"/>
+          <w:sz w:val="22"/>
+        </w:rPr>
+        <w:t>For a new or incomplete repository, ask chat:</w:t>
+      </w:r>
+    </w:p>
+    <w:p>
+      <w:pPr>
+        <w:spacing w:after="120"/>
+        <w:ind w:left="360"/>
+        <w:rPr>
+          <w:rFonts w:ascii="Consolas" w:hAnsi="Consolas"/>
+          <w:sz w:val="18"/>
+        </w:rPr>
+      </w:pPr>
+      <w:r>
+        <w:rPr>
+          <w:rFonts w:ascii="Consolas" w:hAnsi="Consolas"/>
+          <w:sz w:val="18"/>
+        </w:rPr>
+        <w:t>Onboard this repository for FixLab. Inspect the React frontend and .NET backend, reuse existing repository commands, configure restore, test, lint, build, startup, ports, health checks, Playwright, authentication, safe environments, and pull-request settings. Explain missing configuration and ask before running setup commands, then run doctor.</w:t>
+      </w:r>
+    </w:p>
+    <w:p>
+      <w:pPr>
+        <w:spacing w:after="120"/>
+        <w:rPr>
+          <w:rFonts w:ascii="Aptos" w:hAnsi="Aptos"/>
+          <w:sz w:val="22"/>
+        </w:rPr>
+      </w:pPr>
+      <w:r>
+        <w:rPr>
+          <w:rFonts w:ascii="Aptos" w:hAnsi="Aptos"/>
+          <w:sz w:val="22"/>
+        </w:rPr>
+        <w:t>FixLab inspects repository-owned files such as package.json, lockfiles, solution and project files, global.json, launchSettings.json, Playwright configuration, CI definitions, local-development documentation, and repository instructions.</w:t>
+      </w:r>
+    </w:p>
+    <w:p>
+      <w:pPr>
+        <w:spacing w:after="120"/>
+        <w:rPr>
+          <w:rFonts w:ascii="Aptos" w:hAnsi="Aptos"/>
+          <w:sz w:val="22"/>
+        </w:rPr>
+      </w:pPr>
+      <w:r>
+        <w:rPr>
+          <w:rFonts w:ascii="Aptos" w:hAnsi="Aptos"/>
+          <w:sz w:val="22"/>
+        </w:rPr>
+        <w:t>- Frontend-only repository: configure only the React application and do not invent a backend.</w:t>
+      </w:r>
+    </w:p>
+    <w:p>
+      <w:pPr>
+        <w:spacing w:after="120"/>
+        <w:rPr>
+          <w:rFonts w:ascii="Aptos" w:hAnsi="Aptos"/>
+          <w:sz w:val="22"/>
+        </w:rPr>
+      </w:pPr>
+      <w:r>
+        <w:rPr>
+          <w:rFonts w:ascii="Aptos" w:hAnsi="Aptos"/>
+          <w:sz w:val="22"/>
+        </w:rPr>
+        <w:t>- Combined repository: configure frontend and backend commands independently.</w:t>
+      </w:r>
+    </w:p>
+    <w:p>
+      <w:pPr>
+        <w:spacing w:after="120"/>
+        <w:rPr>
+          <w:rFonts w:ascii="Aptos" w:hAnsi="Aptos"/>
+          <w:sz w:val="22"/>
+        </w:rPr>
+      </w:pPr>
+      <w:r>
+        <w:rPr>
+          <w:rFonts w:ascii="Aptos" w:hAnsi="Aptos"/>
+          <w:sz w:val="22"/>
+        </w:rPr>
+        <w:t>- Separate frontend and backend repositories: onboard each repository separately.</w:t>
+      </w:r>
+    </w:p>
+    <w:p>
+      <w:pPr>
+        <w:spacing w:after="120"/>
+        <w:rPr>
+          <w:rFonts w:ascii="Aptos" w:hAnsi="Aptos"/>
+          <w:sz w:val="22"/>
+        </w:rPr>
+      </w:pPr>
+      <w:r>
+        <w:rPr>
+          <w:rFonts w:ascii="Aptos" w:hAnsi="Aptos"/>
+          <w:sz w:val="22"/>
+        </w:rPr>
+        <w:t>- Never place credentials, tokens, cookies, browser-state contents, customer data, or production endpoints in the FixLab profile.</w:t>
+      </w:r>
+    </w:p>
+    <w:p>
+      <w:pPr>
+        <w:pStyle w:val="Heading1"/>
+        <w:spacing w:after="120"/>
+        <w:rPr>
+          <w:rFonts w:ascii="Aptos" w:hAnsi="Aptos"/>
+          <w:sz w:val="22"/>
+        </w:rPr>
+      </w:pPr>
+      <w:r>
+        <w:rPr>
+          <w:rFonts w:ascii="Aptos" w:hAnsi="Aptos"/>
+          <w:sz w:val="22"/>
+        </w:rPr>
+        <w:t>5. Open the browser dashboard</w:t>
+      </w:r>
+    </w:p>
+    <w:p>
+      <w:pPr>
+        <w:spacing w:after="120"/>
+        <w:rPr>
+          <w:rFonts w:ascii="Aptos" w:hAnsi="Aptos"/>
+          <w:sz w:val="22"/>
+        </w:rPr>
+      </w:pPr>
+      <w:r>
+        <w:rPr>
+          <w:rFonts w:ascii="Aptos" w:hAnsi="Aptos"/>
+          <w:sz w:val="22"/>
+        </w:rPr>
+        <w:t>From chat, type:</w:t>
+      </w:r>
+    </w:p>
+    <w:p>
+      <w:pPr>
+        <w:spacing w:after="120"/>
+        <w:ind w:left="360"/>
+        <w:rPr>
+          <w:rFonts w:ascii="Consolas" w:hAnsi="Consolas"/>
+          <w:sz w:val="18"/>
+        </w:rPr>
+      </w:pPr>
+      <w:r>
+        <w:rPr>
+          <w:rFonts w:ascii="Consolas" w:hAnsi="Consolas"/>
+          <w:sz w:val="18"/>
+        </w:rPr>
+        <w:t>start dashboard</w:t>
+      </w:r>
+    </w:p>
+    <w:p>
+      <w:pPr>
+        <w:spacing w:after="120"/>
+        <w:rPr>
+          <w:rFonts w:ascii="Aptos" w:hAnsi="Aptos"/>
+          <w:sz w:val="22"/>
+        </w:rPr>
+      </w:pPr>
+      <w:r>
+        <w:rPr>
+          <w:rFonts w:ascii="Aptos" w:hAnsi="Aptos"/>
+          <w:sz w:val="22"/>
+        </w:rPr>
+        <w:t>FixLab opens the dashboard for the connected repository. The default URL is http://127.0.0.1:4317; additional repositories use another loopback port.</w:t>
+      </w:r>
+    </w:p>
+    <w:p>
+      <w:pPr>
+        <w:pStyle w:val="Heading1"/>
+        <w:spacing w:after="120"/>
+        <w:rPr>
+          <w:rFonts w:ascii="Aptos" w:hAnsi="Aptos"/>
+          <w:sz w:val="22"/>
+        </w:rPr>
+      </w:pPr>
+      <w:r>
+        <w:rPr>
+          <w:rFonts w:ascii="Aptos" w:hAnsi="Aptos"/>
+          <w:sz w:val="22"/>
+        </w:rPr>
+        <w:t>6. Add a new bug</w:t>
+      </w:r>
+    </w:p>
+    <w:p>
+      <w:pPr>
+        <w:spacing w:after="120"/>
+        <w:rPr>
+          <w:rFonts w:ascii="Aptos" w:hAnsi="Aptos"/>
+          <w:sz w:val="22"/>
+        </w:rPr>
+      </w:pPr>
+      <w:r>
+        <w:rPr>
+          <w:rFonts w:ascii="Aptos" w:hAnsi="Aptos"/>
+          <w:sz w:val="22"/>
+        </w:rPr>
+        <w:t>Create a separate bug job from chat:</w:t>
+      </w:r>
+    </w:p>
+    <w:p>
+      <w:pPr>
+        <w:spacing w:after="120"/>
+        <w:ind w:left="360"/>
+        <w:rPr>
+          <w:rFonts w:ascii="Consolas" w:hAnsi="Consolas"/>
+          <w:sz w:val="18"/>
+        </w:rPr>
+      </w:pPr>
+      <w:r>
+        <w:rPr>
+          <w:rFonts w:ascii="Consolas" w:hAnsi="Consolas"/>
+          <w:sz w:val="18"/>
+        </w:rPr>
+        <w:t>new bug Product search returns duplicate rows</w:t>
+      </w:r>
+    </w:p>
+    <w:p>
+      <w:pPr>
+        <w:spacing w:after="120"/>
+        <w:ind w:left="360"/>
+        <w:rPr>
+          <w:rFonts w:ascii="Consolas" w:hAnsi="Consolas"/>
+          <w:sz w:val="18"/>
+        </w:rPr>
+      </w:pPr>
+      <w:r>
+        <w:rPr>
+          <w:rFonts w:ascii="Consolas" w:hAnsi="Consolas"/>
+          <w:sz w:val="18"/>
+        </w:rPr>
+        <w:t>add a bug: Save remains disabled after validation succeeds</w:t>
+      </w:r>
+    </w:p>
+    <w:p>
+      <w:pPr>
+        <w:spacing w:after="120"/>
+        <w:rPr>
+          <w:rFonts w:ascii="Aptos" w:hAnsi="Aptos"/>
+          <w:sz w:val="22"/>
+        </w:rPr>
+      </w:pPr>
+      <w:r>
+        <w:rPr>
+          <w:rFonts w:ascii="Aptos" w:hAnsi="Aptos"/>
+          <w:sz w:val="22"/>
+        </w:rPr>
+        <w:t>A new bug starts immediately when FixLab is idle or enters the dashboard queue when another job is active. If the instruction belongs to the current job, type it normally without the new bug prefix.</w:t>
       </w:r>
     </w:p>
     <w:p>
       <w:pPr>
         <w:pStyle w:val="Heading2"/>
-      </w:pPr>
-      <w:r>
-        <w:t>2. Install the FixLab CLI from GitHub.</w:t>
-      </w:r>
-    </w:p>
-    <w:p>
-      <w:pPr>
+        <w:spacing w:after="120"/>
+        <w:rPr>
+          <w:rFonts w:ascii="Aptos" w:hAnsi="Aptos"/>
+          <w:sz w:val="22"/>
+        </w:rPr>
+      </w:pPr>
+      <w:r>
+        <w:rPr>
+          <w:rFonts w:ascii="Aptos" w:hAnsi="Aptos"/>
+          <w:sz w:val="22"/>
+        </w:rPr>
+        <w:t>UI bug example</w:t>
+      </w:r>
+    </w:p>
+    <w:p>
+      <w:pPr>
+        <w:spacing w:after="120"/>
         <w:ind w:left="360"/>
         <w:rPr>
           <w:rFonts w:ascii="Consolas" w:hAnsi="Consolas"/>
@@ -261,11 +928,29 @@
           <w:rFonts w:ascii="Consolas" w:hAnsi="Consolas"/>
           <w:sz w:val="18"/>
         </w:rPr>
-        <w:t>npm install --global github:MonaDevAI/FixLab</w:t>
-      </w:r>
-    </w:p>
-    <w:p>
-      <w:pPr>
+        <w:t>new bug The Product Hierarchy Excel template is missing PFAM formatting. Reproduce the React UI issue, make the smallest fix, run focused tests, lint, type-check and build, start the required applications, validate with Playwright, capture non-sensitive evidence, and create or update the PR.</w:t>
+      </w:r>
+    </w:p>
+    <w:p>
+      <w:pPr>
+        <w:pStyle w:val="Heading2"/>
+        <w:spacing w:after="120"/>
+        <w:rPr>
+          <w:rFonts w:ascii="Aptos" w:hAnsi="Aptos"/>
+          <w:sz w:val="22"/>
+        </w:rPr>
+      </w:pPr>
+      <w:r>
+        <w:rPr>
+          <w:rFonts w:ascii="Aptos" w:hAnsi="Aptos"/>
+          <w:sz w:val="22"/>
+        </w:rPr>
+        <w:t>API bug example</w:t>
+      </w:r>
+    </w:p>
+    <w:p>
+      <w:pPr>
+        <w:spacing w:after="120"/>
         <w:ind w:left="360"/>
         <w:rPr>
           <w:rFonts w:ascii="Consolas" w:hAnsi="Consolas"/>
@@ -277,20 +962,29 @@
           <w:rFonts w:ascii="Consolas" w:hAnsi="Consolas"/>
           <w:sz w:val="18"/>
         </w:rPr>
-        <w:lastRenderedPageBreak/>
-        <w:t>fixlab --help</w:t>
+        <w:t>new bug The create request API returns the wrong status for invalid hierarchy input. Reproduce it with the smallest safe API test, identify the .NET validation path, make the smallest fix, run focused .NET tests and build, start the backend when runtime validation is required, verify the HTTP response, and create or update the PR.</w:t>
       </w:r>
     </w:p>
     <w:p>
       <w:pPr>
         <w:pStyle w:val="Heading2"/>
-      </w:pPr>
-      <w:r>
-        <w:t>3. Install the FixLab Copilot plugin for pre-release evaluation.</w:t>
-      </w:r>
-    </w:p>
-    <w:p>
-      <w:pPr>
+        <w:spacing w:after="120"/>
+        <w:rPr>
+          <w:rFonts w:ascii="Aptos" w:hAnsi="Aptos"/>
+          <w:sz w:val="22"/>
+        </w:rPr>
+      </w:pPr>
+      <w:r>
+        <w:rPr>
+          <w:rFonts w:ascii="Aptos" w:hAnsi="Aptos"/>
+          <w:sz w:val="22"/>
+        </w:rPr>
+        <w:t>End-to-end UI and API example</w:t>
+      </w:r>
+    </w:p>
+    <w:p>
+      <w:pPr>
+        <w:spacing w:after="120"/>
         <w:ind w:left="360"/>
         <w:rPr>
           <w:rFonts w:ascii="Consolas" w:hAnsi="Consolas"/>
@@ -302,24 +996,206 @@
           <w:rFonts w:ascii="Consolas" w:hAnsi="Consolas"/>
           <w:sz w:val="18"/>
         </w:rPr>
-        <w:t>copilot plugin install MonaDevAI/FixLab</w:t>
-      </w:r>
-    </w:p>
-    <w:p>
-      <w:r>
-        <w:t>GitHub Copilot CLI may warn that direct repository plugin installation is deprecated. When FixLab is available in the official marketplace, use: copilot plugin install fixlab@copilot-plugins.</w:t>
-      </w:r>
-    </w:p>
-    <w:p>
-      <w:pPr>
-        <w:pStyle w:val="Heading2"/>
-      </w:pPr>
-      <w:r>
-        <w:t>4. Verify the GitHub Copilot runtime.</w:t>
-      </w:r>
-    </w:p>
-    <w:p>
-      <w:pPr>
+        <w:t>new bug Fix this React workflow end to end. If it depends on the .NET API, restore, build, and start the backend automatically before Playwright. Verify both the API and UI behavior, capture evidence, and create or update the PR.</w:t>
+      </w:r>
+    </w:p>
+    <w:p>
+      <w:pPr>
+        <w:pStyle w:val="Heading1"/>
+        <w:spacing w:after="120"/>
+        <w:rPr>
+          <w:rFonts w:ascii="Aptos" w:hAnsi="Aptos"/>
+          <w:sz w:val="22"/>
+        </w:rPr>
+      </w:pPr>
+      <w:r>
+        <w:rPr>
+          <w:rFonts w:ascii="Aptos" w:hAnsi="Aptos"/>
+          <w:sz w:val="22"/>
+        </w:rPr>
+        <w:t>7. End-to-end FixLab lifecycle</w:t>
+      </w:r>
+    </w:p>
+    <w:p>
+      <w:pPr>
+        <w:spacing w:after="120"/>
+        <w:rPr>
+          <w:rFonts w:ascii="Aptos" w:hAnsi="Aptos"/>
+          <w:sz w:val="22"/>
+        </w:rPr>
+      </w:pPr>
+      <w:r>
+        <w:rPr>
+          <w:rFonts w:ascii="Aptos" w:hAnsi="Aptos"/>
+          <w:sz w:val="22"/>
+        </w:rPr>
+        <w:t>FixLab should complete and report these stages:</w:t>
+      </w:r>
+    </w:p>
+    <w:p>
+      <w:pPr>
+        <w:spacing w:after="120"/>
+        <w:rPr>
+          <w:rFonts w:ascii="Aptos" w:hAnsi="Aptos"/>
+          <w:sz w:val="22"/>
+        </w:rPr>
+      </w:pPr>
+      <w:r>
+        <w:rPr>
+          <w:rFonts w:ascii="Aptos" w:hAnsi="Aptos"/>
+          <w:sz w:val="22"/>
+        </w:rPr>
+        <w:t>- Intake: define the measurable bug or enhancement contract.</w:t>
+      </w:r>
+    </w:p>
+    <w:p>
+      <w:pPr>
+        <w:spacing w:after="120"/>
+        <w:rPr>
+          <w:rFonts w:ascii="Aptos" w:hAnsi="Aptos"/>
+          <w:sz w:val="22"/>
+        </w:rPr>
+      </w:pPr>
+      <w:r>
+        <w:rPr>
+          <w:rFonts w:ascii="Aptos" w:hAnsi="Aptos"/>
+          <w:sz w:val="22"/>
+        </w:rPr>
+        <w:t>- Diagnosis: identify the affected frontend, backend, configuration, or external boundary.</w:t>
+      </w:r>
+    </w:p>
+    <w:p>
+      <w:pPr>
+        <w:spacing w:after="120"/>
+        <w:rPr>
+          <w:rFonts w:ascii="Aptos" w:hAnsi="Aptos"/>
+          <w:sz w:val="22"/>
+        </w:rPr>
+      </w:pPr>
+      <w:r>
+        <w:rPr>
+          <w:rFonts w:ascii="Aptos" w:hAnsi="Aptos"/>
+          <w:sz w:val="22"/>
+        </w:rPr>
+        <w:t>- Reproduce: demonstrate the original problem or establish a precise failing check.</w:t>
+      </w:r>
+    </w:p>
+    <w:p>
+      <w:pPr>
+        <w:spacing w:after="120"/>
+        <w:rPr>
+          <w:rFonts w:ascii="Aptos" w:hAnsi="Aptos"/>
+          <w:sz w:val="22"/>
+        </w:rPr>
+      </w:pPr>
+      <w:r>
+        <w:rPr>
+          <w:rFonts w:ascii="Aptos" w:hAnsi="Aptos"/>
+          <w:sz w:val="22"/>
+        </w:rPr>
+        <w:t>- Fix: make the smallest complete change and preserve unrelated work.</w:t>
+      </w:r>
+    </w:p>
+    <w:p>
+      <w:pPr>
+        <w:spacing w:after="120"/>
+        <w:rPr>
+          <w:rFonts w:ascii="Aptos" w:hAnsi="Aptos"/>
+          <w:sz w:val="22"/>
+        </w:rPr>
+      </w:pPr>
+      <w:r>
+        <w:rPr>
+          <w:rFonts w:ascii="Aptos" w:hAnsi="Aptos"/>
+          <w:sz w:val="22"/>
+        </w:rPr>
+        <w:t>- Review: inspect the effective diff and exclude generated or sensitive artifacts.</w:t>
+      </w:r>
+    </w:p>
+    <w:p>
+      <w:pPr>
+        <w:spacing w:after="120"/>
+        <w:rPr>
+          <w:rFonts w:ascii="Aptos" w:hAnsi="Aptos"/>
+          <w:sz w:val="22"/>
+        </w:rPr>
+      </w:pPr>
+      <w:r>
+        <w:rPr>
+          <w:rFonts w:ascii="Aptos" w:hAnsi="Aptos"/>
+          <w:sz w:val="22"/>
+        </w:rPr>
+        <w:t>- Local stack: run focused tests, lint, type-check, builds, and required application startup.</w:t>
+      </w:r>
+    </w:p>
+    <w:p>
+      <w:pPr>
+        <w:spacing w:after="120"/>
+        <w:rPr>
+          <w:rFonts w:ascii="Aptos" w:hAnsi="Aptos"/>
+          <w:sz w:val="22"/>
+        </w:rPr>
+      </w:pPr>
+      <w:r>
+        <w:rPr>
+          <w:rFonts w:ascii="Aptos" w:hAnsi="Aptos"/>
+          <w:sz w:val="22"/>
+        </w:rPr>
+        <w:t>- Live test: validate the required UI journey or API behavior with safe data.</w:t>
+      </w:r>
+    </w:p>
+    <w:p>
+      <w:pPr>
+        <w:spacing w:after="120"/>
+        <w:rPr>
+          <w:rFonts w:ascii="Aptos" w:hAnsi="Aptos"/>
+          <w:sz w:val="22"/>
+        </w:rPr>
+      </w:pPr>
+      <w:r>
+        <w:rPr>
+          <w:rFonts w:ascii="Aptos" w:hAnsi="Aptos"/>
+          <w:sz w:val="22"/>
+        </w:rPr>
+        <w:t>- Pull request: commit, push, create or update the authorized PR, and report validation evidence.</w:t>
+      </w:r>
+    </w:p>
+    <w:p>
+      <w:pPr>
+        <w:pStyle w:val="Heading1"/>
+        <w:spacing w:after="120"/>
+        <w:rPr>
+          <w:rFonts w:ascii="Aptos" w:hAnsi="Aptos"/>
+          <w:sz w:val="22"/>
+        </w:rPr>
+      </w:pPr>
+      <w:r>
+        <w:rPr>
+          <w:rFonts w:ascii="Aptos" w:hAnsi="Aptos"/>
+          <w:sz w:val="22"/>
+        </w:rPr>
+        <w:t>8. Pull request creation</w:t>
+      </w:r>
+    </w:p>
+    <w:p>
+      <w:pPr>
+        <w:spacing w:after="120"/>
+        <w:rPr>
+          <w:rFonts w:ascii="Aptos" w:hAnsi="Aptos"/>
+          <w:sz w:val="22"/>
+        </w:rPr>
+      </w:pPr>
+      <w:r>
+        <w:rPr>
+          <w:rFonts w:ascii="Aptos" w:hAnsi="Aptos"/>
+          <w:sz w:val="22"/>
+        </w:rPr>
+        <w:t>Include PR creation in the bug request when code changes are expected:</w:t>
+      </w:r>
+    </w:p>
+    <w:p>
+      <w:pPr>
+        <w:spacing w:after="120"/>
         <w:ind w:left="360"/>
         <w:rPr>
           <w:rFonts w:ascii="Consolas" w:hAnsi="Consolas"/>
@@ -331,27 +1207,111 @@
           <w:rFonts w:ascii="Consolas" w:hAnsi="Consolas"/>
           <w:sz w:val="18"/>
         </w:rPr>
-        <w:t>fixlab doctor &lt;application-repository&gt; --runtime copilot</w:t>
+        <w:t>Finish the required validation and create or update the pull request using my authorized developer account. Do not stop after local validation.</w:t>
+      </w:r>
+    </w:p>
+    <w:p>
+      <w:pPr>
+        <w:spacing w:after="120"/>
+        <w:rPr>
+          <w:rFonts w:ascii="Aptos" w:hAnsi="Aptos"/>
+          <w:sz w:val="22"/>
+        </w:rPr>
+      </w:pPr>
+      <w:r>
+        <w:rPr>
+          <w:rFonts w:ascii="Aptos" w:hAnsi="Aptos"/>
+          <w:sz w:val="22"/>
+        </w:rPr>
+        <w:t>Check progress from chat:</w:t>
+      </w:r>
+    </w:p>
+    <w:p>
+      <w:pPr>
+        <w:spacing w:after="120"/>
+        <w:ind w:left="360"/>
+        <w:rPr>
+          <w:rFonts w:ascii="Consolas" w:hAnsi="Consolas"/>
+          <w:sz w:val="18"/>
+        </w:rPr>
+      </w:pPr>
+      <w:r>
+        <w:rPr>
+          <w:rFonts w:ascii="Consolas" w:hAnsi="Consolas"/>
+          <w:sz w:val="18"/>
+        </w:rPr>
+        <w:t>show pull request</w:t>
+      </w:r>
+    </w:p>
+    <w:p>
+      <w:pPr>
+        <w:spacing w:after="120"/>
+        <w:ind w:left="360"/>
+        <w:rPr>
+          <w:rFonts w:ascii="Consolas" w:hAnsi="Consolas"/>
+          <w:sz w:val="18"/>
+        </w:rPr>
+      </w:pPr>
+      <w:r>
+        <w:rPr>
+          <w:rFonts w:ascii="Consolas" w:hAnsi="Consolas"/>
+          <w:sz w:val="18"/>
+        </w:rPr>
+        <w:t>show status</w:t>
+      </w:r>
+    </w:p>
+    <w:p>
+      <w:pPr>
+        <w:spacing w:after="120"/>
+        <w:rPr>
+          <w:rFonts w:ascii="Aptos" w:hAnsi="Aptos"/>
+          <w:sz w:val="22"/>
+        </w:rPr>
+      </w:pPr>
+      <w:r>
+        <w:rPr>
+          <w:rFonts w:ascii="Aptos" w:hAnsi="Aptos"/>
+          <w:sz w:val="22"/>
+        </w:rPr>
+        <w:t>Validation-only mode must not edit source, commit, push, or change the pull request.</w:t>
       </w:r>
     </w:p>
     <w:p>
       <w:pPr>
         <w:pStyle w:val="Heading1"/>
-      </w:pPr>
-      <w:r>
-        <w:t>Option B - Install with Agency Copilot</w:t>
-      </w:r>
-    </w:p>
-    <w:p>
-      <w:pPr>
-        <w:pStyle w:val="Heading2"/>
-      </w:pPr>
-      <w:r>
-        <w:t>1. Install and authenticate Agency using your organization's supported installation process.</w:t>
-      </w:r>
-    </w:p>
-    <w:p>
-      <w:pPr>
+        <w:spacing w:after="120"/>
+        <w:rPr>
+          <w:rFonts w:ascii="Aptos" w:hAnsi="Aptos"/>
+          <w:sz w:val="22"/>
+        </w:rPr>
+      </w:pPr>
+      <w:r>
+        <w:rPr>
+          <w:rFonts w:ascii="Aptos" w:hAnsi="Aptos"/>
+          <w:sz w:val="22"/>
+        </w:rPr>
+        <w:t>9. Keep localhost running for manual testing</w:t>
+      </w:r>
+    </w:p>
+    <w:p>
+      <w:pPr>
+        <w:spacing w:after="120"/>
+        <w:rPr>
+          <w:rFonts w:ascii="Aptos" w:hAnsi="Aptos"/>
+          <w:sz w:val="22"/>
+        </w:rPr>
+      </w:pPr>
+      <w:r>
+        <w:rPr>
+          <w:rFonts w:ascii="Aptos" w:hAnsi="Aptos"/>
+          <w:sz w:val="22"/>
+        </w:rPr>
+        <w:t>By default, FixLab stops only the frontend and backend processes it started when the job finishes. To keep them available, say:</w:t>
+      </w:r>
+    </w:p>
+    <w:p>
+      <w:pPr>
+        <w:spacing w:after="120"/>
         <w:ind w:left="360"/>
         <w:rPr>
           <w:rFonts w:ascii="Consolas" w:hAnsi="Consolas"/>
@@ -363,11 +1323,45 @@
           <w:rFonts w:ascii="Consolas" w:hAnsi="Consolas"/>
           <w:sz w:val="18"/>
         </w:rPr>
-        <w:t>agency --version</w:t>
-      </w:r>
-    </w:p>
-    <w:p>
-      <w:pPr>
+        <w:t>Keep the frontend localhost running with hot reload after validation so I can test it manually. If the UI requires the .NET backend, keep that FixLab-owned backend running too until I confirm testing is complete.</w:t>
+      </w:r>
+    </w:p>
+    <w:p>
+      <w:pPr>
+        <w:spacing w:after="120"/>
+        <w:rPr>
+          <w:rFonts w:ascii="Aptos" w:hAnsi="Aptos"/>
+          <w:sz w:val="22"/>
+        </w:rPr>
+      </w:pPr>
+      <w:r>
+        <w:rPr>
+          <w:rFonts w:ascii="Aptos" w:hAnsi="Aptos"/>
+          <w:sz w:val="22"/>
+        </w:rPr>
+        <w:t>The dashboard also provides Hold after Playwright for manual local testing.</w:t>
+      </w:r>
+    </w:p>
+    <w:p>
+      <w:pPr>
+        <w:pStyle w:val="Heading1"/>
+        <w:spacing w:after="120"/>
+        <w:rPr>
+          <w:rFonts w:ascii="Aptos" w:hAnsi="Aptos"/>
+          <w:sz w:val="22"/>
+        </w:rPr>
+      </w:pPr>
+      <w:r>
+        <w:rPr>
+          <w:rFonts w:ascii="Aptos" w:hAnsi="Aptos"/>
+          <w:sz w:val="22"/>
+        </w:rPr>
+        <w:t>10. Recover an interrupted job</w:t>
+      </w:r>
+    </w:p>
+    <w:p>
+      <w:pPr>
+        <w:spacing w:after="120"/>
         <w:ind w:left="360"/>
         <w:rPr>
           <w:rFonts w:ascii="Consolas" w:hAnsi="Consolas"/>
@@ -379,553 +1373,341 @@
           <w:rFonts w:ascii="Consolas" w:hAnsi="Consolas"/>
           <w:sz w:val="18"/>
         </w:rPr>
-        <w:t>agency copilot</w:t>
-      </w:r>
-    </w:p>
-    <w:p>
-      <w:pPr>
-        <w:pStyle w:val="Heading2"/>
-      </w:pPr>
-      <w:r>
-        <w:t>2. Install the FixLab CLI from GitHub.</w:t>
-      </w:r>
-    </w:p>
-    <w:p>
-      <w:pPr>
-        <w:ind w:left="360"/>
-        <w:rPr>
-          <w:rFonts w:ascii="Consolas" w:hAnsi="Consolas"/>
-          <w:sz w:val="18"/>
-        </w:rPr>
-      </w:pPr>
-      <w:r>
-        <w:rPr>
-          <w:rFonts w:ascii="Consolas" w:hAnsi="Consolas"/>
-          <w:sz w:val="18"/>
-        </w:rPr>
-        <w:t>npm install --global github:MonaDevAI/FixLab</w:t>
-      </w:r>
-    </w:p>
-    <w:p>
-      <w:pPr>
-        <w:ind w:left="360"/>
-        <w:rPr>
-          <w:rFonts w:ascii="Consolas" w:hAnsi="Consolas"/>
-          <w:sz w:val="18"/>
-        </w:rPr>
-      </w:pPr>
-      <w:r>
-        <w:rPr>
-          <w:rFonts w:ascii="Consolas" w:hAnsi="Consolas"/>
-          <w:sz w:val="18"/>
-        </w:rPr>
-        <w:t>fixlab --help</w:t>
-      </w:r>
-    </w:p>
-    <w:p>
-      <w:pPr>
-        <w:pStyle w:val="Heading2"/>
-      </w:pPr>
-      <w:r>
-        <w:t>3. Verify the Agency runtime.</w:t>
-      </w:r>
-    </w:p>
-    <w:p>
-      <w:pPr>
-        <w:ind w:left="360"/>
-        <w:rPr>
-          <w:rFonts w:ascii="Consolas" w:hAnsi="Consolas"/>
-          <w:sz w:val="18"/>
-        </w:rPr>
-      </w:pPr>
-      <w:r>
-        <w:rPr>
-          <w:rFonts w:ascii="Consolas" w:hAnsi="Consolas"/>
-          <w:sz w:val="18"/>
-        </w:rPr>
-        <w:t>fixlab doctor &lt;application-repository&gt; --runtime agency</w:t>
-      </w:r>
-    </w:p>
-    <w:p>
-      <w:r>
-        <w:t>Agency is the default FixLab runtime, so --runtime agency may be omitted when no other default has been configured.</w:t>
+        <w:t>Continue the same job, preserve existing changes, finish all required validation, and create or update the PR.</w:t>
+      </w:r>
+    </w:p>
+    <w:p>
+      <w:pPr>
+        <w:spacing w:after="120"/>
+        <w:rPr>
+          <w:rFonts w:ascii="Aptos" w:hAnsi="Aptos"/>
+          <w:sz w:val="22"/>
+        </w:rPr>
+      </w:pPr>
+      <w:r>
+        <w:rPr>
+          <w:rFonts w:ascii="Aptos" w:hAnsi="Aptos"/>
+          <w:sz w:val="22"/>
+        </w:rPr>
+        <w:t>Use retry only when the current executor cannot safely resume. FixLab must preserve the worktree and must not discard prior changes.</w:t>
       </w:r>
     </w:p>
     <w:p>
       <w:pPr>
         <w:pStyle w:val="Heading1"/>
-      </w:pPr>
-      <w:r>
-        <w:t>Onboard an application repository</w:t>
-      </w:r>
-    </w:p>
-    <w:p>
-      <w:pPr>
-        <w:ind w:left="360"/>
-        <w:rPr>
-          <w:rFonts w:ascii="Consolas" w:hAnsi="Consolas"/>
-          <w:sz w:val="18"/>
-        </w:rPr>
-      </w:pPr>
-      <w:r>
-        <w:rPr>
-          <w:rFonts w:ascii="Consolas" w:hAnsi="Consolas"/>
-          <w:sz w:val="18"/>
-        </w:rPr>
-        <w:t>Set-Location &lt;application-repository&gt;</w:t>
-      </w:r>
-    </w:p>
-    <w:p>
-      <w:pPr>
-        <w:ind w:left="360"/>
-        <w:rPr>
-          <w:rFonts w:ascii="Consolas" w:hAnsi="Consolas"/>
-          <w:sz w:val="18"/>
-        </w:rPr>
-      </w:pPr>
-      <w:r>
-        <w:rPr>
-          <w:rFonts w:ascii="Consolas" w:hAnsi="Consolas"/>
-          <w:sz w:val="18"/>
-        </w:rPr>
-        <w:t>fixlab init</w:t>
-      </w:r>
-    </w:p>
-    <w:p>
-      <w:r>
-        <w:t>Review .github\fixlab\repository-profile.json. Replace template values with repository-owned frontend and backend paths, restore and test commands, startup commands, loopback health URLs, safe DEV or SIT environments, Playwright configuration, and pull-request settings.</w:t>
-      </w:r>
-    </w:p>
-    <w:p>
-      <w:r>
-        <w:lastRenderedPageBreak/>
-        <w:t>Do not add credentials, access tokens, cookies, browser-state contents, customer data, or production endpoints to the profile.</w:t>
+        <w:spacing w:after="120"/>
+        <w:rPr>
+          <w:rFonts w:ascii="Aptos" w:hAnsi="Aptos"/>
+          <w:sz w:val="22"/>
+        </w:rPr>
+      </w:pPr>
+      <w:r>
+        <w:rPr>
+          <w:rFonts w:ascii="Aptos" w:hAnsi="Aptos"/>
+          <w:sz w:val="22"/>
+        </w:rPr>
+        <w:t>11. Expected completion evidence</w:t>
+      </w:r>
+    </w:p>
+    <w:p>
+      <w:pPr>
+        <w:spacing w:after="120"/>
+        <w:rPr>
+          <w:rFonts w:ascii="Aptos" w:hAnsi="Aptos"/>
+          <w:sz w:val="22"/>
+        </w:rPr>
+      </w:pPr>
+      <w:r>
+        <w:rPr>
+          <w:rFonts w:ascii="Aptos" w:hAnsi="Aptos"/>
+          <w:sz w:val="22"/>
+        </w:rPr>
+        <w:t>- Focused tests and required build/type-check results.</w:t>
+      </w:r>
+    </w:p>
+    <w:p>
+      <w:pPr>
+        <w:spacing w:after="120"/>
+        <w:rPr>
+          <w:rFonts w:ascii="Aptos" w:hAnsi="Aptos"/>
+          <w:sz w:val="22"/>
+        </w:rPr>
+      </w:pPr>
+      <w:r>
+        <w:rPr>
+          <w:rFonts w:ascii="Aptos" w:hAnsi="Aptos"/>
+          <w:sz w:val="22"/>
+        </w:rPr>
+        <w:t>- Explicit pass, failure, skipped, blocked, or timeout status for every required gate.</w:t>
+      </w:r>
+    </w:p>
+    <w:p>
+      <w:pPr>
+        <w:spacing w:after="120"/>
+        <w:rPr>
+          <w:rFonts w:ascii="Aptos" w:hAnsi="Aptos"/>
+          <w:sz w:val="22"/>
+        </w:rPr>
+      </w:pPr>
+      <w:r>
+        <w:rPr>
+          <w:rFonts w:ascii="Aptos" w:hAnsi="Aptos"/>
+          <w:sz w:val="22"/>
+        </w:rPr>
+        <w:t>- Non-sensitive Playwright screenshots or API assertions when required.</w:t>
+      </w:r>
+    </w:p>
+    <w:p>
+      <w:pPr>
+        <w:spacing w:after="120"/>
+        <w:rPr>
+          <w:rFonts w:ascii="Aptos" w:hAnsi="Aptos"/>
+          <w:sz w:val="22"/>
+        </w:rPr>
+      </w:pPr>
+      <w:r>
+        <w:rPr>
+          <w:rFonts w:ascii="Aptos" w:hAnsi="Aptos"/>
+          <w:sz w:val="22"/>
+        </w:rPr>
+        <w:t>- The branch, commit, pull-request URL or number, and remote policy status when available.</w:t>
+      </w:r>
+    </w:p>
+    <w:p>
+      <w:pPr>
+        <w:spacing w:after="120"/>
+        <w:rPr>
+          <w:rFonts w:ascii="Aptos" w:hAnsi="Aptos"/>
+          <w:sz w:val="22"/>
+        </w:rPr>
+      </w:pPr>
+      <w:r>
+        <w:rPr>
+          <w:rFonts w:ascii="Aptos" w:hAnsi="Aptos"/>
+          <w:sz w:val="22"/>
+        </w:rPr>
+        <w:t>- No unrelated files, credentials, authenticated browser state, or temporary generated tests in the product PR.</w:t>
       </w:r>
     </w:p>
     <w:p>
       <w:pPr>
         <w:pStyle w:val="Heading1"/>
-      </w:pPr>
-      <w:r>
-        <w:t>Prepare and diagnose the repository</w:t>
-      </w:r>
-    </w:p>
-    <w:p>
-      <w:pPr>
-        <w:ind w:left="360"/>
-        <w:rPr>
-          <w:rFonts w:ascii="Consolas" w:hAnsi="Consolas"/>
-          <w:sz w:val="18"/>
-        </w:rPr>
-      </w:pPr>
-      <w:r>
-        <w:rPr>
-          <w:rFonts w:ascii="Consolas" w:hAnsi="Consolas"/>
-          <w:sz w:val="18"/>
-        </w:rPr>
-        <w:t>fixlab prepare</w:t>
-      </w:r>
-    </w:p>
-    <w:p>
-      <w:pPr>
-        <w:ind w:left="360"/>
-        <w:rPr>
-          <w:rFonts w:ascii="Consolas" w:hAnsi="Consolas"/>
-          <w:sz w:val="18"/>
-        </w:rPr>
-      </w:pPr>
-      <w:r>
-        <w:rPr>
-          <w:rFonts w:ascii="Consolas" w:hAnsi="Consolas"/>
-          <w:sz w:val="18"/>
-        </w:rPr>
-        <w:t>fixlab prepare --yes</w:t>
-      </w:r>
-    </w:p>
-    <w:p>
-      <w:pPr>
-        <w:ind w:left="360"/>
-        <w:rPr>
-          <w:rFonts w:ascii="Consolas" w:hAnsi="Consolas"/>
-          <w:sz w:val="18"/>
-        </w:rPr>
-      </w:pPr>
-      <w:r>
-        <w:rPr>
-          <w:rFonts w:ascii="Consolas" w:hAnsi="Consolas"/>
-          <w:sz w:val="18"/>
-        </w:rPr>
-        <w:t>fixlab setup-playwright</w:t>
-      </w:r>
-    </w:p>
-    <w:p>
-      <w:pPr>
-        <w:ind w:left="360"/>
-        <w:rPr>
-          <w:rFonts w:ascii="Consolas" w:hAnsi="Consolas"/>
-          <w:sz w:val="18"/>
-        </w:rPr>
-      </w:pPr>
-      <w:r>
-        <w:rPr>
-          <w:rFonts w:ascii="Consolas" w:hAnsi="Consolas"/>
-          <w:sz w:val="18"/>
-        </w:rPr>
-        <w:t>fixlab setup-playwright --yes</w:t>
-      </w:r>
-    </w:p>
-    <w:p>
-      <w:pPr>
-        <w:ind w:left="360"/>
-        <w:rPr>
-          <w:rFonts w:ascii="Consolas" w:hAnsi="Consolas"/>
-          <w:sz w:val="18"/>
-        </w:rPr>
-      </w:pPr>
-      <w:r>
-        <w:rPr>
-          <w:rFonts w:ascii="Consolas" w:hAnsi="Consolas"/>
-          <w:sz w:val="18"/>
-        </w:rPr>
-        <w:t>fixlab doctor --runtime copilot</w:t>
-      </w:r>
-    </w:p>
-    <w:p>
-      <w:r>
-        <w:t>For Agency, replace --runtime copilot with --runtime agency. Commands without --yes show the planned changes first; review the plan before approving installation or restore actions.</w:t>
+        <w:spacing w:after="120"/>
+        <w:rPr>
+          <w:rFonts w:ascii="Aptos" w:hAnsi="Aptos"/>
+          <w:sz w:val="22"/>
+        </w:rPr>
+      </w:pPr>
+      <w:r>
+        <w:rPr>
+          <w:rFonts w:ascii="Aptos" w:hAnsi="Aptos"/>
+          <w:sz w:val="22"/>
+        </w:rPr>
+        <w:t>12. Troubleshooting</w:t>
+      </w:r>
+    </w:p>
+    <w:p>
+      <w:pPr>
+        <w:spacing w:after="120"/>
+        <w:rPr>
+          <w:rFonts w:ascii="Aptos" w:hAnsi="Aptos"/>
+          <w:sz w:val="22"/>
+        </w:rPr>
+      </w:pPr>
+      <w:r>
+        <w:rPr>
+          <w:rFonts w:ascii="Aptos" w:hAnsi="Aptos"/>
+          <w:sz w:val="22"/>
+        </w:rPr>
+        <w:t>- fixlab is not recognized: reopen PowerShell and verify the npm global binary directory is on PATH.</w:t>
+      </w:r>
+    </w:p>
+    <w:p>
+      <w:pPr>
+        <w:spacing w:after="120"/>
+        <w:rPr>
+          <w:rFonts w:ascii="Aptos" w:hAnsi="Aptos"/>
+          <w:sz w:val="22"/>
+        </w:rPr>
+      </w:pPr>
+      <w:r>
+        <w:rPr>
+          <w:rFonts w:ascii="Aptos" w:hAnsi="Aptos"/>
+          <w:sz w:val="22"/>
+        </w:rPr>
+        <w:t>- Chat connects to the wrong repository: enter another path at startup or type switch repository.</w:t>
+      </w:r>
+    </w:p>
+    <w:p>
+      <w:pPr>
+        <w:spacing w:after="120"/>
+        <w:rPr>
+          <w:rFonts w:ascii="Aptos" w:hAnsi="Aptos"/>
+          <w:sz w:val="22"/>
+        </w:rPr>
+      </w:pPr>
+      <w:r>
+        <w:rPr>
+          <w:rFonts w:ascii="Aptos" w:hAnsi="Aptos"/>
+          <w:sz w:val="22"/>
+        </w:rPr>
+        <w:t>- Input is overwritten by logs: update FixLab; current chat redraws the fixlab&gt; prompt while activity streams.</w:t>
+      </w:r>
+    </w:p>
+    <w:p>
+      <w:pPr>
+        <w:spacing w:after="120"/>
+        <w:rPr>
+          <w:rFonts w:ascii="Aptos" w:hAnsi="Aptos"/>
+          <w:sz w:val="22"/>
+        </w:rPr>
+      </w:pPr>
+      <w:r>
+        <w:rPr>
+          <w:rFonts w:ascii="Aptos" w:hAnsi="Aptos"/>
+          <w:sz w:val="22"/>
+        </w:rPr>
+        <w:t>- A separate bug became a comment: use new bug &lt;details&gt; or add a bug: &lt;details&gt;.</w:t>
+      </w:r>
+    </w:p>
+    <w:p>
+      <w:pPr>
+        <w:spacing w:after="120"/>
+        <w:rPr>
+          <w:rFonts w:ascii="Aptos" w:hAnsi="Aptos"/>
+          <w:sz w:val="22"/>
+        </w:rPr>
+      </w:pPr>
+      <w:r>
+        <w:rPr>
+          <w:rFonts w:ascii="Aptos" w:hAnsi="Aptos"/>
+          <w:sz w:val="22"/>
+        </w:rPr>
+        <w:t>- Repository is not ready: complete conversational onboarding and approve only reviewed repository-owned setup commands.</w:t>
+      </w:r>
+    </w:p>
+    <w:p>
+      <w:pPr>
+        <w:spacing w:after="120"/>
+        <w:rPr>
+          <w:rFonts w:ascii="Aptos" w:hAnsi="Aptos"/>
+          <w:sz w:val="22"/>
+        </w:rPr>
+      </w:pPr>
+      <w:r>
+        <w:rPr>
+          <w:rFonts w:ascii="Aptos" w:hAnsi="Aptos"/>
+          <w:sz w:val="22"/>
+        </w:rPr>
+        <w:t>- Playwright is unavailable: configure and approve the repository-local Playwright setup.</w:t>
+      </w:r>
+    </w:p>
+    <w:p>
+      <w:pPr>
+        <w:spacing w:after="120"/>
+        <w:rPr>
+          <w:rFonts w:ascii="Aptos" w:hAnsi="Aptos"/>
+          <w:sz w:val="22"/>
+        </w:rPr>
+      </w:pPr>
+      <w:r>
+        <w:rPr>
+          <w:rFonts w:ascii="Aptos" w:hAnsi="Aptos"/>
+          <w:sz w:val="22"/>
+        </w:rPr>
+        <w:t>- Never switch automatically to production or bypass authentication and data-safety controls.</w:t>
       </w:r>
     </w:p>
     <w:p>
       <w:pPr>
         <w:pStyle w:val="Heading1"/>
-      </w:pPr>
-      <w:r>
-        <w:t>Small smoke test</w:t>
-      </w:r>
-    </w:p>
-    <w:p>
-      <w:r>
-        <w:t>Use validation-only mode first. It validates an existing pull request without editing source, committing, pushing, or changing the pull request.</w:t>
-      </w:r>
-    </w:p>
-    <w:p>
-      <w:pPr>
-        <w:ind w:left="360"/>
-        <w:rPr>
-          <w:rFonts w:ascii="Consolas" w:hAnsi="Consolas"/>
-          <w:sz w:val="18"/>
-        </w:rPr>
-      </w:pPr>
-      <w:r>
-        <w:rPr>
-          <w:rFonts w:ascii="Consolas" w:hAnsi="Consolas"/>
-          <w:sz w:val="18"/>
-        </w:rPr>
-        <w:t>fixlab validate &lt;application-repository&gt; --pr &lt;pull-request-number&gt; --runtime copilot</w:t>
-      </w:r>
-    </w:p>
-    <w:p>
-      <w:r>
-        <w:t>Agency equivalent:</w:t>
-      </w:r>
-    </w:p>
-    <w:p>
-      <w:pPr>
-        <w:ind w:left="360"/>
-        <w:rPr>
-          <w:rFonts w:ascii="Consolas" w:hAnsi="Consolas"/>
-          <w:sz w:val="18"/>
-        </w:rPr>
-      </w:pPr>
-      <w:r>
-        <w:rPr>
-          <w:rFonts w:ascii="Consolas" w:hAnsi="Consolas"/>
-          <w:sz w:val="18"/>
-        </w:rPr>
-        <w:t>fixlab validate &lt;application-repository&gt; --pr &lt;pull-request-number&gt; --runtime agency</w:t>
-      </w:r>
-    </w:p>
-    <w:p>
-      <w:pPr>
-        <w:pStyle w:val="Heading2"/>
-      </w:pPr>
-      <w:r>
-        <w:t>Dashboard smoke test</w:t>
-      </w:r>
-    </w:p>
-    <w:p>
-      <w:pPr>
-        <w:ind w:left="360"/>
-        <w:rPr>
-          <w:rFonts w:ascii="Consolas" w:hAnsi="Consolas"/>
-          <w:sz w:val="18"/>
-        </w:rPr>
-      </w:pPr>
-      <w:r>
-        <w:rPr>
-          <w:rFonts w:ascii="Consolas" w:hAnsi="Consolas"/>
-          <w:sz w:val="18"/>
-        </w:rPr>
-        <w:t>fixlab dashboard &lt;application-repository&gt; --runtime copilot</w:t>
-      </w:r>
-    </w:p>
-    <w:p>
-      <w:r>
-        <w:t>In the local dashboard:</w:t>
-      </w:r>
-    </w:p>
-    <w:p>
-      <w:pPr>
-        <w:pStyle w:val="ListParagraph"/>
-        <w:numPr>
-          <w:ilvl w:val="0"/>
-          <w:numId w:val="2"/>
-        </w:numPr>
-      </w:pPr>
-      <w:r>
-        <w:t>Confirm the repository profile reports Ready.</w:t>
-      </w:r>
-    </w:p>
-    <w:p>
-      <w:pPr>
-        <w:pStyle w:val="ListParagraph"/>
-        <w:numPr>
-          <w:ilvl w:val="0"/>
-          <w:numId w:val="2"/>
-        </w:numPr>
-      </w:pPr>
-      <w:r>
-        <w:t>Select Validate only.</w:t>
-      </w:r>
-    </w:p>
-    <w:p>
-      <w:pPr>
-        <w:pStyle w:val="ListParagraph"/>
-        <w:numPr>
-          <w:ilvl w:val="0"/>
-          <w:numId w:val="2"/>
-        </w:numPr>
-      </w:pPr>
-      <w:r>
-        <w:t>Provide a small known pull request or a safe read-only test request.</w:t>
-      </w:r>
-    </w:p>
-    <w:p>
-      <w:pPr>
-        <w:pStyle w:val="ListParagraph"/>
-        <w:numPr>
-          <w:ilvl w:val="0"/>
-          <w:numId w:val="2"/>
-        </w:numPr>
-      </w:pPr>
-      <w:r>
-        <w:t>Confirm FixLab reports intake, diagnosis, focused validation, application startup when required, browser validation, and pull-request outcome.</w:t>
-      </w:r>
-    </w:p>
-    <w:p>
-      <w:pPr>
-        <w:pStyle w:val="ListParagraph"/>
-        <w:numPr>
-          <w:ilvl w:val="0"/>
-          <w:numId w:val="2"/>
-        </w:numPr>
-      </w:pPr>
-      <w:r>
-        <w:t>Confirm every skipped, blocked, or failed gate is displayed explicitly.</w:t>
-      </w:r>
-    </w:p>
-    <w:p>
-      <w:pPr>
-        <w:pStyle w:val="ListParagraph"/>
-        <w:numPr>
-          <w:ilvl w:val="0"/>
-          <w:numId w:val="2"/>
-        </w:numPr>
-      </w:pPr>
-      <w:r>
-        <w:t>Confirm Playwright evidence includes a non-sensitive screenshot for UI validation.</w:t>
-      </w:r>
-    </w:p>
-    <w:p>
-      <w:pPr>
-        <w:pStyle w:val="Heading2"/>
-      </w:pPr>
-      <w:r>
-        <w:t>Expected smoke-test result</w:t>
-      </w:r>
-    </w:p>
-    <w:p>
-      <w:pPr>
-        <w:pStyle w:val="ListParagraph"/>
-        <w:numPr>
-          <w:ilvl w:val="0"/>
-          <w:numId w:val="3"/>
-        </w:numPr>
-      </w:pPr>
-      <w:r>
-        <w:t>No unrelated files are changed.</w:t>
-      </w:r>
-    </w:p>
-    <w:p>
-      <w:pPr>
-        <w:pStyle w:val="ListParagraph"/>
-        <w:numPr>
-          <w:ilvl w:val="0"/>
-          <w:numId w:val="3"/>
-        </w:numPr>
-      </w:pPr>
-      <w:r>
-        <w:lastRenderedPageBreak/>
-        <w:t>No commit, push, or pull-request update occurs in validation-only mode.</w:t>
-      </w:r>
-    </w:p>
-    <w:p>
-      <w:pPr>
-        <w:pStyle w:val="ListParagraph"/>
-        <w:numPr>
-          <w:ilvl w:val="0"/>
-          <w:numId w:val="3"/>
-        </w:numPr>
-      </w:pPr>
-      <w:r>
-        <w:t>Focused tests and configured checks report exact pass or failure results.</w:t>
-      </w:r>
-    </w:p>
-    <w:p>
-      <w:pPr>
-        <w:pStyle w:val="ListParagraph"/>
-        <w:numPr>
-          <w:ilvl w:val="0"/>
-          <w:numId w:val="3"/>
-        </w:numPr>
-      </w:pPr>
-      <w:r>
-        <w:t>The browser journey uses only the repository-approved non-production environment and safe test data.</w:t>
-      </w:r>
-    </w:p>
-    <w:p>
-      <w:pPr>
-        <w:pStyle w:val="ListParagraph"/>
-        <w:numPr>
-          <w:ilvl w:val="0"/>
-          <w:numId w:val="3"/>
-        </w:numPr>
-      </w:pPr>
-      <w:r>
-        <w:t>Authentication or data-safety blockers request human action instead of being bypassed.</w:t>
-      </w:r>
-    </w:p>
-    <w:p>
-      <w:pPr>
-        <w:pStyle w:val="Heading1"/>
-      </w:pPr>
-      <w:r>
-        <w:t>Troubleshooting</w:t>
-      </w:r>
-    </w:p>
-    <w:p>
-      <w:pPr>
-        <w:pStyle w:val="ListParagraph"/>
-        <w:numPr>
-          <w:ilvl w:val="0"/>
-          <w:numId w:val="4"/>
-        </w:numPr>
-      </w:pPr>
-      <w:r>
-        <w:t>fixlab is not recognized: reopen the terminal after the global npm installation and confirm the npm global binary directory is on PATH.</w:t>
-      </w:r>
-    </w:p>
-    <w:p>
-      <w:pPr>
-        <w:pStyle w:val="ListParagraph"/>
-        <w:numPr>
-          <w:ilvl w:val="0"/>
-          <w:numId w:val="4"/>
-        </w:numPr>
-      </w:pPr>
-      <w:r>
-        <w:t>Runtime check fails: run copilot --help or agency --version and complete authentication.</w:t>
-      </w:r>
-    </w:p>
-    <w:p>
-      <w:pPr>
-        <w:pStyle w:val="ListParagraph"/>
-        <w:numPr>
-          <w:ilvl w:val="0"/>
-          <w:numId w:val="4"/>
-        </w:numPr>
-      </w:pPr>
-      <w:r>
-        <w:t>Playwright check fails: run fixlab setup-playwright, review the plan, then run it again with --yes.</w:t>
-      </w:r>
-    </w:p>
-    <w:p>
-      <w:pPr>
-        <w:pStyle w:val="ListParagraph"/>
-        <w:numPr>
-          <w:ilvl w:val="0"/>
-          <w:numId w:val="4"/>
-        </w:numPr>
-      </w:pPr>
-      <w:r>
-        <w:t>Repository reports Not ready: complete the required values in .github\fixlab\repository-profile.json.</w:t>
-      </w:r>
-    </w:p>
-    <w:p>
-      <w:pPr>
-        <w:pStyle w:val="ListParagraph"/>
-        <w:numPr>
-          <w:ilvl w:val="0"/>
-          <w:numId w:val="4"/>
-        </w:numPr>
-      </w:pPr>
-      <w:r>
-        <w:t>Never switch automatically to production. Use only environments allowed by the repository profile.</w:t>
-      </w:r>
-    </w:p>
-    <w:p>
-      <w:pPr>
-        <w:pStyle w:val="Heading1"/>
-      </w:pPr>
-      <w:r>
+        <w:spacing w:after="120"/>
+        <w:rPr>
+          <w:rFonts w:ascii="Aptos" w:hAnsi="Aptos"/>
+          <w:sz w:val="22"/>
+        </w:rPr>
+      </w:pPr>
+      <w:r>
+        <w:rPr>
+          <w:rFonts w:ascii="Aptos" w:hAnsi="Aptos"/>
+          <w:sz w:val="22"/>
+        </w:rPr>
         <w:t>References</w:t>
       </w:r>
     </w:p>
     <w:p>
-      <w:r>
+      <w:pPr>
+        <w:spacing w:after="120"/>
+        <w:rPr>
+          <w:rFonts w:ascii="Aptos" w:hAnsi="Aptos"/>
+          <w:sz w:val="22"/>
+        </w:rPr>
+      </w:pPr>
+      <w:r>
+        <w:rPr>
+          <w:rFonts w:ascii="Aptos" w:hAnsi="Aptos"/>
+          <w:sz w:val="22"/>
+        </w:rPr>
         <w:t>FixLab repository: https://github.com/MonaDevAI/FixLab</w:t>
       </w:r>
     </w:p>
     <w:p>
-      <w:r>
-        <w:t>Merged release preparation PR: https://github.com/MonaDevAI/FixLab/pull/8</w:t>
-      </w:r>
-    </w:p>
-    <w:p>
-      <w:r>
-        <w:t>Document prepared from the FixLab installation, getting-started, and team-rollout guidance.</w:t>
-      </w:r>
-    </w:p>
-    <w:p/>
-    <w:p>
-      <w:pPr>
-        <w:pStyle w:val="Heading1"/>
-      </w:pPr>
-      <w:r>
-        <w:t>Current publication status</w:t>
-      </w:r>
-    </w:p>
-    <w:p>
-      <w:r>
-        <w:t>The current GitHub release is v0.5.4. FixLab is installed directly from https://github.com/MonaDevAI/FixLab. The @fixlab/cli package is not published to the public npm registry, and FixLab is not yet listed in the official GitHub Copilot plugin marketplace. Marketplace installation becomes available only after a separate pull request to github/copilot-plugins is reviewed and merged.</w:t>
-      </w:r>
-    </w:p>
-    <w:p>
-      <w:r>
-        <w:t>Release: https://github.com/MonaDevAI/FixLab/releases/tag/v0.5.4</w:t>
-      </w:r>
-    </w:p>
-    <w:p/>
+      <w:pPr>
+        <w:spacing w:after="120"/>
+        <w:rPr>
+          <w:rFonts w:ascii="Aptos" w:hAnsi="Aptos"/>
+          <w:sz w:val="22"/>
+        </w:rPr>
+      </w:pPr>
+      <w:r>
+        <w:rPr>
+          <w:rFonts w:ascii="Aptos" w:hAnsi="Aptos"/>
+          <w:sz w:val="22"/>
+        </w:rPr>
+        <w:t>Detailed installation: docs/installation.md</w:t>
+      </w:r>
+    </w:p>
+    <w:p>
+      <w:pPr>
+        <w:spacing w:after="120"/>
+        <w:rPr>
+          <w:rFonts w:ascii="Aptos" w:hAnsi="Aptos"/>
+          <w:sz w:val="22"/>
+        </w:rPr>
+      </w:pPr>
+      <w:r>
+        <w:rPr>
+          <w:rFonts w:ascii="Aptos" w:hAnsi="Aptos"/>
+          <w:sz w:val="22"/>
+        </w:rPr>
+        <w:t>Getting started: docs/getting-started.md</w:t>
+      </w:r>
+    </w:p>
+    <w:p>
+      <w:pPr>
+        <w:spacing w:after="120"/>
+        <w:rPr>
+          <w:rFonts w:ascii="Aptos" w:hAnsi="Aptos"/>
+          <w:sz w:val="22"/>
+        </w:rPr>
+      </w:pPr>
+      <w:r>
+        <w:rPr>
+          <w:rFonts w:ascii="Aptos" w:hAnsi="Aptos"/>
+          <w:sz w:val="22"/>
+        </w:rPr>
+        <w:t>Command reference: docs/commands.md</w:t>
+      </w:r>
+    </w:p>
+    <w:p>
+      <w:pPr>
+        <w:spacing w:after="120"/>
+        <w:rPr>
+          <w:rFonts w:ascii="Aptos" w:hAnsi="Aptos"/>
+          <w:sz w:val="22"/>
+        </w:rPr>
+      </w:pPr>
+    </w:p>
     <w:sectPr>
       <w:pgSz w:w="12240" w:h="15840"/>
       <w:pgMar w:top="1440" w:right="1440" w:bottom="1440" w:left="1440" w:header="720" w:footer="720" w:gutter="0"/>
@@ -934,91 +1716,6 @@
     </w:sectPr>
   </w:body>
 </w:document>
-</file>
-
-<file path=word/numbering.xml><?xml version="1.0" encoding="utf-8"?>
-<w:numbering xmlns:wpc="http://schemas.microsoft.com/office/word/2010/wordprocessingCanvas" xmlns:cx="http://schemas.microsoft.com/office/drawing/2014/chartex" xmlns:cx1="http://schemas.microsoft.com/office/drawing/2015/9/8/chartex" xmlns:cx2="http://schemas.microsoft.com/office/drawing/2015/10/21/chartex" xmlns:cx3="http://schemas.microsoft.com/office/drawing/2016/5/9/chartex" xmlns:cx4="http://schemas.microsoft.com/office/drawing/2016/5/10/chartex" xmlns:cx5="http://schemas.microsoft.com/office/drawing/2016/5/11/chartex" xmlns:cx6="http://schemas.microsoft.com/office/drawing/2016/5/12/chartex" xmlns:cx7="http://schemas.microsoft.com/office/drawing/2016/5/13/chartex" xmlns:cx8="http://schemas.microsoft.com/office/drawing/2016/5/14/chartex" xmlns:mc="http://schemas.openxmlformats.org/markup-compatibility/2006" xmlns:aink="http://schemas.microsoft.com/office/drawing/2016/ink" xmlns:am3d="http://schemas.microsoft.com/office/drawing/2017/model3d" xmlns:o="urn:schemas-microsoft-com:office:office" xmlns:oel="http://schemas.microsoft.com/office/2019/extlst" xmlns:r="http://schemas.openxmlformats.org/officeDocument/2006/relationships" xmlns:m="http://schemas.openxmlformats.org/officeDocument/2006/math" xmlns:v="urn:schemas-microsoft-com:vml" xmlns:wp14="http://schemas.microsoft.com/office/word/2010/wordprocessingDrawing" xmlns:wp="http://schemas.openxmlformats.org/drawingml/2006/wordprocessingDrawing" xmlns:w10="urn:schemas-microsoft-com:office:word" xmlns:w="http://schemas.openxmlformats.org/wordprocessingml/2006/main" xmlns:w14="http://schemas.microsoft.com/office/word/2010/wordml" xmlns:w15="http://schemas.microsoft.com/office/word/2012/wordml" xmlns:w16cex="http://schemas.microsoft.com/office/word/2018/wordml/cex" xmlns:w16cid="http://schemas.microsoft.com/office/word/2016/wordml/cid" xmlns:w16="http://schemas.microsoft.com/office/word/2018/wordml" xmlns:w16du="http://schemas.microsoft.com/office/word/2023/wordml/word16du" xmlns:w16sdtdh="http://schemas.microsoft.com/office/word/2020/wordml/sdtdatahash" xmlns:w16sdtfl="http://schemas.microsoft.com/office/word/2024/wordml/sdtformatlock" xmlns:w16se="http://schemas.microsoft.com/office/word/2015/wordml/symex" xmlns:wpg="http://schemas.microsoft.com/office/word/2010/wordprocessingGroup" xmlns:wpi="http://schemas.microsoft.com/office/word/2010/wordprocessingInk" xmlns:wne="http://schemas.microsoft.com/office/word/2006/wordml" xmlns:wps="http://schemas.microsoft.com/office/word/2010/wordprocessingShape" mc:Ignorable="w14 w15 w16se w16cid w16 w16cex w16sdtdh w16sdtfl w16du wp14">
-  <w:abstractNum w:abstractNumId="0" w15:restartNumberingAfterBreak="0">
-    <w:nsid w:val="1FC92592"/>
-    <w:multiLevelType w:val="singleLevel"/>
-    <w:tmpl w:val="04090001"/>
-    <w:lvl w:ilvl="0">
-      <w:start w:val="1"/>
-      <w:numFmt w:val="bullet"/>
-      <w:lvlText w:val=""/>
-      <w:lvlJc w:val="left"/>
-      <w:pPr>
-        <w:ind w:left="720" w:hanging="360"/>
-      </w:pPr>
-      <w:rPr>
-        <w:rFonts w:ascii="Symbol" w:hAnsi="Symbol" w:hint="default"/>
-      </w:rPr>
-    </w:lvl>
-  </w:abstractNum>
-  <w:abstractNum w:abstractNumId="1" w15:restartNumberingAfterBreak="0">
-    <w:nsid w:val="309B7832"/>
-    <w:multiLevelType w:val="singleLevel"/>
-    <w:tmpl w:val="04090001"/>
-    <w:lvl w:ilvl="0">
-      <w:start w:val="1"/>
-      <w:numFmt w:val="bullet"/>
-      <w:lvlText w:val=""/>
-      <w:lvlJc w:val="left"/>
-      <w:pPr>
-        <w:ind w:left="720" w:hanging="360"/>
-      </w:pPr>
-      <w:rPr>
-        <w:rFonts w:ascii="Symbol" w:hAnsi="Symbol" w:hint="default"/>
-      </w:rPr>
-    </w:lvl>
-  </w:abstractNum>
-  <w:abstractNum w:abstractNumId="2" w15:restartNumberingAfterBreak="0">
-    <w:nsid w:val="5FD54C31"/>
-    <w:multiLevelType w:val="singleLevel"/>
-    <w:tmpl w:val="04090001"/>
-    <w:lvl w:ilvl="0">
-      <w:start w:val="1"/>
-      <w:numFmt w:val="bullet"/>
-      <w:lvlText w:val=""/>
-      <w:lvlJc w:val="left"/>
-      <w:pPr>
-        <w:ind w:left="720" w:hanging="360"/>
-      </w:pPr>
-      <w:rPr>
-        <w:rFonts w:ascii="Symbol" w:hAnsi="Symbol" w:hint="default"/>
-      </w:rPr>
-    </w:lvl>
-  </w:abstractNum>
-  <w:abstractNum w:abstractNumId="3" w15:restartNumberingAfterBreak="0">
-    <w:nsid w:val="7BBD441B"/>
-    <w:multiLevelType w:val="singleLevel"/>
-    <w:tmpl w:val="04090001"/>
-    <w:lvl w:ilvl="0">
-      <w:start w:val="1"/>
-      <w:numFmt w:val="bullet"/>
-      <w:lvlText w:val=""/>
-      <w:lvlJc w:val="left"/>
-      <w:pPr>
-        <w:ind w:left="720" w:hanging="360"/>
-      </w:pPr>
-      <w:rPr>
-        <w:rFonts w:ascii="Symbol" w:hAnsi="Symbol" w:hint="default"/>
-      </w:rPr>
-    </w:lvl>
-  </w:abstractNum>
-  <w:num w:numId="1" w16cid:durableId="191844389">
-    <w:abstractNumId w:val="2"/>
-  </w:num>
-  <w:num w:numId="2" w16cid:durableId="1368022812">
-    <w:abstractNumId w:val="3"/>
-  </w:num>
-  <w:num w:numId="3" w16cid:durableId="1705713616">
-    <w:abstractNumId w:val="1"/>
-  </w:num>
-  <w:num w:numId="4" w16cid:durableId="1894341214">
-    <w:abstractNumId w:val="0"/>
-  </w:num>
-</w:numbering>
 </file>
 
 <file path=word/styles.xml><?xml version="1.0" encoding="utf-8"?>
@@ -1429,7 +2126,7 @@
     <w:link w:val="Heading1Char"/>
     <w:uiPriority w:val="9"/>
     <w:qFormat/>
-    <w:rsid w:val="00187A11"/>
+    <w:rsid w:val="00945F3D"/>
     <w:pPr>
       <w:keepNext/>
       <w:keepLines/>
@@ -1451,7 +2148,7 @@
     <w:uiPriority w:val="9"/>
     <w:unhideWhenUsed/>
     <w:qFormat/>
-    <w:rsid w:val="00187A11"/>
+    <w:rsid w:val="00945F3D"/>
     <w:pPr>
       <w:keepNext/>
       <w:keepLines/>
@@ -1474,7 +2171,7 @@
     <w:semiHidden/>
     <w:unhideWhenUsed/>
     <w:qFormat/>
-    <w:rsid w:val="00187A11"/>
+    <w:rsid w:val="00945F3D"/>
     <w:pPr>
       <w:keepNext/>
       <w:keepLines/>
@@ -1497,7 +2194,7 @@
     <w:semiHidden/>
     <w:unhideWhenUsed/>
     <w:qFormat/>
-    <w:rsid w:val="00187A11"/>
+    <w:rsid w:val="00945F3D"/>
     <w:pPr>
       <w:keepNext/>
       <w:keepLines/>
@@ -1520,7 +2217,7 @@
     <w:semiHidden/>
     <w:unhideWhenUsed/>
     <w:qFormat/>
-    <w:rsid w:val="00187A11"/>
+    <w:rsid w:val="00945F3D"/>
     <w:pPr>
       <w:keepNext/>
       <w:keepLines/>
@@ -1541,7 +2238,7 @@
     <w:semiHidden/>
     <w:unhideWhenUsed/>
     <w:qFormat/>
-    <w:rsid w:val="00187A11"/>
+    <w:rsid w:val="00945F3D"/>
     <w:pPr>
       <w:keepNext/>
       <w:keepLines/>
@@ -1564,7 +2261,7 @@
     <w:semiHidden/>
     <w:unhideWhenUsed/>
     <w:qFormat/>
-    <w:rsid w:val="00187A11"/>
+    <w:rsid w:val="00945F3D"/>
     <w:pPr>
       <w:keepNext/>
       <w:keepLines/>
@@ -1585,7 +2282,7 @@
     <w:semiHidden/>
     <w:unhideWhenUsed/>
     <w:qFormat/>
-    <w:rsid w:val="00187A11"/>
+    <w:rsid w:val="00945F3D"/>
     <w:pPr>
       <w:keepNext/>
       <w:keepLines/>
@@ -1608,7 +2305,7 @@
     <w:semiHidden/>
     <w:unhideWhenUsed/>
     <w:qFormat/>
-    <w:rsid w:val="00187A11"/>
+    <w:rsid w:val="00945F3D"/>
     <w:pPr>
       <w:keepNext/>
       <w:keepLines/>
@@ -1652,7 +2349,7 @@
     <w:basedOn w:val="DefaultParagraphFont"/>
     <w:link w:val="Heading1"/>
     <w:uiPriority w:val="9"/>
-    <w:rsid w:val="00187A11"/>
+    <w:rsid w:val="00945F3D"/>
     <w:rPr>
       <w:rFonts w:asciiTheme="majorHAnsi" w:eastAsiaTheme="majorEastAsia" w:hAnsiTheme="majorHAnsi" w:cstheme="majorBidi"/>
       <w:color w:val="0F4761" w:themeColor="accent1" w:themeShade="BF"/>
@@ -1665,7 +2362,7 @@
     <w:basedOn w:val="DefaultParagraphFont"/>
     <w:link w:val="Heading2"/>
     <w:uiPriority w:val="9"/>
-    <w:rsid w:val="00187A11"/>
+    <w:rsid w:val="00945F3D"/>
     <w:rPr>
       <w:rFonts w:asciiTheme="majorHAnsi" w:eastAsiaTheme="majorEastAsia" w:hAnsiTheme="majorHAnsi" w:cstheme="majorBidi"/>
       <w:color w:val="0F4761" w:themeColor="accent1" w:themeShade="BF"/>
@@ -1679,7 +2376,7 @@
     <w:link w:val="Heading3"/>
     <w:uiPriority w:val="9"/>
     <w:semiHidden/>
-    <w:rsid w:val="00187A11"/>
+    <w:rsid w:val="00945F3D"/>
     <w:rPr>
       <w:rFonts w:eastAsiaTheme="majorEastAsia" w:cstheme="majorBidi"/>
       <w:color w:val="0F4761" w:themeColor="accent1" w:themeShade="BF"/>
@@ -1693,7 +2390,7 @@
     <w:link w:val="Heading4"/>
     <w:uiPriority w:val="9"/>
     <w:semiHidden/>
-    <w:rsid w:val="00187A11"/>
+    <w:rsid w:val="00945F3D"/>
     <w:rPr>
       <w:rFonts w:eastAsiaTheme="majorEastAsia" w:cstheme="majorBidi"/>
       <w:i/>
@@ -1707,7 +2404,7 @@
     <w:link w:val="Heading5"/>
     <w:uiPriority w:val="9"/>
     <w:semiHidden/>
-    <w:rsid w:val="00187A11"/>
+    <w:rsid w:val="00945F3D"/>
     <w:rPr>
       <w:rFonts w:eastAsiaTheme="majorEastAsia" w:cstheme="majorBidi"/>
       <w:color w:val="0F4761" w:themeColor="accent1" w:themeShade="BF"/>
@@ -1719,7 +2416,7 @@
     <w:link w:val="Heading6"/>
     <w:uiPriority w:val="9"/>
     <w:semiHidden/>
-    <w:rsid w:val="00187A11"/>
+    <w:rsid w:val="00945F3D"/>
     <w:rPr>
       <w:rFonts w:eastAsiaTheme="majorEastAsia" w:cstheme="majorBidi"/>
       <w:i/>
@@ -1733,7 +2430,7 @@
     <w:link w:val="Heading7"/>
     <w:uiPriority w:val="9"/>
     <w:semiHidden/>
-    <w:rsid w:val="00187A11"/>
+    <w:rsid w:val="00945F3D"/>
     <w:rPr>
       <w:rFonts w:eastAsiaTheme="majorEastAsia" w:cstheme="majorBidi"/>
       <w:color w:val="595959" w:themeColor="text1" w:themeTint="A6"/>
@@ -1745,7 +2442,7 @@
     <w:link w:val="Heading8"/>
     <w:uiPriority w:val="9"/>
     <w:semiHidden/>
-    <w:rsid w:val="00187A11"/>
+    <w:rsid w:val="00945F3D"/>
     <w:rPr>
       <w:rFonts w:eastAsiaTheme="majorEastAsia" w:cstheme="majorBidi"/>
       <w:i/>
@@ -1759,7 +2456,7 @@
     <w:link w:val="Heading9"/>
     <w:uiPriority w:val="9"/>
     <w:semiHidden/>
-    <w:rsid w:val="00187A11"/>
+    <w:rsid w:val="00945F3D"/>
     <w:rPr>
       <w:rFonts w:eastAsiaTheme="majorEastAsia" w:cstheme="majorBidi"/>
       <w:color w:val="272727" w:themeColor="text1" w:themeTint="D8"/>
@@ -1772,7 +2469,7 @@
     <w:link w:val="TitleChar"/>
     <w:uiPriority w:val="10"/>
     <w:qFormat/>
-    <w:rsid w:val="00187A11"/>
+    <w:rsid w:val="00945F3D"/>
     <w:pPr>
       <w:spacing w:after="80" w:line="240" w:lineRule="auto"/>
       <w:contextualSpacing/>
@@ -1790,7 +2487,7 @@
     <w:basedOn w:val="DefaultParagraphFont"/>
     <w:link w:val="Title"/>
     <w:uiPriority w:val="10"/>
-    <w:rsid w:val="00187A11"/>
+    <w:rsid w:val="00945F3D"/>
     <w:rPr>
       <w:rFonts w:asciiTheme="majorHAnsi" w:eastAsiaTheme="majorEastAsia" w:hAnsiTheme="majorHAnsi" w:cstheme="majorBidi"/>
       <w:spacing w:val="-10"/>
@@ -1806,7 +2503,7 @@
     <w:link w:val="SubtitleChar"/>
     <w:uiPriority w:val="11"/>
     <w:qFormat/>
-    <w:rsid w:val="00187A11"/>
+    <w:rsid w:val="00945F3D"/>
     <w:pPr>
       <w:numPr>
         <w:ilvl w:val="1"/>
@@ -1825,7 +2522,7 @@
     <w:basedOn w:val="DefaultParagraphFont"/>
     <w:link w:val="Subtitle"/>
     <w:uiPriority w:val="11"/>
-    <w:rsid w:val="00187A11"/>
+    <w:rsid w:val="00945F3D"/>
     <w:rPr>
       <w:rFonts w:eastAsiaTheme="majorEastAsia" w:cstheme="majorBidi"/>
       <w:color w:val="595959" w:themeColor="text1" w:themeTint="A6"/>
@@ -1841,7 +2538,7 @@
     <w:link w:val="QuoteChar"/>
     <w:uiPriority w:val="29"/>
     <w:qFormat/>
-    <w:rsid w:val="00187A11"/>
+    <w:rsid w:val="00945F3D"/>
     <w:pPr>
       <w:spacing w:before="160"/>
       <w:jc w:val="center"/>
@@ -1857,7 +2554,7 @@
     <w:basedOn w:val="DefaultParagraphFont"/>
     <w:link w:val="Quote"/>
     <w:uiPriority w:val="29"/>
-    <w:rsid w:val="00187A11"/>
+    <w:rsid w:val="00945F3D"/>
     <w:rPr>
       <w:i/>
       <w:iCs/>
@@ -1869,7 +2566,7 @@
     <w:basedOn w:val="Normal"/>
     <w:uiPriority w:val="34"/>
     <w:qFormat/>
-    <w:rsid w:val="00187A11"/>
+    <w:rsid w:val="00945F3D"/>
     <w:pPr>
       <w:ind w:left="720"/>
       <w:contextualSpacing/>
@@ -1880,7 +2577,7 @@
     <w:basedOn w:val="DefaultParagraphFont"/>
     <w:uiPriority w:val="21"/>
     <w:qFormat/>
-    <w:rsid w:val="00187A11"/>
+    <w:rsid w:val="00945F3D"/>
     <w:rPr>
       <w:i/>
       <w:iCs/>
@@ -1894,7 +2591,7 @@
     <w:link w:val="IntenseQuoteChar"/>
     <w:uiPriority w:val="30"/>
     <w:qFormat/>
-    <w:rsid w:val="00187A11"/>
+    <w:rsid w:val="00945F3D"/>
     <w:pPr>
       <w:pBdr>
         <w:top w:val="single" w:sz="4" w:space="10" w:color="0F4761" w:themeColor="accent1" w:themeShade="BF"/>
@@ -1915,7 +2612,7 @@
     <w:basedOn w:val="DefaultParagraphFont"/>
     <w:link w:val="IntenseQuote"/>
     <w:uiPriority w:val="30"/>
-    <w:rsid w:val="00187A11"/>
+    <w:rsid w:val="00945F3D"/>
     <w:rPr>
       <w:i/>
       <w:iCs/>
@@ -1927,7 +2624,7 @@
     <w:basedOn w:val="DefaultParagraphFont"/>
     <w:uiPriority w:val="32"/>
     <w:qFormat/>
-    <w:rsid w:val="00187A11"/>
+    <w:rsid w:val="00945F3D"/>
     <w:rPr>
       <w:b/>
       <w:bCs/>

</xml_diff>

<commit_message>
Document FixLab Copilot plugin chat
Add direct plugin installation and agent launch steps, queued prompt guidance, and immediate dashboard controls for status and new bug submission.

Co-authored-by: Copilot <223556219+Copilot@users.noreply.github.com>

Copilot-Session: 9168917c-fadb-448b-afda-9613a02dd02d
</commit_message>
<xml_diff>
--- a/docs/FixLab-Installation-and-Smoke-Test.docx
+++ b/docs/FixLab-Installation-and-Smoke-Test.docx
@@ -369,18 +369,219 @@
     <w:p>
       <w:pPr>
         <w:pStyle w:val="Heading1"/>
-        <w:spacing w:after="120"/>
-        <w:rPr>
-          <w:rFonts w:ascii="Aptos" w:hAnsi="Aptos"/>
-          <w:sz w:val="22"/>
-        </w:rPr>
-      </w:pPr>
-      <w:r>
-        <w:rPr>
-          <w:rFonts w:ascii="Aptos" w:hAnsi="Aptos"/>
-          <w:sz w:val="22"/>
-        </w:rPr>
-        <w:t>3. Start chat and select a repository</w:t>
+      </w:pPr>
+      <w:r>
+        <w:t>3. Use FixLab through the Copilot plugin</w:t>
+      </w:r>
+    </w:p>
+    <w:p>
+      <w:pPr>
+        <w:spacing w:after="120"/>
+        <w:ind w:left="360"/>
+        <w:rPr>
+          <w:rFonts w:ascii="Aptos" w:eastAsiaTheme="majorEastAsia" w:hAnsi="Aptos" w:cstheme="majorBidi"/>
+          <w:color w:val="0F4761" w:themeColor="accent1" w:themeShade="BF"/>
+          <w:sz w:val="22"/>
+          <w:szCs w:val="40"/>
+        </w:rPr>
+      </w:pPr>
+      <w:r>
+        <w:rPr>
+          <w:rFonts w:ascii="Aptos" w:eastAsiaTheme="majorEastAsia" w:hAnsi="Aptos" w:cstheme="majorBidi"/>
+          <w:color w:val="0F4761" w:themeColor="accent1" w:themeShade="BF"/>
+          <w:sz w:val="22"/>
+          <w:szCs w:val="40"/>
+        </w:rPr>
+        <w:t>Install the GitHub-hosted FixLab plugin:</w:t>
+      </w:r>
+    </w:p>
+    <w:p>
+      <w:pPr>
+        <w:spacing w:after="120"/>
+        <w:ind w:left="360"/>
+        <w:rPr>
+          <w:rFonts w:ascii="Aptos" w:eastAsiaTheme="majorEastAsia" w:hAnsi="Aptos" w:cstheme="majorBidi"/>
+          <w:color w:val="0F4761" w:themeColor="accent1" w:themeShade="BF"/>
+          <w:sz w:val="22"/>
+          <w:szCs w:val="40"/>
+        </w:rPr>
+      </w:pPr>
+      <w:r>
+        <w:rPr>
+          <w:rFonts w:ascii="Aptos" w:eastAsiaTheme="majorEastAsia" w:hAnsi="Aptos" w:cstheme="majorBidi"/>
+          <w:color w:val="0F4761" w:themeColor="accent1" w:themeShade="BF"/>
+          <w:sz w:val="22"/>
+          <w:szCs w:val="40"/>
+        </w:rPr>
+        <w:t>copilot plugin install MonaDevAI/FixLab</w:t>
+      </w:r>
+    </w:p>
+    <w:p>
+      <w:pPr>
+        <w:spacing w:after="120"/>
+        <w:ind w:left="360"/>
+        <w:rPr>
+          <w:rFonts w:ascii="Aptos" w:eastAsiaTheme="majorEastAsia" w:hAnsi="Aptos" w:cstheme="majorBidi"/>
+          <w:color w:val="0F4761" w:themeColor="accent1" w:themeShade="BF"/>
+          <w:sz w:val="22"/>
+          <w:szCs w:val="40"/>
+        </w:rPr>
+      </w:pPr>
+      <w:r>
+        <w:rPr>
+          <w:rFonts w:ascii="Aptos" w:eastAsiaTheme="majorEastAsia" w:hAnsi="Aptos" w:cstheme="majorBidi"/>
+          <w:color w:val="0F4761" w:themeColor="accent1" w:themeShade="BF"/>
+          <w:sz w:val="22"/>
+          <w:szCs w:val="40"/>
+        </w:rPr>
+        <w:t>Start Copilot CLI from the repository and select the FixLab agent:</w:t>
+      </w:r>
+    </w:p>
+    <w:p>
+      <w:pPr>
+        <w:spacing w:after="120"/>
+        <w:ind w:left="360"/>
+        <w:rPr>
+          <w:rFonts w:ascii="Aptos" w:eastAsiaTheme="majorEastAsia" w:hAnsi="Aptos" w:cstheme="majorBidi"/>
+          <w:color w:val="0F4761" w:themeColor="accent1" w:themeShade="BF"/>
+          <w:sz w:val="22"/>
+          <w:szCs w:val="40"/>
+        </w:rPr>
+      </w:pPr>
+      <w:r>
+        <w:rPr>
+          <w:rFonts w:ascii="Aptos" w:eastAsiaTheme="majorEastAsia" w:hAnsi="Aptos" w:cstheme="majorBidi"/>
+          <w:color w:val="0F4761" w:themeColor="accent1" w:themeShade="BF"/>
+          <w:sz w:val="22"/>
+          <w:szCs w:val="40"/>
+        </w:rPr>
+        <w:t>copilot --agent fixlab:fixlab</w:t>
+      </w:r>
+    </w:p>
+    <w:p>
+      <w:pPr>
+        <w:spacing w:after="120"/>
+        <w:ind w:left="360"/>
+        <w:rPr>
+          <w:rFonts w:ascii="Aptos" w:eastAsiaTheme="majorEastAsia" w:hAnsi="Aptos" w:cstheme="majorBidi"/>
+          <w:color w:val="0F4761" w:themeColor="accent1" w:themeShade="BF"/>
+          <w:sz w:val="22"/>
+          <w:szCs w:val="40"/>
+        </w:rPr>
+      </w:pPr>
+      <w:r>
+        <w:rPr>
+          <w:rFonts w:ascii="Aptos" w:eastAsiaTheme="majorEastAsia" w:hAnsi="Aptos" w:cstheme="majorBidi"/>
+          <w:color w:val="0F4761" w:themeColor="accent1" w:themeShade="BF"/>
+          <w:sz w:val="22"/>
+          <w:szCs w:val="40"/>
+        </w:rPr>
+        <w:t>You may also open Copilot CLI normally, type /plugin to manage the plugin, and use /agent fixlab:fixlab to select FixLab.</w:t>
+      </w:r>
+    </w:p>
+    <w:p>
+      <w:pPr>
+        <w:spacing w:after="120"/>
+        <w:ind w:left="360"/>
+        <w:rPr>
+          <w:rFonts w:ascii="Aptos" w:eastAsiaTheme="majorEastAsia" w:hAnsi="Aptos" w:cstheme="majorBidi"/>
+          <w:color w:val="0F4761" w:themeColor="accent1" w:themeShade="BF"/>
+          <w:sz w:val="22"/>
+          <w:szCs w:val="40"/>
+        </w:rPr>
+      </w:pPr>
+      <w:r>
+        <w:rPr>
+          <w:rFonts w:ascii="Aptos" w:eastAsiaTheme="majorEastAsia" w:hAnsi="Aptos" w:cstheme="majorBidi"/>
+          <w:color w:val="0F4761" w:themeColor="accent1" w:themeShade="BF"/>
+          <w:sz w:val="22"/>
+          <w:szCs w:val="40"/>
+        </w:rPr>
+        <w:t>Enter requests naturally, for example: Inspect this React and .NET repository, suggest the required FixLab configuration, and help me validate a new bug.</w:t>
+      </w:r>
+    </w:p>
+    <w:p>
+      <w:pPr>
+        <w:spacing w:after="120"/>
+        <w:ind w:left="360"/>
+        <w:rPr>
+          <w:rFonts w:ascii="Aptos" w:eastAsiaTheme="majorEastAsia" w:hAnsi="Aptos" w:cstheme="majorBidi"/>
+          <w:color w:val="0F4761" w:themeColor="accent1" w:themeShade="BF"/>
+          <w:sz w:val="22"/>
+          <w:szCs w:val="40"/>
+        </w:rPr>
+      </w:pPr>
+      <w:r>
+        <w:rPr>
+          <w:rFonts w:ascii="Aptos" w:eastAsiaTheme="majorEastAsia" w:hAnsi="Aptos" w:cstheme="majorBidi"/>
+          <w:color w:val="0F4761" w:themeColor="accent1" w:themeShade="BF"/>
+          <w:sz w:val="22"/>
+          <w:szCs w:val="40"/>
+        </w:rPr>
+        <w:t>While the Copilot agent is busy, press Ctrl+Q to queue another prompt. The queued prompt runs after the current agent turn.</w:t>
+      </w:r>
+    </w:p>
+    <w:p>
+      <w:pPr>
+        <w:spacing w:after="120"/>
+        <w:ind w:left="360"/>
+        <w:rPr>
+          <w:rFonts w:ascii="Aptos" w:eastAsiaTheme="majorEastAsia" w:hAnsi="Aptos" w:cstheme="majorBidi"/>
+          <w:color w:val="0F4761" w:themeColor="accent1" w:themeShade="BF"/>
+          <w:sz w:val="22"/>
+          <w:szCs w:val="40"/>
+        </w:rPr>
+      </w:pPr>
+      <w:r>
+        <w:rPr>
+          <w:rFonts w:ascii="Aptos" w:eastAsiaTheme="majorEastAsia" w:hAnsi="Aptos" w:cstheme="majorBidi"/>
+          <w:color w:val="0F4761" w:themeColor="accent1" w:themeShade="BF"/>
+          <w:sz w:val="22"/>
+          <w:szCs w:val="40"/>
+        </w:rPr>
+        <w:t>For immediate controls while a dashboard job continues, keep fixlab chat open and use show status, show logs, show pull request, or new bug &lt;details&gt;. A new bug is submitted as a separate queued job without interrupting the active bug. Normal guidance waits for the active agent turn.</w:t>
+      </w:r>
+    </w:p>
+    <w:p>
+      <w:pPr>
+        <w:spacing w:after="120"/>
+        <w:ind w:left="360"/>
+        <w:rPr>
+          <w:rFonts w:ascii="Aptos" w:eastAsiaTheme="majorEastAsia" w:hAnsi="Aptos" w:cstheme="majorBidi"/>
+          <w:color w:val="0F4761" w:themeColor="accent1" w:themeShade="BF"/>
+          <w:sz w:val="22"/>
+          <w:szCs w:val="40"/>
+        </w:rPr>
+      </w:pPr>
+      <w:r>
+        <w:rPr>
+          <w:rFonts w:ascii="Aptos" w:eastAsiaTheme="majorEastAsia" w:hAnsi="Aptos" w:cstheme="majorBidi"/>
+          <w:color w:val="0F4761" w:themeColor="accent1" w:themeShade="BF"/>
+          <w:sz w:val="22"/>
+          <w:szCs w:val="40"/>
+        </w:rPr>
+        <w:t>Use the Copilot plugin for the closest Agency-style conversation. Use fixlab chat when you also want the dashboard, persistent job queue, streamed evidence, recovery controls, and localhost lifecycle.</w:t>
+      </w:r>
+    </w:p>
+    <w:p>
+      <w:pPr>
+        <w:spacing w:after="120"/>
+        <w:ind w:left="360"/>
+        <w:rPr>
+          <w:rFonts w:ascii="Aptos" w:eastAsiaTheme="majorEastAsia" w:hAnsi="Aptos" w:cstheme="majorBidi"/>
+          <w:color w:val="0F4761" w:themeColor="accent1" w:themeShade="BF"/>
+          <w:sz w:val="22"/>
+          <w:szCs w:val="40"/>
+        </w:rPr>
+      </w:pPr>
+      <w:r>
+        <w:rPr>
+          <w:rFonts w:ascii="Aptos" w:eastAsiaTheme="majorEastAsia" w:hAnsi="Aptos" w:cstheme="majorBidi"/>
+          <w:color w:val="0F4761" w:themeColor="accent1" w:themeShade="BF"/>
+          <w:sz w:val="22"/>
+          <w:szCs w:val="40"/>
+        </w:rPr>
+        <w:t>4. Start dashboard-connected chat and select a repository</w:t>
       </w:r>
     </w:p>
     <w:p>
@@ -446,6 +647,7 @@
           <w:rFonts w:ascii="Aptos" w:hAnsi="Aptos"/>
           <w:sz w:val="22"/>
         </w:rPr>
+        <w:lastRenderedPageBreak/>
         <w:t>When a dashboard is already running, chat displays the connected repository. Press Enter to keep it or enter another repository path. FixLab starts another repository on the next available loopback port.</w:t>
       </w:r>
     </w:p>
@@ -620,6 +822,1036 @@
     </w:p>
     <w:p>
       <w:pPr>
+        <w:spacing w:after="120"/>
+        <w:rPr>
+          <w:rFonts w:ascii="Aptos" w:eastAsiaTheme="majorEastAsia" w:hAnsi="Aptos" w:cstheme="majorBidi"/>
+          <w:color w:val="0F4761" w:themeColor="accent1" w:themeShade="BF"/>
+          <w:sz w:val="22"/>
+          <w:szCs w:val="40"/>
+        </w:rPr>
+      </w:pPr>
+      <w:r>
+        <w:rPr>
+          <w:rFonts w:ascii="Aptos" w:eastAsiaTheme="majorEastAsia" w:hAnsi="Aptos" w:cstheme="majorBidi"/>
+          <w:color w:val="0F4761" w:themeColor="accent1" w:themeShade="BF"/>
+          <w:sz w:val="22"/>
+          <w:szCs w:val="40"/>
+        </w:rPr>
+        <w:t>5. Onboard a React frontend and .NET backend</w:t>
+      </w:r>
+    </w:p>
+    <w:p>
+      <w:pPr>
+        <w:spacing w:after="120"/>
+        <w:rPr>
+          <w:rFonts w:ascii="Aptos" w:hAnsi="Aptos"/>
+          <w:sz w:val="22"/>
+        </w:rPr>
+      </w:pPr>
+      <w:r>
+        <w:rPr>
+          <w:rFonts w:ascii="Aptos" w:hAnsi="Aptos"/>
+          <w:sz w:val="22"/>
+        </w:rPr>
+        <w:t>For a new or incomplete repository, ask chat:</w:t>
+      </w:r>
+    </w:p>
+    <w:p>
+      <w:pPr>
+        <w:spacing w:after="120"/>
+        <w:ind w:left="360"/>
+        <w:rPr>
+          <w:rFonts w:ascii="Consolas" w:hAnsi="Consolas"/>
+          <w:sz w:val="18"/>
+        </w:rPr>
+      </w:pPr>
+      <w:r>
+        <w:rPr>
+          <w:rFonts w:ascii="Consolas" w:hAnsi="Consolas"/>
+          <w:sz w:val="18"/>
+        </w:rPr>
+        <w:t>Onboard this repository for FixLab. Inspect the React frontend and .NET backend, reuse existing repository commands, configure restore, test, lint, build, startup, ports, health checks, Playwright, authentication, safe environments, and pull-request settings. Explain missing configuration and ask before running setup commands, then run doctor.</w:t>
+      </w:r>
+    </w:p>
+    <w:p>
+      <w:pPr>
+        <w:spacing w:after="120"/>
+        <w:rPr>
+          <w:rFonts w:ascii="Aptos" w:hAnsi="Aptos"/>
+          <w:sz w:val="22"/>
+        </w:rPr>
+      </w:pPr>
+      <w:r>
+        <w:rPr>
+          <w:rFonts w:ascii="Aptos" w:hAnsi="Aptos"/>
+          <w:sz w:val="22"/>
+        </w:rPr>
+        <w:t>FixLab inspects repository-owned files such as package.json, lockfiles, solution and project files, global.json, launchSettings.json, Playwright configuration, CI definitions, local-development documentation, and repository instructions.</w:t>
+      </w:r>
+    </w:p>
+    <w:p>
+      <w:pPr>
+        <w:spacing w:after="120"/>
+        <w:rPr>
+          <w:rFonts w:ascii="Aptos" w:hAnsi="Aptos"/>
+          <w:sz w:val="22"/>
+        </w:rPr>
+      </w:pPr>
+      <w:r>
+        <w:rPr>
+          <w:rFonts w:ascii="Aptos" w:hAnsi="Aptos"/>
+          <w:sz w:val="22"/>
+        </w:rPr>
+        <w:t>- Frontend-only repository: configure only the React application and do not invent a backend.</w:t>
+      </w:r>
+    </w:p>
+    <w:p>
+      <w:pPr>
+        <w:spacing w:after="120"/>
+        <w:rPr>
+          <w:rFonts w:ascii="Aptos" w:hAnsi="Aptos"/>
+          <w:sz w:val="22"/>
+        </w:rPr>
+      </w:pPr>
+      <w:r>
+        <w:rPr>
+          <w:rFonts w:ascii="Aptos" w:hAnsi="Aptos"/>
+          <w:sz w:val="22"/>
+        </w:rPr>
+        <w:t>- Combined repository: configure frontend and backend commands independently.</w:t>
+      </w:r>
+    </w:p>
+    <w:p>
+      <w:pPr>
+        <w:spacing w:after="120"/>
+        <w:rPr>
+          <w:rFonts w:ascii="Aptos" w:hAnsi="Aptos"/>
+          <w:sz w:val="22"/>
+        </w:rPr>
+      </w:pPr>
+      <w:r>
+        <w:rPr>
+          <w:rFonts w:ascii="Aptos" w:hAnsi="Aptos"/>
+          <w:sz w:val="22"/>
+        </w:rPr>
+        <w:t>- Separate frontend and backend repositories: onboard each repository separately.</w:t>
+      </w:r>
+    </w:p>
+    <w:p>
+      <w:pPr>
+        <w:spacing w:after="120"/>
+        <w:rPr>
+          <w:rFonts w:ascii="Aptos" w:hAnsi="Aptos"/>
+          <w:sz w:val="22"/>
+        </w:rPr>
+      </w:pPr>
+      <w:r>
+        <w:rPr>
+          <w:rFonts w:ascii="Aptos" w:hAnsi="Aptos"/>
+          <w:sz w:val="22"/>
+        </w:rPr>
+        <w:t>- Never place credentials, tokens, cookies, browser-state contents, customer data, or production endpoints in the FixLab profile.</w:t>
+      </w:r>
+    </w:p>
+    <w:p>
+      <w:pPr>
+        <w:spacing w:after="120"/>
+        <w:rPr>
+          <w:rFonts w:ascii="Aptos" w:eastAsiaTheme="majorEastAsia" w:hAnsi="Aptos" w:cstheme="majorBidi"/>
+          <w:color w:val="0F4761" w:themeColor="accent1" w:themeShade="BF"/>
+          <w:sz w:val="22"/>
+          <w:szCs w:val="40"/>
+        </w:rPr>
+      </w:pPr>
+      <w:r>
+        <w:rPr>
+          <w:rFonts w:ascii="Aptos" w:eastAsiaTheme="majorEastAsia" w:hAnsi="Aptos" w:cstheme="majorBidi"/>
+          <w:color w:val="0F4761" w:themeColor="accent1" w:themeShade="BF"/>
+          <w:sz w:val="22"/>
+          <w:szCs w:val="40"/>
+        </w:rPr>
+        <w:t>6. Open the browser dashboard</w:t>
+      </w:r>
+    </w:p>
+    <w:p>
+      <w:pPr>
+        <w:spacing w:after="120"/>
+        <w:rPr>
+          <w:rFonts w:ascii="Aptos" w:hAnsi="Aptos"/>
+          <w:sz w:val="22"/>
+        </w:rPr>
+      </w:pPr>
+      <w:r>
+        <w:rPr>
+          <w:rFonts w:ascii="Aptos" w:hAnsi="Aptos"/>
+          <w:sz w:val="22"/>
+        </w:rPr>
+        <w:t>From chat, type:</w:t>
+      </w:r>
+    </w:p>
+    <w:p>
+      <w:pPr>
+        <w:spacing w:after="120"/>
+        <w:ind w:left="360"/>
+        <w:rPr>
+          <w:rFonts w:ascii="Consolas" w:hAnsi="Consolas"/>
+          <w:sz w:val="18"/>
+        </w:rPr>
+      </w:pPr>
+      <w:r>
+        <w:rPr>
+          <w:rFonts w:ascii="Consolas" w:hAnsi="Consolas"/>
+          <w:sz w:val="18"/>
+        </w:rPr>
+        <w:t>start dashboard</w:t>
+      </w:r>
+    </w:p>
+    <w:p>
+      <w:pPr>
+        <w:spacing w:after="120"/>
+        <w:rPr>
+          <w:rFonts w:ascii="Aptos" w:hAnsi="Aptos"/>
+          <w:sz w:val="22"/>
+        </w:rPr>
+      </w:pPr>
+      <w:r>
+        <w:rPr>
+          <w:rFonts w:ascii="Aptos" w:hAnsi="Aptos"/>
+          <w:sz w:val="22"/>
+        </w:rPr>
+        <w:t>FixLab opens the dashboard for the connected repository. The default URL is http://127.0.0.1:4317; additional repositories use another loopback port.</w:t>
+      </w:r>
+    </w:p>
+    <w:p>
+      <w:pPr>
+        <w:spacing w:after="120"/>
+        <w:rPr>
+          <w:rFonts w:ascii="Aptos" w:eastAsiaTheme="majorEastAsia" w:hAnsi="Aptos" w:cstheme="majorBidi"/>
+          <w:color w:val="0F4761" w:themeColor="accent1" w:themeShade="BF"/>
+          <w:sz w:val="22"/>
+          <w:szCs w:val="40"/>
+        </w:rPr>
+      </w:pPr>
+      <w:r>
+        <w:rPr>
+          <w:rFonts w:ascii="Aptos" w:eastAsiaTheme="majorEastAsia" w:hAnsi="Aptos" w:cstheme="majorBidi"/>
+          <w:color w:val="0F4761" w:themeColor="accent1" w:themeShade="BF"/>
+          <w:sz w:val="22"/>
+          <w:szCs w:val="40"/>
+        </w:rPr>
+        <w:t>7. Add a new bug</w:t>
+      </w:r>
+    </w:p>
+    <w:p>
+      <w:pPr>
+        <w:spacing w:after="120"/>
+        <w:rPr>
+          <w:rFonts w:ascii="Aptos" w:hAnsi="Aptos"/>
+          <w:sz w:val="22"/>
+        </w:rPr>
+      </w:pPr>
+      <w:r>
+        <w:rPr>
+          <w:rFonts w:ascii="Aptos" w:hAnsi="Aptos"/>
+          <w:sz w:val="22"/>
+        </w:rPr>
+        <w:t>Create a separate bug job from chat:</w:t>
+      </w:r>
+    </w:p>
+    <w:p>
+      <w:pPr>
+        <w:spacing w:after="120"/>
+        <w:ind w:left="360"/>
+        <w:rPr>
+          <w:rFonts w:ascii="Consolas" w:hAnsi="Consolas"/>
+          <w:sz w:val="18"/>
+        </w:rPr>
+      </w:pPr>
+      <w:r>
+        <w:rPr>
+          <w:rFonts w:ascii="Consolas" w:hAnsi="Consolas"/>
+          <w:sz w:val="18"/>
+        </w:rPr>
+        <w:lastRenderedPageBreak/>
+        <w:t>new bug Product search returns duplicate rows</w:t>
+      </w:r>
+    </w:p>
+    <w:p>
+      <w:pPr>
+        <w:spacing w:after="120"/>
+        <w:ind w:left="360"/>
+        <w:rPr>
+          <w:rFonts w:ascii="Consolas" w:hAnsi="Consolas"/>
+          <w:sz w:val="18"/>
+        </w:rPr>
+      </w:pPr>
+      <w:r>
+        <w:rPr>
+          <w:rFonts w:ascii="Consolas" w:hAnsi="Consolas"/>
+          <w:sz w:val="18"/>
+        </w:rPr>
+        <w:t>add a bug: Save remains disabled after validation succeeds</w:t>
+      </w:r>
+    </w:p>
+    <w:p>
+      <w:pPr>
+        <w:spacing w:after="120"/>
+        <w:rPr>
+          <w:rFonts w:ascii="Aptos" w:hAnsi="Aptos"/>
+          <w:sz w:val="22"/>
+        </w:rPr>
+      </w:pPr>
+      <w:r>
+        <w:rPr>
+          <w:rFonts w:ascii="Aptos" w:hAnsi="Aptos"/>
+          <w:sz w:val="22"/>
+        </w:rPr>
+        <w:t>A new bug starts immediately when FixLab is idle or enters the dashboard queue when another job is active. If the instruction belongs to the current job, type it normally without the new bug prefix.</w:t>
+      </w:r>
+    </w:p>
+    <w:p>
+      <w:pPr>
+        <w:pStyle w:val="Heading2"/>
+        <w:spacing w:after="120"/>
+        <w:rPr>
+          <w:rFonts w:ascii="Aptos" w:hAnsi="Aptos"/>
+          <w:sz w:val="22"/>
+        </w:rPr>
+      </w:pPr>
+      <w:r>
+        <w:rPr>
+          <w:rFonts w:ascii="Aptos" w:hAnsi="Aptos"/>
+          <w:sz w:val="22"/>
+        </w:rPr>
+        <w:t>UI bug example</w:t>
+      </w:r>
+    </w:p>
+    <w:p>
+      <w:pPr>
+        <w:spacing w:after="120"/>
+        <w:ind w:left="360"/>
+        <w:rPr>
+          <w:rFonts w:ascii="Consolas" w:hAnsi="Consolas"/>
+          <w:sz w:val="18"/>
+        </w:rPr>
+      </w:pPr>
+      <w:r>
+        <w:rPr>
+          <w:rFonts w:ascii="Consolas" w:hAnsi="Consolas"/>
+          <w:sz w:val="18"/>
+        </w:rPr>
+        <w:t>new bug The Product Hierarchy Excel template is missing PFAM formatting. Reproduce the React UI issue, make the smallest fix, run focused tests, lint, type-check and build, start the required applications, validate with Playwright, capture non-sensitive evidence, and create or update the PR.</w:t>
+      </w:r>
+    </w:p>
+    <w:p>
+      <w:pPr>
+        <w:pStyle w:val="Heading2"/>
+        <w:spacing w:after="120"/>
+        <w:rPr>
+          <w:rFonts w:ascii="Aptos" w:hAnsi="Aptos"/>
+          <w:sz w:val="22"/>
+        </w:rPr>
+      </w:pPr>
+      <w:r>
+        <w:rPr>
+          <w:rFonts w:ascii="Aptos" w:hAnsi="Aptos"/>
+          <w:sz w:val="22"/>
+        </w:rPr>
+        <w:t>API bug example</w:t>
+      </w:r>
+    </w:p>
+    <w:p>
+      <w:pPr>
+        <w:spacing w:after="120"/>
+        <w:ind w:left="360"/>
+        <w:rPr>
+          <w:rFonts w:ascii="Consolas" w:hAnsi="Consolas"/>
+          <w:sz w:val="18"/>
+        </w:rPr>
+      </w:pPr>
+      <w:r>
+        <w:rPr>
+          <w:rFonts w:ascii="Consolas" w:hAnsi="Consolas"/>
+          <w:sz w:val="18"/>
+        </w:rPr>
+        <w:t>new bug The create request API returns the wrong status for invalid hierarchy input. Reproduce it with the smallest safe API test, identify the .NET validation path, make the smallest fix, run focused .NET tests and build, start the backend when runtime validation is required, verify the HTTP response, and create or update the PR.</w:t>
+      </w:r>
+    </w:p>
+    <w:p>
+      <w:pPr>
+        <w:pStyle w:val="Heading2"/>
+        <w:spacing w:after="120"/>
+        <w:rPr>
+          <w:rFonts w:ascii="Aptos" w:hAnsi="Aptos"/>
+          <w:sz w:val="22"/>
+        </w:rPr>
+      </w:pPr>
+      <w:r>
+        <w:rPr>
+          <w:rFonts w:ascii="Aptos" w:hAnsi="Aptos"/>
+          <w:sz w:val="22"/>
+        </w:rPr>
+        <w:t>End-to-end UI and API example</w:t>
+      </w:r>
+    </w:p>
+    <w:p>
+      <w:pPr>
+        <w:spacing w:after="120"/>
+        <w:ind w:left="360"/>
+        <w:rPr>
+          <w:rFonts w:ascii="Consolas" w:hAnsi="Consolas"/>
+          <w:sz w:val="18"/>
+        </w:rPr>
+      </w:pPr>
+      <w:r>
+        <w:rPr>
+          <w:rFonts w:ascii="Consolas" w:hAnsi="Consolas"/>
+          <w:sz w:val="18"/>
+        </w:rPr>
+        <w:t>new bug Fix this React workflow end to end. If it depends on the .NET API, restore, build, and start the backend automatically before Playwright. Verify both the API and UI behavior, capture evidence, and create or update the PR.</w:t>
+      </w:r>
+    </w:p>
+    <w:p>
+      <w:pPr>
+        <w:spacing w:after="120"/>
+        <w:rPr>
+          <w:rFonts w:ascii="Aptos" w:eastAsiaTheme="majorEastAsia" w:hAnsi="Aptos" w:cstheme="majorBidi"/>
+          <w:color w:val="0F4761" w:themeColor="accent1" w:themeShade="BF"/>
+          <w:sz w:val="22"/>
+          <w:szCs w:val="40"/>
+        </w:rPr>
+      </w:pPr>
+      <w:r>
+        <w:rPr>
+          <w:rFonts w:ascii="Aptos" w:eastAsiaTheme="majorEastAsia" w:hAnsi="Aptos" w:cstheme="majorBidi"/>
+          <w:color w:val="0F4761" w:themeColor="accent1" w:themeShade="BF"/>
+          <w:sz w:val="22"/>
+          <w:szCs w:val="40"/>
+        </w:rPr>
+        <w:t>8. End-to-end FixLab lifecycle</w:t>
+      </w:r>
+    </w:p>
+    <w:p>
+      <w:pPr>
+        <w:spacing w:after="120"/>
+        <w:rPr>
+          <w:rFonts w:ascii="Aptos" w:hAnsi="Aptos"/>
+          <w:sz w:val="22"/>
+        </w:rPr>
+      </w:pPr>
+      <w:r>
+        <w:rPr>
+          <w:rFonts w:ascii="Aptos" w:hAnsi="Aptos"/>
+          <w:sz w:val="22"/>
+        </w:rPr>
+        <w:t>FixLab should complete and report these stages:</w:t>
+      </w:r>
+    </w:p>
+    <w:p>
+      <w:pPr>
+        <w:spacing w:after="120"/>
+        <w:rPr>
+          <w:rFonts w:ascii="Aptos" w:hAnsi="Aptos"/>
+          <w:sz w:val="22"/>
+        </w:rPr>
+      </w:pPr>
+      <w:r>
+        <w:rPr>
+          <w:rFonts w:ascii="Aptos" w:hAnsi="Aptos"/>
+          <w:sz w:val="22"/>
+        </w:rPr>
+        <w:t>- Intake: define the measurable bug or enhancement contract.</w:t>
+      </w:r>
+    </w:p>
+    <w:p>
+      <w:pPr>
+        <w:spacing w:after="120"/>
+        <w:rPr>
+          <w:rFonts w:ascii="Aptos" w:hAnsi="Aptos"/>
+          <w:sz w:val="22"/>
+        </w:rPr>
+      </w:pPr>
+      <w:r>
+        <w:rPr>
+          <w:rFonts w:ascii="Aptos" w:hAnsi="Aptos"/>
+          <w:sz w:val="22"/>
+        </w:rPr>
+        <w:t>- Diagnosis: identify the affected frontend, backend, configuration, or external boundary.</w:t>
+      </w:r>
+    </w:p>
+    <w:p>
+      <w:pPr>
+        <w:spacing w:after="120"/>
+        <w:rPr>
+          <w:rFonts w:ascii="Aptos" w:hAnsi="Aptos"/>
+          <w:sz w:val="22"/>
+        </w:rPr>
+      </w:pPr>
+      <w:r>
+        <w:rPr>
+          <w:rFonts w:ascii="Aptos" w:hAnsi="Aptos"/>
+          <w:sz w:val="22"/>
+        </w:rPr>
+        <w:t>- Reproduce: demonstrate the original problem or establish a precise failing check.</w:t>
+      </w:r>
+    </w:p>
+    <w:p>
+      <w:pPr>
+        <w:spacing w:after="120"/>
+        <w:rPr>
+          <w:rFonts w:ascii="Aptos" w:hAnsi="Aptos"/>
+          <w:sz w:val="22"/>
+        </w:rPr>
+      </w:pPr>
+      <w:r>
+        <w:rPr>
+          <w:rFonts w:ascii="Aptos" w:hAnsi="Aptos"/>
+          <w:sz w:val="22"/>
+        </w:rPr>
+        <w:t>- Fix: make the smallest complete change and preserve unrelated work.</w:t>
+      </w:r>
+    </w:p>
+    <w:p>
+      <w:pPr>
+        <w:spacing w:after="120"/>
+        <w:rPr>
+          <w:rFonts w:ascii="Aptos" w:hAnsi="Aptos"/>
+          <w:sz w:val="22"/>
+        </w:rPr>
+      </w:pPr>
+      <w:r>
+        <w:rPr>
+          <w:rFonts w:ascii="Aptos" w:hAnsi="Aptos"/>
+          <w:sz w:val="22"/>
+        </w:rPr>
+        <w:t>- Review: inspect the effective diff and exclude generated or sensitive artifacts.</w:t>
+      </w:r>
+    </w:p>
+    <w:p>
+      <w:pPr>
+        <w:spacing w:after="120"/>
+        <w:rPr>
+          <w:rFonts w:ascii="Aptos" w:hAnsi="Aptos"/>
+          <w:sz w:val="22"/>
+        </w:rPr>
+      </w:pPr>
+      <w:r>
+        <w:rPr>
+          <w:rFonts w:ascii="Aptos" w:hAnsi="Aptos"/>
+          <w:sz w:val="22"/>
+        </w:rPr>
+        <w:t>- Local stack: run focused tests, lint, type-check, builds, and required application startup.</w:t>
+      </w:r>
+    </w:p>
+    <w:p>
+      <w:pPr>
+        <w:spacing w:after="120"/>
+        <w:rPr>
+          <w:rFonts w:ascii="Aptos" w:hAnsi="Aptos"/>
+          <w:sz w:val="22"/>
+        </w:rPr>
+      </w:pPr>
+      <w:r>
+        <w:rPr>
+          <w:rFonts w:ascii="Aptos" w:hAnsi="Aptos"/>
+          <w:sz w:val="22"/>
+        </w:rPr>
+        <w:t>- Live test: validate the required UI journey or API behavior with safe data.</w:t>
+      </w:r>
+    </w:p>
+    <w:p>
+      <w:pPr>
+        <w:spacing w:after="120"/>
+        <w:rPr>
+          <w:rFonts w:ascii="Aptos" w:hAnsi="Aptos"/>
+          <w:sz w:val="22"/>
+        </w:rPr>
+      </w:pPr>
+      <w:r>
+        <w:rPr>
+          <w:rFonts w:ascii="Aptos" w:hAnsi="Aptos"/>
+          <w:sz w:val="22"/>
+        </w:rPr>
+        <w:t>- Pull request: commit, push, create or update the authorized PR, and report validation evidence.</w:t>
+      </w:r>
+    </w:p>
+    <w:p>
+      <w:pPr>
+        <w:spacing w:after="120"/>
+        <w:rPr>
+          <w:rFonts w:ascii="Aptos" w:eastAsiaTheme="majorEastAsia" w:hAnsi="Aptos" w:cstheme="majorBidi"/>
+          <w:color w:val="0F4761" w:themeColor="accent1" w:themeShade="BF"/>
+          <w:sz w:val="22"/>
+          <w:szCs w:val="40"/>
+        </w:rPr>
+      </w:pPr>
+      <w:r>
+        <w:rPr>
+          <w:rFonts w:ascii="Aptos" w:eastAsiaTheme="majorEastAsia" w:hAnsi="Aptos" w:cstheme="majorBidi"/>
+          <w:color w:val="0F4761" w:themeColor="accent1" w:themeShade="BF"/>
+          <w:sz w:val="22"/>
+          <w:szCs w:val="40"/>
+        </w:rPr>
+        <w:t>9. Pull request creation</w:t>
+      </w:r>
+    </w:p>
+    <w:p>
+      <w:pPr>
+        <w:spacing w:after="120"/>
+        <w:rPr>
+          <w:rFonts w:ascii="Aptos" w:hAnsi="Aptos"/>
+          <w:sz w:val="22"/>
+        </w:rPr>
+      </w:pPr>
+      <w:r>
+        <w:rPr>
+          <w:rFonts w:ascii="Aptos" w:hAnsi="Aptos"/>
+          <w:sz w:val="22"/>
+        </w:rPr>
+        <w:t>Include PR creation in the bug request when code changes are expected:</w:t>
+      </w:r>
+    </w:p>
+    <w:p>
+      <w:pPr>
+        <w:spacing w:after="120"/>
+        <w:ind w:left="360"/>
+        <w:rPr>
+          <w:rFonts w:ascii="Consolas" w:hAnsi="Consolas"/>
+          <w:sz w:val="18"/>
+        </w:rPr>
+      </w:pPr>
+      <w:r>
+        <w:rPr>
+          <w:rFonts w:ascii="Consolas" w:hAnsi="Consolas"/>
+          <w:sz w:val="18"/>
+        </w:rPr>
+        <w:t>Finish the required validation and create or update the pull request using my authorized developer account. Do not stop after local validation.</w:t>
+      </w:r>
+    </w:p>
+    <w:p>
+      <w:pPr>
+        <w:spacing w:after="120"/>
+        <w:rPr>
+          <w:rFonts w:ascii="Aptos" w:hAnsi="Aptos"/>
+          <w:sz w:val="22"/>
+        </w:rPr>
+      </w:pPr>
+      <w:r>
+        <w:rPr>
+          <w:rFonts w:ascii="Aptos" w:hAnsi="Aptos"/>
+          <w:sz w:val="22"/>
+        </w:rPr>
+        <w:t>Check progress from chat:</w:t>
+      </w:r>
+    </w:p>
+    <w:p>
+      <w:pPr>
+        <w:spacing w:after="120"/>
+        <w:ind w:left="360"/>
+        <w:rPr>
+          <w:rFonts w:ascii="Consolas" w:hAnsi="Consolas"/>
+          <w:sz w:val="18"/>
+        </w:rPr>
+      </w:pPr>
+      <w:r>
+        <w:rPr>
+          <w:rFonts w:ascii="Consolas" w:hAnsi="Consolas"/>
+          <w:sz w:val="18"/>
+        </w:rPr>
+        <w:t>show pull request</w:t>
+      </w:r>
+    </w:p>
+    <w:p>
+      <w:pPr>
+        <w:spacing w:after="120"/>
+        <w:ind w:left="360"/>
+        <w:rPr>
+          <w:rFonts w:ascii="Consolas" w:hAnsi="Consolas"/>
+          <w:sz w:val="18"/>
+        </w:rPr>
+      </w:pPr>
+      <w:r>
+        <w:rPr>
+          <w:rFonts w:ascii="Consolas" w:hAnsi="Consolas"/>
+          <w:sz w:val="18"/>
+        </w:rPr>
+        <w:t>show status</w:t>
+      </w:r>
+    </w:p>
+    <w:p>
+      <w:pPr>
+        <w:spacing w:after="120"/>
+        <w:rPr>
+          <w:rFonts w:ascii="Aptos" w:hAnsi="Aptos"/>
+          <w:sz w:val="22"/>
+        </w:rPr>
+      </w:pPr>
+      <w:r>
+        <w:rPr>
+          <w:rFonts w:ascii="Aptos" w:hAnsi="Aptos"/>
+          <w:sz w:val="22"/>
+        </w:rPr>
+        <w:lastRenderedPageBreak/>
+        <w:t>Validation-only mode must not edit source, commit, push, or change the pull request.</w:t>
+      </w:r>
+    </w:p>
+    <w:p>
+      <w:pPr>
+        <w:spacing w:after="120"/>
+        <w:rPr>
+          <w:rFonts w:ascii="Aptos" w:eastAsiaTheme="majorEastAsia" w:hAnsi="Aptos" w:cstheme="majorBidi"/>
+          <w:color w:val="0F4761" w:themeColor="accent1" w:themeShade="BF"/>
+          <w:sz w:val="22"/>
+          <w:szCs w:val="40"/>
+        </w:rPr>
+      </w:pPr>
+      <w:r>
+        <w:rPr>
+          <w:rFonts w:ascii="Aptos" w:eastAsiaTheme="majorEastAsia" w:hAnsi="Aptos" w:cstheme="majorBidi"/>
+          <w:color w:val="0F4761" w:themeColor="accent1" w:themeShade="BF"/>
+          <w:sz w:val="22"/>
+          <w:szCs w:val="40"/>
+        </w:rPr>
+        <w:t>10. Keep localhost running for manual testing</w:t>
+      </w:r>
+    </w:p>
+    <w:p>
+      <w:pPr>
+        <w:spacing w:after="120"/>
+        <w:rPr>
+          <w:rFonts w:ascii="Aptos" w:hAnsi="Aptos"/>
+          <w:sz w:val="22"/>
+        </w:rPr>
+      </w:pPr>
+      <w:r>
+        <w:rPr>
+          <w:rFonts w:ascii="Aptos" w:hAnsi="Aptos"/>
+          <w:sz w:val="22"/>
+        </w:rPr>
+        <w:t>By default, FixLab stops only the frontend and backend processes it started when the job finishes. To keep them available, say:</w:t>
+      </w:r>
+    </w:p>
+    <w:p>
+      <w:pPr>
+        <w:spacing w:after="120"/>
+        <w:ind w:left="360"/>
+        <w:rPr>
+          <w:rFonts w:ascii="Consolas" w:hAnsi="Consolas"/>
+          <w:sz w:val="18"/>
+        </w:rPr>
+      </w:pPr>
+      <w:r>
+        <w:rPr>
+          <w:rFonts w:ascii="Consolas" w:hAnsi="Consolas"/>
+          <w:sz w:val="18"/>
+        </w:rPr>
+        <w:t>Keep the frontend localhost running with hot reload after validation so I can test it manually. If the UI requires the .NET backend, keep that FixLab-owned backend running too until I confirm testing is complete.</w:t>
+      </w:r>
+    </w:p>
+    <w:p>
+      <w:pPr>
+        <w:spacing w:after="120"/>
+        <w:rPr>
+          <w:rFonts w:ascii="Aptos" w:hAnsi="Aptos"/>
+          <w:sz w:val="22"/>
+        </w:rPr>
+      </w:pPr>
+      <w:r>
+        <w:rPr>
+          <w:rFonts w:ascii="Aptos" w:hAnsi="Aptos"/>
+          <w:sz w:val="22"/>
+        </w:rPr>
+        <w:t>The dashboard also provides Hold after Playwright for manual local testing.</w:t>
+      </w:r>
+    </w:p>
+    <w:p>
+      <w:pPr>
+        <w:spacing w:after="120"/>
+        <w:ind w:left="360"/>
+        <w:rPr>
+          <w:rFonts w:ascii="Aptos" w:eastAsiaTheme="majorEastAsia" w:hAnsi="Aptos" w:cstheme="majorBidi"/>
+          <w:color w:val="0F4761" w:themeColor="accent1" w:themeShade="BF"/>
+          <w:sz w:val="22"/>
+          <w:szCs w:val="40"/>
+        </w:rPr>
+      </w:pPr>
+      <w:r>
+        <w:rPr>
+          <w:rFonts w:ascii="Aptos" w:eastAsiaTheme="majorEastAsia" w:hAnsi="Aptos" w:cstheme="majorBidi"/>
+          <w:color w:val="0F4761" w:themeColor="accent1" w:themeShade="BF"/>
+          <w:sz w:val="22"/>
+          <w:szCs w:val="40"/>
+        </w:rPr>
+        <w:t>11. Recover an interrupted job</w:t>
+      </w:r>
+    </w:p>
+    <w:p>
+      <w:pPr>
+        <w:spacing w:after="120"/>
+        <w:ind w:left="360"/>
+        <w:rPr>
+          <w:rFonts w:ascii="Consolas" w:hAnsi="Consolas"/>
+          <w:sz w:val="18"/>
+        </w:rPr>
+      </w:pPr>
+      <w:r>
+        <w:rPr>
+          <w:rFonts w:ascii="Consolas" w:hAnsi="Consolas"/>
+          <w:sz w:val="18"/>
+        </w:rPr>
+        <w:t>Continue the same job, preserve existing changes, finish all required validation, and create or update the PR.</w:t>
+      </w:r>
+    </w:p>
+    <w:p>
+      <w:pPr>
+        <w:spacing w:after="120"/>
+        <w:rPr>
+          <w:rFonts w:ascii="Aptos" w:hAnsi="Aptos"/>
+          <w:sz w:val="22"/>
+        </w:rPr>
+      </w:pPr>
+      <w:r>
+        <w:rPr>
+          <w:rFonts w:ascii="Aptos" w:hAnsi="Aptos"/>
+          <w:sz w:val="22"/>
+        </w:rPr>
+        <w:t>Use retry only when the current executor cannot safely resume. FixLab must preserve the worktree and must not discard prior changes.</w:t>
+      </w:r>
+    </w:p>
+    <w:p>
+      <w:pPr>
+        <w:spacing w:after="120"/>
+        <w:rPr>
+          <w:rFonts w:ascii="Aptos" w:eastAsiaTheme="majorEastAsia" w:hAnsi="Aptos" w:cstheme="majorBidi"/>
+          <w:color w:val="0F4761" w:themeColor="accent1" w:themeShade="BF"/>
+          <w:sz w:val="22"/>
+          <w:szCs w:val="40"/>
+        </w:rPr>
+      </w:pPr>
+      <w:r>
+        <w:rPr>
+          <w:rFonts w:ascii="Aptos" w:eastAsiaTheme="majorEastAsia" w:hAnsi="Aptos" w:cstheme="majorBidi"/>
+          <w:color w:val="0F4761" w:themeColor="accent1" w:themeShade="BF"/>
+          <w:sz w:val="22"/>
+          <w:szCs w:val="40"/>
+        </w:rPr>
+        <w:t>12. Expected completion evidence</w:t>
+      </w:r>
+    </w:p>
+    <w:p>
+      <w:pPr>
+        <w:spacing w:after="120"/>
+        <w:rPr>
+          <w:rFonts w:ascii="Aptos" w:hAnsi="Aptos"/>
+          <w:sz w:val="22"/>
+        </w:rPr>
+      </w:pPr>
+      <w:r>
+        <w:rPr>
+          <w:rFonts w:ascii="Aptos" w:hAnsi="Aptos"/>
+          <w:sz w:val="22"/>
+        </w:rPr>
+        <w:t>- Focused tests and required build/type-check results.</w:t>
+      </w:r>
+    </w:p>
+    <w:p>
+      <w:pPr>
+        <w:spacing w:after="120"/>
+        <w:rPr>
+          <w:rFonts w:ascii="Aptos" w:hAnsi="Aptos"/>
+          <w:sz w:val="22"/>
+        </w:rPr>
+      </w:pPr>
+      <w:r>
+        <w:rPr>
+          <w:rFonts w:ascii="Aptos" w:hAnsi="Aptos"/>
+          <w:sz w:val="22"/>
+        </w:rPr>
+        <w:t>- Explicit pass, failure, skipped, blocked, or timeout status for every required gate.</w:t>
+      </w:r>
+    </w:p>
+    <w:p>
+      <w:pPr>
+        <w:spacing w:after="120"/>
+        <w:rPr>
+          <w:rFonts w:ascii="Aptos" w:hAnsi="Aptos"/>
+          <w:sz w:val="22"/>
+        </w:rPr>
+      </w:pPr>
+      <w:r>
+        <w:rPr>
+          <w:rFonts w:ascii="Aptos" w:hAnsi="Aptos"/>
+          <w:sz w:val="22"/>
+        </w:rPr>
+        <w:t>- Non-sensitive Playwright screenshots or API assertions when required.</w:t>
+      </w:r>
+    </w:p>
+    <w:p>
+      <w:pPr>
+        <w:spacing w:after="120"/>
+        <w:rPr>
+          <w:rFonts w:ascii="Aptos" w:hAnsi="Aptos"/>
+          <w:sz w:val="22"/>
+        </w:rPr>
+      </w:pPr>
+      <w:r>
+        <w:rPr>
+          <w:rFonts w:ascii="Aptos" w:hAnsi="Aptos"/>
+          <w:sz w:val="22"/>
+        </w:rPr>
+        <w:t>- The branch, commit, pull-request URL or number, and remote policy status when available.</w:t>
+      </w:r>
+    </w:p>
+    <w:p>
+      <w:pPr>
+        <w:spacing w:after="120"/>
+        <w:rPr>
+          <w:rFonts w:ascii="Aptos" w:hAnsi="Aptos"/>
+          <w:sz w:val="22"/>
+        </w:rPr>
+      </w:pPr>
+      <w:r>
+        <w:rPr>
+          <w:rFonts w:ascii="Aptos" w:hAnsi="Aptos"/>
+          <w:sz w:val="22"/>
+        </w:rPr>
+        <w:t>- No unrelated files, credentials, authenticated browser state, or temporary generated tests in the product PR.</w:t>
+      </w:r>
+    </w:p>
+    <w:p>
+      <w:pPr>
+        <w:spacing w:after="120"/>
+        <w:rPr>
+          <w:rFonts w:ascii="Aptos" w:eastAsiaTheme="majorEastAsia" w:hAnsi="Aptos" w:cstheme="majorBidi"/>
+          <w:color w:val="0F4761" w:themeColor="accent1" w:themeShade="BF"/>
+          <w:sz w:val="22"/>
+          <w:szCs w:val="40"/>
+        </w:rPr>
+      </w:pPr>
+      <w:r>
+        <w:rPr>
+          <w:rFonts w:ascii="Aptos" w:eastAsiaTheme="majorEastAsia" w:hAnsi="Aptos" w:cstheme="majorBidi"/>
+          <w:color w:val="0F4761" w:themeColor="accent1" w:themeShade="BF"/>
+          <w:sz w:val="22"/>
+          <w:szCs w:val="40"/>
+        </w:rPr>
+        <w:t>13. Troubleshooting</w:t>
+      </w:r>
+    </w:p>
+    <w:p>
+      <w:pPr>
+        <w:spacing w:after="120"/>
+        <w:rPr>
+          <w:rFonts w:ascii="Aptos" w:hAnsi="Aptos"/>
+          <w:sz w:val="22"/>
+        </w:rPr>
+      </w:pPr>
+      <w:r>
+        <w:rPr>
+          <w:rFonts w:ascii="Aptos" w:hAnsi="Aptos"/>
+          <w:sz w:val="22"/>
+        </w:rPr>
+        <w:t>- fixlab is not recognized: reopen PowerShell and verify the npm global binary directory is on PATH.</w:t>
+      </w:r>
+    </w:p>
+    <w:p>
+      <w:pPr>
+        <w:spacing w:after="120"/>
+        <w:rPr>
+          <w:rFonts w:ascii="Aptos" w:hAnsi="Aptos"/>
+          <w:sz w:val="22"/>
+        </w:rPr>
+      </w:pPr>
+      <w:r>
+        <w:rPr>
+          <w:rFonts w:ascii="Aptos" w:hAnsi="Aptos"/>
+          <w:sz w:val="22"/>
+        </w:rPr>
+        <w:t>- Chat connects to the wrong repository: enter another path at startup or type switch repository.</w:t>
+      </w:r>
+    </w:p>
+    <w:p>
+      <w:pPr>
+        <w:spacing w:after="120"/>
+        <w:rPr>
+          <w:rFonts w:ascii="Aptos" w:hAnsi="Aptos"/>
+          <w:sz w:val="22"/>
+        </w:rPr>
+      </w:pPr>
+      <w:r>
+        <w:rPr>
+          <w:rFonts w:ascii="Aptos" w:hAnsi="Aptos"/>
+          <w:sz w:val="22"/>
+        </w:rPr>
+        <w:t>- Input is overwritten by logs: update FixLab and restart chat. Current versions buffer dashboard activity while text is being entered and display it after submission.</w:t>
+      </w:r>
+    </w:p>
+    <w:p>
+      <w:pPr>
+        <w:spacing w:after="120"/>
+        <w:rPr>
+          <w:rFonts w:ascii="Aptos" w:hAnsi="Aptos"/>
+          <w:sz w:val="22"/>
+        </w:rPr>
+      </w:pPr>
+      <w:r>
+        <w:rPr>
+          <w:rFonts w:ascii="Aptos" w:hAnsi="Aptos"/>
+          <w:sz w:val="22"/>
+        </w:rPr>
+        <w:t>- A separate bug became a comment: use new bug &lt;details&gt; or add a bug: &lt;details&gt;.</w:t>
+      </w:r>
+    </w:p>
+    <w:p>
+      <w:pPr>
+        <w:spacing w:after="120"/>
+        <w:rPr>
+          <w:rFonts w:ascii="Aptos" w:hAnsi="Aptos"/>
+          <w:sz w:val="22"/>
+        </w:rPr>
+      </w:pPr>
+      <w:r>
+        <w:rPr>
+          <w:rFonts w:ascii="Aptos" w:hAnsi="Aptos"/>
+          <w:sz w:val="22"/>
+        </w:rPr>
+        <w:t>- Repository is not ready: complete conversational onboarding and approve only reviewed repository-owned setup commands.</w:t>
+      </w:r>
+    </w:p>
+    <w:p>
+      <w:pPr>
+        <w:spacing w:after="120"/>
+        <w:rPr>
+          <w:rFonts w:ascii="Aptos" w:hAnsi="Aptos"/>
+          <w:sz w:val="22"/>
+        </w:rPr>
+      </w:pPr>
+      <w:r>
+        <w:rPr>
+          <w:rFonts w:ascii="Aptos" w:hAnsi="Aptos"/>
+          <w:sz w:val="22"/>
+        </w:rPr>
+        <w:t>- Playwright is unavailable: configure and approve the repository-local Playwright setup.</w:t>
+      </w:r>
+    </w:p>
+    <w:p>
+      <w:pPr>
+        <w:spacing w:after="120"/>
+        <w:rPr>
+          <w:rFonts w:ascii="Aptos" w:hAnsi="Aptos"/>
+          <w:sz w:val="22"/>
+        </w:rPr>
+      </w:pPr>
+      <w:r>
+        <w:rPr>
+          <w:rFonts w:ascii="Aptos" w:hAnsi="Aptos"/>
+          <w:sz w:val="22"/>
+        </w:rPr>
+        <w:t>- Never switch automatically to production or bypass authentication and data-safety controls.</w:t>
+      </w:r>
+    </w:p>
+    <w:p>
+      <w:pPr>
         <w:pStyle w:val="Heading1"/>
         <w:spacing w:after="120"/>
         <w:rPr>
@@ -632,1006 +1864,6 @@
           <w:rFonts w:ascii="Aptos" w:hAnsi="Aptos"/>
           <w:sz w:val="22"/>
         </w:rPr>
-        <w:t>4. Onboard a React frontend and .NET backend</w:t>
-      </w:r>
-    </w:p>
-    <w:p>
-      <w:pPr>
-        <w:spacing w:after="120"/>
-        <w:rPr>
-          <w:rFonts w:ascii="Aptos" w:hAnsi="Aptos"/>
-          <w:sz w:val="22"/>
-        </w:rPr>
-      </w:pPr>
-      <w:r>
-        <w:rPr>
-          <w:rFonts w:ascii="Aptos" w:hAnsi="Aptos"/>
-          <w:sz w:val="22"/>
-        </w:rPr>
-        <w:t>For a new or incomplete repository, ask chat:</w:t>
-      </w:r>
-    </w:p>
-    <w:p>
-      <w:pPr>
-        <w:spacing w:after="120"/>
-        <w:ind w:left="360"/>
-        <w:rPr>
-          <w:rFonts w:ascii="Consolas" w:hAnsi="Consolas"/>
-          <w:sz w:val="18"/>
-        </w:rPr>
-      </w:pPr>
-      <w:r>
-        <w:rPr>
-          <w:rFonts w:ascii="Consolas" w:hAnsi="Consolas"/>
-          <w:sz w:val="18"/>
-        </w:rPr>
-        <w:t>Onboard this repository for FixLab. Inspect the React frontend and .NET backend, reuse existing repository commands, configure restore, test, lint, build, startup, ports, health checks, Playwright, authentication, safe environments, and pull-request settings. Explain missing configuration and ask before running setup commands, then run doctor.</w:t>
-      </w:r>
-    </w:p>
-    <w:p>
-      <w:pPr>
-        <w:spacing w:after="120"/>
-        <w:rPr>
-          <w:rFonts w:ascii="Aptos" w:hAnsi="Aptos"/>
-          <w:sz w:val="22"/>
-        </w:rPr>
-      </w:pPr>
-      <w:r>
-        <w:rPr>
-          <w:rFonts w:ascii="Aptos" w:hAnsi="Aptos"/>
-          <w:sz w:val="22"/>
-        </w:rPr>
-        <w:t>FixLab inspects repository-owned files such as package.json, lockfiles, solution and project files, global.json, launchSettings.json, Playwright configuration, CI definitions, local-development documentation, and repository instructions.</w:t>
-      </w:r>
-    </w:p>
-    <w:p>
-      <w:pPr>
-        <w:spacing w:after="120"/>
-        <w:rPr>
-          <w:rFonts w:ascii="Aptos" w:hAnsi="Aptos"/>
-          <w:sz w:val="22"/>
-        </w:rPr>
-      </w:pPr>
-      <w:r>
-        <w:rPr>
-          <w:rFonts w:ascii="Aptos" w:hAnsi="Aptos"/>
-          <w:sz w:val="22"/>
-        </w:rPr>
-        <w:t>- Frontend-only repository: configure only the React application and do not invent a backend.</w:t>
-      </w:r>
-    </w:p>
-    <w:p>
-      <w:pPr>
-        <w:spacing w:after="120"/>
-        <w:rPr>
-          <w:rFonts w:ascii="Aptos" w:hAnsi="Aptos"/>
-          <w:sz w:val="22"/>
-        </w:rPr>
-      </w:pPr>
-      <w:r>
-        <w:rPr>
-          <w:rFonts w:ascii="Aptos" w:hAnsi="Aptos"/>
-          <w:sz w:val="22"/>
-        </w:rPr>
-        <w:t>- Combined repository: configure frontend and backend commands independently.</w:t>
-      </w:r>
-    </w:p>
-    <w:p>
-      <w:pPr>
-        <w:spacing w:after="120"/>
-        <w:rPr>
-          <w:rFonts w:ascii="Aptos" w:hAnsi="Aptos"/>
-          <w:sz w:val="22"/>
-        </w:rPr>
-      </w:pPr>
-      <w:r>
-        <w:rPr>
-          <w:rFonts w:ascii="Aptos" w:hAnsi="Aptos"/>
-          <w:sz w:val="22"/>
-        </w:rPr>
-        <w:t>- Separate frontend and backend repositories: onboard each repository separately.</w:t>
-      </w:r>
-    </w:p>
-    <w:p>
-      <w:pPr>
-        <w:spacing w:after="120"/>
-        <w:rPr>
-          <w:rFonts w:ascii="Aptos" w:hAnsi="Aptos"/>
-          <w:sz w:val="22"/>
-        </w:rPr>
-      </w:pPr>
-      <w:r>
-        <w:rPr>
-          <w:rFonts w:ascii="Aptos" w:hAnsi="Aptos"/>
-          <w:sz w:val="22"/>
-        </w:rPr>
-        <w:t>- Never place credentials, tokens, cookies, browser-state contents, customer data, or production endpoints in the FixLab profile.</w:t>
-      </w:r>
-    </w:p>
-    <w:p>
-      <w:pPr>
-        <w:pStyle w:val="Heading1"/>
-        <w:spacing w:after="120"/>
-        <w:rPr>
-          <w:rFonts w:ascii="Aptos" w:hAnsi="Aptos"/>
-          <w:sz w:val="22"/>
-        </w:rPr>
-      </w:pPr>
-      <w:r>
-        <w:rPr>
-          <w:rFonts w:ascii="Aptos" w:hAnsi="Aptos"/>
-          <w:sz w:val="22"/>
-        </w:rPr>
-        <w:t>5. Open the browser dashboard</w:t>
-      </w:r>
-    </w:p>
-    <w:p>
-      <w:pPr>
-        <w:spacing w:after="120"/>
-        <w:rPr>
-          <w:rFonts w:ascii="Aptos" w:hAnsi="Aptos"/>
-          <w:sz w:val="22"/>
-        </w:rPr>
-      </w:pPr>
-      <w:r>
-        <w:rPr>
-          <w:rFonts w:ascii="Aptos" w:hAnsi="Aptos"/>
-          <w:sz w:val="22"/>
-        </w:rPr>
-        <w:t>From chat, type:</w:t>
-      </w:r>
-    </w:p>
-    <w:p>
-      <w:pPr>
-        <w:spacing w:after="120"/>
-        <w:ind w:left="360"/>
-        <w:rPr>
-          <w:rFonts w:ascii="Consolas" w:hAnsi="Consolas"/>
-          <w:sz w:val="18"/>
-        </w:rPr>
-      </w:pPr>
-      <w:r>
-        <w:rPr>
-          <w:rFonts w:ascii="Consolas" w:hAnsi="Consolas"/>
-          <w:sz w:val="18"/>
-        </w:rPr>
-        <w:t>start dashboard</w:t>
-      </w:r>
-    </w:p>
-    <w:p>
-      <w:pPr>
-        <w:spacing w:after="120"/>
-        <w:rPr>
-          <w:rFonts w:ascii="Aptos" w:hAnsi="Aptos"/>
-          <w:sz w:val="22"/>
-        </w:rPr>
-      </w:pPr>
-      <w:r>
-        <w:rPr>
-          <w:rFonts w:ascii="Aptos" w:hAnsi="Aptos"/>
-          <w:sz w:val="22"/>
-        </w:rPr>
-        <w:t>FixLab opens the dashboard for the connected repository. The default URL is http://127.0.0.1:4317; additional repositories use another loopback port.</w:t>
-      </w:r>
-    </w:p>
-    <w:p>
-      <w:pPr>
-        <w:pStyle w:val="Heading1"/>
-        <w:spacing w:after="120"/>
-        <w:rPr>
-          <w:rFonts w:ascii="Aptos" w:hAnsi="Aptos"/>
-          <w:sz w:val="22"/>
-        </w:rPr>
-      </w:pPr>
-      <w:r>
-        <w:rPr>
-          <w:rFonts w:ascii="Aptos" w:hAnsi="Aptos"/>
-          <w:sz w:val="22"/>
-        </w:rPr>
-        <w:t>6. Add a new bug</w:t>
-      </w:r>
-    </w:p>
-    <w:p>
-      <w:pPr>
-        <w:spacing w:after="120"/>
-        <w:rPr>
-          <w:rFonts w:ascii="Aptos" w:hAnsi="Aptos"/>
-          <w:sz w:val="22"/>
-        </w:rPr>
-      </w:pPr>
-      <w:r>
-        <w:rPr>
-          <w:rFonts w:ascii="Aptos" w:hAnsi="Aptos"/>
-          <w:sz w:val="22"/>
-        </w:rPr>
-        <w:t>Create a separate bug job from chat:</w:t>
-      </w:r>
-    </w:p>
-    <w:p>
-      <w:pPr>
-        <w:spacing w:after="120"/>
-        <w:ind w:left="360"/>
-        <w:rPr>
-          <w:rFonts w:ascii="Consolas" w:hAnsi="Consolas"/>
-          <w:sz w:val="18"/>
-        </w:rPr>
-      </w:pPr>
-      <w:r>
-        <w:rPr>
-          <w:rFonts w:ascii="Consolas" w:hAnsi="Consolas"/>
-          <w:sz w:val="18"/>
-        </w:rPr>
-        <w:t>new bug Product search returns duplicate rows</w:t>
-      </w:r>
-    </w:p>
-    <w:p>
-      <w:pPr>
-        <w:spacing w:after="120"/>
-        <w:ind w:left="360"/>
-        <w:rPr>
-          <w:rFonts w:ascii="Consolas" w:hAnsi="Consolas"/>
-          <w:sz w:val="18"/>
-        </w:rPr>
-      </w:pPr>
-      <w:r>
-        <w:rPr>
-          <w:rFonts w:ascii="Consolas" w:hAnsi="Consolas"/>
-          <w:sz w:val="18"/>
-        </w:rPr>
-        <w:t>add a bug: Save remains disabled after validation succeeds</w:t>
-      </w:r>
-    </w:p>
-    <w:p>
-      <w:pPr>
-        <w:spacing w:after="120"/>
-        <w:rPr>
-          <w:rFonts w:ascii="Aptos" w:hAnsi="Aptos"/>
-          <w:sz w:val="22"/>
-        </w:rPr>
-      </w:pPr>
-      <w:r>
-        <w:rPr>
-          <w:rFonts w:ascii="Aptos" w:hAnsi="Aptos"/>
-          <w:sz w:val="22"/>
-        </w:rPr>
-        <w:t>A new bug starts immediately when FixLab is idle or enters the dashboard queue when another job is active. If the instruction belongs to the current job, type it normally without the new bug prefix.</w:t>
-      </w:r>
-    </w:p>
-    <w:p>
-      <w:pPr>
-        <w:pStyle w:val="Heading2"/>
-        <w:spacing w:after="120"/>
-        <w:rPr>
-          <w:rFonts w:ascii="Aptos" w:hAnsi="Aptos"/>
-          <w:sz w:val="22"/>
-        </w:rPr>
-      </w:pPr>
-      <w:r>
-        <w:rPr>
-          <w:rFonts w:ascii="Aptos" w:hAnsi="Aptos"/>
-          <w:sz w:val="22"/>
-        </w:rPr>
-        <w:t>UI bug example</w:t>
-      </w:r>
-    </w:p>
-    <w:p>
-      <w:pPr>
-        <w:spacing w:after="120"/>
-        <w:ind w:left="360"/>
-        <w:rPr>
-          <w:rFonts w:ascii="Consolas" w:hAnsi="Consolas"/>
-          <w:sz w:val="18"/>
-        </w:rPr>
-      </w:pPr>
-      <w:r>
-        <w:rPr>
-          <w:rFonts w:ascii="Consolas" w:hAnsi="Consolas"/>
-          <w:sz w:val="18"/>
-        </w:rPr>
-        <w:t>new bug The Product Hierarchy Excel template is missing PFAM formatting. Reproduce the React UI issue, make the smallest fix, run focused tests, lint, type-check and build, start the required applications, validate with Playwright, capture non-sensitive evidence, and create or update the PR.</w:t>
-      </w:r>
-    </w:p>
-    <w:p>
-      <w:pPr>
-        <w:pStyle w:val="Heading2"/>
-        <w:spacing w:after="120"/>
-        <w:rPr>
-          <w:rFonts w:ascii="Aptos" w:hAnsi="Aptos"/>
-          <w:sz w:val="22"/>
-        </w:rPr>
-      </w:pPr>
-      <w:r>
-        <w:rPr>
-          <w:rFonts w:ascii="Aptos" w:hAnsi="Aptos"/>
-          <w:sz w:val="22"/>
-        </w:rPr>
-        <w:t>API bug example</w:t>
-      </w:r>
-    </w:p>
-    <w:p>
-      <w:pPr>
-        <w:spacing w:after="120"/>
-        <w:ind w:left="360"/>
-        <w:rPr>
-          <w:rFonts w:ascii="Consolas" w:hAnsi="Consolas"/>
-          <w:sz w:val="18"/>
-        </w:rPr>
-      </w:pPr>
-      <w:r>
-        <w:rPr>
-          <w:rFonts w:ascii="Consolas" w:hAnsi="Consolas"/>
-          <w:sz w:val="18"/>
-        </w:rPr>
-        <w:t>new bug The create request API returns the wrong status for invalid hierarchy input. Reproduce it with the smallest safe API test, identify the .NET validation path, make the smallest fix, run focused .NET tests and build, start the backend when runtime validation is required, verify the HTTP response, and create or update the PR.</w:t>
-      </w:r>
-    </w:p>
-    <w:p>
-      <w:pPr>
-        <w:pStyle w:val="Heading2"/>
-        <w:spacing w:after="120"/>
-        <w:rPr>
-          <w:rFonts w:ascii="Aptos" w:hAnsi="Aptos"/>
-          <w:sz w:val="22"/>
-        </w:rPr>
-      </w:pPr>
-      <w:r>
-        <w:rPr>
-          <w:rFonts w:ascii="Aptos" w:hAnsi="Aptos"/>
-          <w:sz w:val="22"/>
-        </w:rPr>
-        <w:t>End-to-end UI and API example</w:t>
-      </w:r>
-    </w:p>
-    <w:p>
-      <w:pPr>
-        <w:spacing w:after="120"/>
-        <w:ind w:left="360"/>
-        <w:rPr>
-          <w:rFonts w:ascii="Consolas" w:hAnsi="Consolas"/>
-          <w:sz w:val="18"/>
-        </w:rPr>
-      </w:pPr>
-      <w:r>
-        <w:rPr>
-          <w:rFonts w:ascii="Consolas" w:hAnsi="Consolas"/>
-          <w:sz w:val="18"/>
-        </w:rPr>
-        <w:t>new bug Fix this React workflow end to end. If it depends on the .NET API, restore, build, and start the backend automatically before Playwright. Verify both the API and UI behavior, capture evidence, and create or update the PR.</w:t>
-      </w:r>
-    </w:p>
-    <w:p>
-      <w:pPr>
-        <w:pStyle w:val="Heading1"/>
-        <w:spacing w:after="120"/>
-        <w:rPr>
-          <w:rFonts w:ascii="Aptos" w:hAnsi="Aptos"/>
-          <w:sz w:val="22"/>
-        </w:rPr>
-      </w:pPr>
-      <w:r>
-        <w:rPr>
-          <w:rFonts w:ascii="Aptos" w:hAnsi="Aptos"/>
-          <w:sz w:val="22"/>
-        </w:rPr>
-        <w:t>7. End-to-end FixLab lifecycle</w:t>
-      </w:r>
-    </w:p>
-    <w:p>
-      <w:pPr>
-        <w:spacing w:after="120"/>
-        <w:rPr>
-          <w:rFonts w:ascii="Aptos" w:hAnsi="Aptos"/>
-          <w:sz w:val="22"/>
-        </w:rPr>
-      </w:pPr>
-      <w:r>
-        <w:rPr>
-          <w:rFonts w:ascii="Aptos" w:hAnsi="Aptos"/>
-          <w:sz w:val="22"/>
-        </w:rPr>
-        <w:t>FixLab should complete and report these stages:</w:t>
-      </w:r>
-    </w:p>
-    <w:p>
-      <w:pPr>
-        <w:spacing w:after="120"/>
-        <w:rPr>
-          <w:rFonts w:ascii="Aptos" w:hAnsi="Aptos"/>
-          <w:sz w:val="22"/>
-        </w:rPr>
-      </w:pPr>
-      <w:r>
-        <w:rPr>
-          <w:rFonts w:ascii="Aptos" w:hAnsi="Aptos"/>
-          <w:sz w:val="22"/>
-        </w:rPr>
-        <w:t>- Intake: define the measurable bug or enhancement contract.</w:t>
-      </w:r>
-    </w:p>
-    <w:p>
-      <w:pPr>
-        <w:spacing w:after="120"/>
-        <w:rPr>
-          <w:rFonts w:ascii="Aptos" w:hAnsi="Aptos"/>
-          <w:sz w:val="22"/>
-        </w:rPr>
-      </w:pPr>
-      <w:r>
-        <w:rPr>
-          <w:rFonts w:ascii="Aptos" w:hAnsi="Aptos"/>
-          <w:sz w:val="22"/>
-        </w:rPr>
-        <w:t>- Diagnosis: identify the affected frontend, backend, configuration, or external boundary.</w:t>
-      </w:r>
-    </w:p>
-    <w:p>
-      <w:pPr>
-        <w:spacing w:after="120"/>
-        <w:rPr>
-          <w:rFonts w:ascii="Aptos" w:hAnsi="Aptos"/>
-          <w:sz w:val="22"/>
-        </w:rPr>
-      </w:pPr>
-      <w:r>
-        <w:rPr>
-          <w:rFonts w:ascii="Aptos" w:hAnsi="Aptos"/>
-          <w:sz w:val="22"/>
-        </w:rPr>
-        <w:t>- Reproduce: demonstrate the original problem or establish a precise failing check.</w:t>
-      </w:r>
-    </w:p>
-    <w:p>
-      <w:pPr>
-        <w:spacing w:after="120"/>
-        <w:rPr>
-          <w:rFonts w:ascii="Aptos" w:hAnsi="Aptos"/>
-          <w:sz w:val="22"/>
-        </w:rPr>
-      </w:pPr>
-      <w:r>
-        <w:rPr>
-          <w:rFonts w:ascii="Aptos" w:hAnsi="Aptos"/>
-          <w:sz w:val="22"/>
-        </w:rPr>
-        <w:t>- Fix: make the smallest complete change and preserve unrelated work.</w:t>
-      </w:r>
-    </w:p>
-    <w:p>
-      <w:pPr>
-        <w:spacing w:after="120"/>
-        <w:rPr>
-          <w:rFonts w:ascii="Aptos" w:hAnsi="Aptos"/>
-          <w:sz w:val="22"/>
-        </w:rPr>
-      </w:pPr>
-      <w:r>
-        <w:rPr>
-          <w:rFonts w:ascii="Aptos" w:hAnsi="Aptos"/>
-          <w:sz w:val="22"/>
-        </w:rPr>
-        <w:t>- Review: inspect the effective diff and exclude generated or sensitive artifacts.</w:t>
-      </w:r>
-    </w:p>
-    <w:p>
-      <w:pPr>
-        <w:spacing w:after="120"/>
-        <w:rPr>
-          <w:rFonts w:ascii="Aptos" w:hAnsi="Aptos"/>
-          <w:sz w:val="22"/>
-        </w:rPr>
-      </w:pPr>
-      <w:r>
-        <w:rPr>
-          <w:rFonts w:ascii="Aptos" w:hAnsi="Aptos"/>
-          <w:sz w:val="22"/>
-        </w:rPr>
-        <w:t>- Local stack: run focused tests, lint, type-check, builds, and required application startup.</w:t>
-      </w:r>
-    </w:p>
-    <w:p>
-      <w:pPr>
-        <w:spacing w:after="120"/>
-        <w:rPr>
-          <w:rFonts w:ascii="Aptos" w:hAnsi="Aptos"/>
-          <w:sz w:val="22"/>
-        </w:rPr>
-      </w:pPr>
-      <w:r>
-        <w:rPr>
-          <w:rFonts w:ascii="Aptos" w:hAnsi="Aptos"/>
-          <w:sz w:val="22"/>
-        </w:rPr>
-        <w:t>- Live test: validate the required UI journey or API behavior with safe data.</w:t>
-      </w:r>
-    </w:p>
-    <w:p>
-      <w:pPr>
-        <w:spacing w:after="120"/>
-        <w:rPr>
-          <w:rFonts w:ascii="Aptos" w:hAnsi="Aptos"/>
-          <w:sz w:val="22"/>
-        </w:rPr>
-      </w:pPr>
-      <w:r>
-        <w:rPr>
-          <w:rFonts w:ascii="Aptos" w:hAnsi="Aptos"/>
-          <w:sz w:val="22"/>
-        </w:rPr>
-        <w:t>- Pull request: commit, push, create or update the authorized PR, and report validation evidence.</w:t>
-      </w:r>
-    </w:p>
-    <w:p>
-      <w:pPr>
-        <w:pStyle w:val="Heading1"/>
-        <w:spacing w:after="120"/>
-        <w:rPr>
-          <w:rFonts w:ascii="Aptos" w:hAnsi="Aptos"/>
-          <w:sz w:val="22"/>
-        </w:rPr>
-      </w:pPr>
-      <w:r>
-        <w:rPr>
-          <w:rFonts w:ascii="Aptos" w:hAnsi="Aptos"/>
-          <w:sz w:val="22"/>
-        </w:rPr>
-        <w:t>8. Pull request creation</w:t>
-      </w:r>
-    </w:p>
-    <w:p>
-      <w:pPr>
-        <w:spacing w:after="120"/>
-        <w:rPr>
-          <w:rFonts w:ascii="Aptos" w:hAnsi="Aptos"/>
-          <w:sz w:val="22"/>
-        </w:rPr>
-      </w:pPr>
-      <w:r>
-        <w:rPr>
-          <w:rFonts w:ascii="Aptos" w:hAnsi="Aptos"/>
-          <w:sz w:val="22"/>
-        </w:rPr>
-        <w:t>Include PR creation in the bug request when code changes are expected:</w:t>
-      </w:r>
-    </w:p>
-    <w:p>
-      <w:pPr>
-        <w:spacing w:after="120"/>
-        <w:ind w:left="360"/>
-        <w:rPr>
-          <w:rFonts w:ascii="Consolas" w:hAnsi="Consolas"/>
-          <w:sz w:val="18"/>
-        </w:rPr>
-      </w:pPr>
-      <w:r>
-        <w:rPr>
-          <w:rFonts w:ascii="Consolas" w:hAnsi="Consolas"/>
-          <w:sz w:val="18"/>
-        </w:rPr>
-        <w:t>Finish the required validation and create or update the pull request using my authorized developer account. Do not stop after local validation.</w:t>
-      </w:r>
-    </w:p>
-    <w:p>
-      <w:pPr>
-        <w:spacing w:after="120"/>
-        <w:rPr>
-          <w:rFonts w:ascii="Aptos" w:hAnsi="Aptos"/>
-          <w:sz w:val="22"/>
-        </w:rPr>
-      </w:pPr>
-      <w:r>
-        <w:rPr>
-          <w:rFonts w:ascii="Aptos" w:hAnsi="Aptos"/>
-          <w:sz w:val="22"/>
-        </w:rPr>
-        <w:t>Check progress from chat:</w:t>
-      </w:r>
-    </w:p>
-    <w:p>
-      <w:pPr>
-        <w:spacing w:after="120"/>
-        <w:ind w:left="360"/>
-        <w:rPr>
-          <w:rFonts w:ascii="Consolas" w:hAnsi="Consolas"/>
-          <w:sz w:val="18"/>
-        </w:rPr>
-      </w:pPr>
-      <w:r>
-        <w:rPr>
-          <w:rFonts w:ascii="Consolas" w:hAnsi="Consolas"/>
-          <w:sz w:val="18"/>
-        </w:rPr>
-        <w:t>show pull request</w:t>
-      </w:r>
-    </w:p>
-    <w:p>
-      <w:pPr>
-        <w:spacing w:after="120"/>
-        <w:ind w:left="360"/>
-        <w:rPr>
-          <w:rFonts w:ascii="Consolas" w:hAnsi="Consolas"/>
-          <w:sz w:val="18"/>
-        </w:rPr>
-      </w:pPr>
-      <w:r>
-        <w:rPr>
-          <w:rFonts w:ascii="Consolas" w:hAnsi="Consolas"/>
-          <w:sz w:val="18"/>
-        </w:rPr>
-        <w:t>show status</w:t>
-      </w:r>
-    </w:p>
-    <w:p>
-      <w:pPr>
-        <w:spacing w:after="120"/>
-        <w:rPr>
-          <w:rFonts w:ascii="Aptos" w:hAnsi="Aptos"/>
-          <w:sz w:val="22"/>
-        </w:rPr>
-      </w:pPr>
-      <w:r>
-        <w:rPr>
-          <w:rFonts w:ascii="Aptos" w:hAnsi="Aptos"/>
-          <w:sz w:val="22"/>
-        </w:rPr>
-        <w:t>Validation-only mode must not edit source, commit, push, or change the pull request.</w:t>
-      </w:r>
-    </w:p>
-    <w:p>
-      <w:pPr>
-        <w:pStyle w:val="Heading1"/>
-        <w:spacing w:after="120"/>
-        <w:rPr>
-          <w:rFonts w:ascii="Aptos" w:hAnsi="Aptos"/>
-          <w:sz w:val="22"/>
-        </w:rPr>
-      </w:pPr>
-      <w:r>
-        <w:rPr>
-          <w:rFonts w:ascii="Aptos" w:hAnsi="Aptos"/>
-          <w:sz w:val="22"/>
-        </w:rPr>
-        <w:t>9. Keep localhost running for manual testing</w:t>
-      </w:r>
-    </w:p>
-    <w:p>
-      <w:pPr>
-        <w:spacing w:after="120"/>
-        <w:rPr>
-          <w:rFonts w:ascii="Aptos" w:hAnsi="Aptos"/>
-          <w:sz w:val="22"/>
-        </w:rPr>
-      </w:pPr>
-      <w:r>
-        <w:rPr>
-          <w:rFonts w:ascii="Aptos" w:hAnsi="Aptos"/>
-          <w:sz w:val="22"/>
-        </w:rPr>
-        <w:t>By default, FixLab stops only the frontend and backend processes it started when the job finishes. To keep them available, say:</w:t>
-      </w:r>
-    </w:p>
-    <w:p>
-      <w:pPr>
-        <w:spacing w:after="120"/>
-        <w:ind w:left="360"/>
-        <w:rPr>
-          <w:rFonts w:ascii="Consolas" w:hAnsi="Consolas"/>
-          <w:sz w:val="18"/>
-        </w:rPr>
-      </w:pPr>
-      <w:r>
-        <w:rPr>
-          <w:rFonts w:ascii="Consolas" w:hAnsi="Consolas"/>
-          <w:sz w:val="18"/>
-        </w:rPr>
-        <w:t>Keep the frontend localhost running with hot reload after validation so I can test it manually. If the UI requires the .NET backend, keep that FixLab-owned backend running too until I confirm testing is complete.</w:t>
-      </w:r>
-    </w:p>
-    <w:p>
-      <w:pPr>
-        <w:spacing w:after="120"/>
-        <w:rPr>
-          <w:rFonts w:ascii="Aptos" w:hAnsi="Aptos"/>
-          <w:sz w:val="22"/>
-        </w:rPr>
-      </w:pPr>
-      <w:r>
-        <w:rPr>
-          <w:rFonts w:ascii="Aptos" w:hAnsi="Aptos"/>
-          <w:sz w:val="22"/>
-        </w:rPr>
-        <w:t>The dashboard also provides Hold after Playwright for manual local testing.</w:t>
-      </w:r>
-    </w:p>
-    <w:p>
-      <w:pPr>
-        <w:pStyle w:val="Heading1"/>
-        <w:spacing w:after="120"/>
-        <w:rPr>
-          <w:rFonts w:ascii="Aptos" w:hAnsi="Aptos"/>
-          <w:sz w:val="22"/>
-        </w:rPr>
-      </w:pPr>
-      <w:r>
-        <w:rPr>
-          <w:rFonts w:ascii="Aptos" w:hAnsi="Aptos"/>
-          <w:sz w:val="22"/>
-        </w:rPr>
-        <w:t>10. Recover an interrupted job</w:t>
-      </w:r>
-    </w:p>
-    <w:p>
-      <w:pPr>
-        <w:spacing w:after="120"/>
-        <w:ind w:left="360"/>
-        <w:rPr>
-          <w:rFonts w:ascii="Consolas" w:hAnsi="Consolas"/>
-          <w:sz w:val="18"/>
-        </w:rPr>
-      </w:pPr>
-      <w:r>
-        <w:rPr>
-          <w:rFonts w:ascii="Consolas" w:hAnsi="Consolas"/>
-          <w:sz w:val="18"/>
-        </w:rPr>
-        <w:t>Continue the same job, preserve existing changes, finish all required validation, and create or update the PR.</w:t>
-      </w:r>
-    </w:p>
-    <w:p>
-      <w:pPr>
-        <w:spacing w:after="120"/>
-        <w:rPr>
-          <w:rFonts w:ascii="Aptos" w:hAnsi="Aptos"/>
-          <w:sz w:val="22"/>
-        </w:rPr>
-      </w:pPr>
-      <w:r>
-        <w:rPr>
-          <w:rFonts w:ascii="Aptos" w:hAnsi="Aptos"/>
-          <w:sz w:val="22"/>
-        </w:rPr>
-        <w:t>Use retry only when the current executor cannot safely resume. FixLab must preserve the worktree and must not discard prior changes.</w:t>
-      </w:r>
-    </w:p>
-    <w:p>
-      <w:pPr>
-        <w:pStyle w:val="Heading1"/>
-        <w:spacing w:after="120"/>
-        <w:rPr>
-          <w:rFonts w:ascii="Aptos" w:hAnsi="Aptos"/>
-          <w:sz w:val="22"/>
-        </w:rPr>
-      </w:pPr>
-      <w:r>
-        <w:rPr>
-          <w:rFonts w:ascii="Aptos" w:hAnsi="Aptos"/>
-          <w:sz w:val="22"/>
-        </w:rPr>
-        <w:t>11. Expected completion evidence</w:t>
-      </w:r>
-    </w:p>
-    <w:p>
-      <w:pPr>
-        <w:spacing w:after="120"/>
-        <w:rPr>
-          <w:rFonts w:ascii="Aptos" w:hAnsi="Aptos"/>
-          <w:sz w:val="22"/>
-        </w:rPr>
-      </w:pPr>
-      <w:r>
-        <w:rPr>
-          <w:rFonts w:ascii="Aptos" w:hAnsi="Aptos"/>
-          <w:sz w:val="22"/>
-        </w:rPr>
-        <w:t>- Focused tests and required build/type-check results.</w:t>
-      </w:r>
-    </w:p>
-    <w:p>
-      <w:pPr>
-        <w:spacing w:after="120"/>
-        <w:rPr>
-          <w:rFonts w:ascii="Aptos" w:hAnsi="Aptos"/>
-          <w:sz w:val="22"/>
-        </w:rPr>
-      </w:pPr>
-      <w:r>
-        <w:rPr>
-          <w:rFonts w:ascii="Aptos" w:hAnsi="Aptos"/>
-          <w:sz w:val="22"/>
-        </w:rPr>
-        <w:t>- Explicit pass, failure, skipped, blocked, or timeout status for every required gate.</w:t>
-      </w:r>
-    </w:p>
-    <w:p>
-      <w:pPr>
-        <w:spacing w:after="120"/>
-        <w:rPr>
-          <w:rFonts w:ascii="Aptos" w:hAnsi="Aptos"/>
-          <w:sz w:val="22"/>
-        </w:rPr>
-      </w:pPr>
-      <w:r>
-        <w:rPr>
-          <w:rFonts w:ascii="Aptos" w:hAnsi="Aptos"/>
-          <w:sz w:val="22"/>
-        </w:rPr>
-        <w:t>- Non-sensitive Playwright screenshots or API assertions when required.</w:t>
-      </w:r>
-    </w:p>
-    <w:p>
-      <w:pPr>
-        <w:spacing w:after="120"/>
-        <w:rPr>
-          <w:rFonts w:ascii="Aptos" w:hAnsi="Aptos"/>
-          <w:sz w:val="22"/>
-        </w:rPr>
-      </w:pPr>
-      <w:r>
-        <w:rPr>
-          <w:rFonts w:ascii="Aptos" w:hAnsi="Aptos"/>
-          <w:sz w:val="22"/>
-        </w:rPr>
-        <w:t>- The branch, commit, pull-request URL or number, and remote policy status when available.</w:t>
-      </w:r>
-    </w:p>
-    <w:p>
-      <w:pPr>
-        <w:spacing w:after="120"/>
-        <w:rPr>
-          <w:rFonts w:ascii="Aptos" w:hAnsi="Aptos"/>
-          <w:sz w:val="22"/>
-        </w:rPr>
-      </w:pPr>
-      <w:r>
-        <w:rPr>
-          <w:rFonts w:ascii="Aptos" w:hAnsi="Aptos"/>
-          <w:sz w:val="22"/>
-        </w:rPr>
-        <w:t>- No unrelated files, credentials, authenticated browser state, or temporary generated tests in the product PR.</w:t>
-      </w:r>
-    </w:p>
-    <w:p>
-      <w:pPr>
-        <w:pStyle w:val="Heading1"/>
-        <w:spacing w:after="120"/>
-        <w:rPr>
-          <w:rFonts w:ascii="Aptos" w:hAnsi="Aptos"/>
-          <w:sz w:val="22"/>
-        </w:rPr>
-      </w:pPr>
-      <w:r>
-        <w:rPr>
-          <w:rFonts w:ascii="Aptos" w:hAnsi="Aptos"/>
-          <w:sz w:val="22"/>
-        </w:rPr>
-        <w:t>12. Troubleshooting</w:t>
-      </w:r>
-    </w:p>
-    <w:p>
-      <w:pPr>
-        <w:spacing w:after="120"/>
-        <w:rPr>
-          <w:rFonts w:ascii="Aptos" w:hAnsi="Aptos"/>
-          <w:sz w:val="22"/>
-        </w:rPr>
-      </w:pPr>
-      <w:r>
-        <w:rPr>
-          <w:rFonts w:ascii="Aptos" w:hAnsi="Aptos"/>
-          <w:sz w:val="22"/>
-        </w:rPr>
-        <w:t>- fixlab is not recognized: reopen PowerShell and verify the npm global binary directory is on PATH.</w:t>
-      </w:r>
-    </w:p>
-    <w:p>
-      <w:pPr>
-        <w:spacing w:after="120"/>
-        <w:rPr>
-          <w:rFonts w:ascii="Aptos" w:hAnsi="Aptos"/>
-          <w:sz w:val="22"/>
-        </w:rPr>
-      </w:pPr>
-      <w:r>
-        <w:rPr>
-          <w:rFonts w:ascii="Aptos" w:hAnsi="Aptos"/>
-          <w:sz w:val="22"/>
-        </w:rPr>
-        <w:t>- Chat connects to the wrong repository: enter another path at startup or type switch repository.</w:t>
-      </w:r>
-    </w:p>
-    <w:p>
-      <w:pPr>
-        <w:spacing w:after="120"/>
-        <w:rPr>
-          <w:rFonts w:ascii="Aptos" w:hAnsi="Aptos"/>
-          <w:sz w:val="22"/>
-        </w:rPr>
-      </w:pPr>
-      <w:r>
-        <w:rPr>
-          <w:rFonts w:ascii="Aptos" w:hAnsi="Aptos"/>
-          <w:sz w:val="22"/>
-        </w:rPr>
-        <w:t>- Input is overwritten by logs: update FixLab; current chat redraws the fixlab&gt; prompt while activity streams.</w:t>
-      </w:r>
-    </w:p>
-    <w:p>
-      <w:pPr>
-        <w:spacing w:after="120"/>
-        <w:rPr>
-          <w:rFonts w:ascii="Aptos" w:hAnsi="Aptos"/>
-          <w:sz w:val="22"/>
-        </w:rPr>
-      </w:pPr>
-      <w:r>
-        <w:rPr>
-          <w:rFonts w:ascii="Aptos" w:hAnsi="Aptos"/>
-          <w:sz w:val="22"/>
-        </w:rPr>
-        <w:t>- A separate bug became a comment: use new bug &lt;details&gt; or add a bug: &lt;details&gt;.</w:t>
-      </w:r>
-    </w:p>
-    <w:p>
-      <w:pPr>
-        <w:spacing w:after="120"/>
-        <w:rPr>
-          <w:rFonts w:ascii="Aptos" w:hAnsi="Aptos"/>
-          <w:sz w:val="22"/>
-        </w:rPr>
-      </w:pPr>
-      <w:r>
-        <w:rPr>
-          <w:rFonts w:ascii="Aptos" w:hAnsi="Aptos"/>
-          <w:sz w:val="22"/>
-        </w:rPr>
-        <w:t>- Repository is not ready: complete conversational onboarding and approve only reviewed repository-owned setup commands.</w:t>
-      </w:r>
-    </w:p>
-    <w:p>
-      <w:pPr>
-        <w:spacing w:after="120"/>
-        <w:rPr>
-          <w:rFonts w:ascii="Aptos" w:hAnsi="Aptos"/>
-          <w:sz w:val="22"/>
-        </w:rPr>
-      </w:pPr>
-      <w:r>
-        <w:rPr>
-          <w:rFonts w:ascii="Aptos" w:hAnsi="Aptos"/>
-          <w:sz w:val="22"/>
-        </w:rPr>
-        <w:t>- Playwright is unavailable: configure and approve the repository-local Playwright setup.</w:t>
-      </w:r>
-    </w:p>
-    <w:p>
-      <w:pPr>
-        <w:spacing w:after="120"/>
-        <w:rPr>
-          <w:rFonts w:ascii="Aptos" w:hAnsi="Aptos"/>
-          <w:sz w:val="22"/>
-        </w:rPr>
-      </w:pPr>
-      <w:r>
-        <w:rPr>
-          <w:rFonts w:ascii="Aptos" w:hAnsi="Aptos"/>
-          <w:sz w:val="22"/>
-        </w:rPr>
-        <w:t>- Never switch automatically to production or bypass authentication and data-safety controls.</w:t>
-      </w:r>
-    </w:p>
-    <w:p>
-      <w:pPr>
-        <w:pStyle w:val="Heading1"/>
-        <w:spacing w:after="120"/>
-        <w:rPr>
-          <w:rFonts w:ascii="Aptos" w:hAnsi="Aptos"/>
-          <w:sz w:val="22"/>
-        </w:rPr>
-      </w:pPr>
-      <w:r>
-        <w:rPr>
-          <w:rFonts w:ascii="Aptos" w:hAnsi="Aptos"/>
-          <w:sz w:val="22"/>
-        </w:rPr>
         <w:t>References</w:t>
       </w:r>
     </w:p>
@@ -1664,6 +1896,7 @@
           <w:rFonts w:ascii="Aptos" w:hAnsi="Aptos"/>
           <w:sz w:val="22"/>
         </w:rPr>
+        <w:lastRenderedPageBreak/>
         <w:t>Detailed installation: docs/installation.md</w:t>
       </w:r>
     </w:p>

</xml_diff>

<commit_message>
Document initial Playwright onboarding
Add plan-first Copilot and Agency setup steps for dependency restoration, Playwright installation, browser authentication, doctor validation, and optional dashboard startup.

Co-authored-by: Copilot <223556219+Copilot@users.noreply.github.com>

Copilot-Session: 9168917c-fadb-448b-afda-9613a02dd02d
</commit_message>
<xml_diff>
--- a/docs/FixLab-Installation-and-Smoke-Test.docx
+++ b/docs/FixLab-Installation-and-Smoke-Test.docx
@@ -72,17 +72,8 @@
     <w:p>
       <w:pPr>
         <w:pStyle w:val="Heading1"/>
-        <w:spacing w:after="120"/>
-        <w:rPr>
-          <w:rFonts w:ascii="Aptos" w:hAnsi="Aptos"/>
-          <w:sz w:val="22"/>
-        </w:rPr>
-      </w:pPr>
-      <w:r>
-        <w:rPr>
-          <w:rFonts w:ascii="Aptos" w:hAnsi="Aptos"/>
-          <w:sz w:val="22"/>
-        </w:rPr>
+      </w:pPr>
+      <w:r>
         <w:t>1. Prerequisites</w:t>
       </w:r>
     </w:p>
@@ -286,17 +277,8 @@
     <w:p>
       <w:pPr>
         <w:pStyle w:val="Heading1"/>
-        <w:spacing w:after="120"/>
-        <w:rPr>
-          <w:rFonts w:ascii="Aptos" w:hAnsi="Aptos"/>
-          <w:sz w:val="22"/>
-        </w:rPr>
-      </w:pPr>
-      <w:r>
-        <w:rPr>
-          <w:rFonts w:ascii="Aptos" w:hAnsi="Aptos"/>
-          <w:sz w:val="22"/>
-        </w:rPr>
+      </w:pPr>
+      <w:r>
         <w:t>2. Install or update FixLab</w:t>
       </w:r>
     </w:p>
@@ -455,6 +437,7 @@
           <w:sz w:val="22"/>
           <w:szCs w:val="40"/>
         </w:rPr>
+        <w:lastRenderedPageBreak/>
         <w:t>copilot --agent fixlab:fixlab</w:t>
       </w:r>
     </w:p>
@@ -565,22 +548,9 @@
     </w:p>
     <w:p>
       <w:pPr>
-        <w:spacing w:after="120"/>
-        <w:ind w:left="360"/>
-        <w:rPr>
-          <w:rFonts w:ascii="Aptos" w:eastAsiaTheme="majorEastAsia" w:hAnsi="Aptos" w:cstheme="majorBidi"/>
-          <w:color w:val="0F4761" w:themeColor="accent1" w:themeShade="BF"/>
-          <w:sz w:val="22"/>
-          <w:szCs w:val="40"/>
-        </w:rPr>
-      </w:pPr>
-      <w:r>
-        <w:rPr>
-          <w:rFonts w:ascii="Aptos" w:eastAsiaTheme="majorEastAsia" w:hAnsi="Aptos" w:cstheme="majorBidi"/>
-          <w:color w:val="0F4761" w:themeColor="accent1" w:themeShade="BF"/>
-          <w:sz w:val="22"/>
-          <w:szCs w:val="40"/>
-        </w:rPr>
+        <w:pStyle w:val="Heading1"/>
+      </w:pPr>
+      <w:r>
         <w:t>4. Start dashboard-connected chat and select a repository</w:t>
       </w:r>
     </w:p>
@@ -647,8 +617,637 @@
           <w:rFonts w:ascii="Aptos" w:hAnsi="Aptos"/>
           <w:sz w:val="22"/>
         </w:rPr>
+        <w:t>When a dashboard is already running, chat displays the connected repository. Press Enter to keep it or enter another repository path. FixLab starts another repository on the next available loopback port.</w:t>
+      </w:r>
+    </w:p>
+    <w:p>
+      <w:pPr>
+        <w:pStyle w:val="Heading2"/>
+        <w:spacing w:after="120"/>
+        <w:rPr>
+          <w:rFonts w:ascii="Aptos" w:hAnsi="Aptos"/>
+          <w:sz w:val="22"/>
+        </w:rPr>
+      </w:pPr>
+      <w:r>
+        <w:rPr>
+          <w:rFonts w:ascii="Aptos" w:hAnsi="Aptos"/>
+          <w:sz w:val="22"/>
+        </w:rPr>
+        <w:t>The following natural-language commands execute immediately:</w:t>
+      </w:r>
+    </w:p>
+    <w:p>
+      <w:pPr>
+        <w:spacing w:after="120"/>
+        <w:ind w:left="360"/>
+        <w:rPr>
+          <w:rFonts w:ascii="Consolas" w:hAnsi="Consolas"/>
+          <w:sz w:val="18"/>
+        </w:rPr>
+      </w:pPr>
+      <w:r>
+        <w:rPr>
+          <w:rFonts w:ascii="Consolas" w:hAnsi="Consolas"/>
+          <w:sz w:val="18"/>
+        </w:rPr>
+        <w:t>start dashboard</w:t>
+      </w:r>
+    </w:p>
+    <w:p>
+      <w:pPr>
+        <w:spacing w:after="120"/>
+        <w:ind w:left="360"/>
+        <w:rPr>
+          <w:rFonts w:ascii="Consolas" w:hAnsi="Consolas"/>
+          <w:sz w:val="18"/>
+        </w:rPr>
+      </w:pPr>
+      <w:r>
+        <w:rPr>
+          <w:rFonts w:ascii="Consolas" w:hAnsi="Consolas"/>
+          <w:sz w:val="18"/>
+        </w:rPr>
+        <w:t>show status</w:t>
+      </w:r>
+    </w:p>
+    <w:p>
+      <w:pPr>
+        <w:spacing w:after="120"/>
+        <w:ind w:left="360"/>
+        <w:rPr>
+          <w:rFonts w:ascii="Consolas" w:hAnsi="Consolas"/>
+          <w:sz w:val="18"/>
+        </w:rPr>
+      </w:pPr>
+      <w:r>
+        <w:rPr>
+          <w:rFonts w:ascii="Consolas" w:hAnsi="Consolas"/>
+          <w:sz w:val="18"/>
+        </w:rPr>
+        <w:t>show logs 50</w:t>
+      </w:r>
+    </w:p>
+    <w:p>
+      <w:pPr>
+        <w:spacing w:after="120"/>
+        <w:ind w:left="360"/>
+        <w:rPr>
+          <w:rFonts w:ascii="Consolas" w:hAnsi="Consolas"/>
+          <w:sz w:val="18"/>
+        </w:rPr>
+      </w:pPr>
+      <w:r>
+        <w:rPr>
+          <w:rFonts w:ascii="Consolas" w:hAnsi="Consolas"/>
+          <w:sz w:val="18"/>
+        </w:rPr>
+        <w:t>show pull request</w:t>
+      </w:r>
+    </w:p>
+    <w:p>
+      <w:pPr>
+        <w:spacing w:after="120"/>
+        <w:ind w:left="360"/>
+        <w:rPr>
+          <w:rFonts w:ascii="Consolas" w:hAnsi="Consolas"/>
+          <w:sz w:val="18"/>
+        </w:rPr>
+      </w:pPr>
+      <w:r>
+        <w:rPr>
+          <w:rFonts w:ascii="Consolas" w:hAnsi="Consolas"/>
+          <w:sz w:val="18"/>
+        </w:rPr>
+        <w:t>show evidence</w:t>
+      </w:r>
+    </w:p>
+    <w:p>
+      <w:pPr>
+        <w:spacing w:after="120"/>
+        <w:ind w:left="360"/>
+        <w:rPr>
+          <w:rFonts w:ascii="Consolas" w:hAnsi="Consolas"/>
+          <w:sz w:val="18"/>
+        </w:rPr>
+      </w:pPr>
+      <w:r>
+        <w:rPr>
+          <w:rFonts w:ascii="Consolas" w:hAnsi="Consolas"/>
+          <w:sz w:val="18"/>
+        </w:rPr>
+        <w:t>switch repository</w:t>
+      </w:r>
+    </w:p>
+    <w:p>
+      <w:pPr>
+        <w:spacing w:after="120"/>
+        <w:ind w:left="360"/>
+        <w:rPr>
+          <w:rFonts w:ascii="Consolas" w:hAnsi="Consolas"/>
+          <w:sz w:val="18"/>
+        </w:rPr>
+      </w:pPr>
+      <w:r>
+        <w:rPr>
+          <w:rFonts w:ascii="Consolas" w:hAnsi="Consolas"/>
+          <w:sz w:val="18"/>
+        </w:rPr>
+        <w:t>switch repository to C:\source\another-application</w:t>
+      </w:r>
+    </w:p>
+    <w:p>
+      <w:pPr>
+        <w:spacing w:after="120"/>
+        <w:ind w:left="360"/>
+        <w:rPr>
+          <w:rFonts w:ascii="Consolas" w:hAnsi="Consolas"/>
+          <w:sz w:val="18"/>
+        </w:rPr>
+      </w:pPr>
+      <w:r>
+        <w:rPr>
+          <w:rFonts w:ascii="Consolas" w:hAnsi="Consolas"/>
+          <w:sz w:val="18"/>
+        </w:rPr>
+        <w:t>help</w:t>
+      </w:r>
+    </w:p>
+    <w:p>
+      <w:pPr>
+        <w:spacing w:after="120"/>
+        <w:rPr>
+          <w:rFonts w:ascii="Aptos" w:hAnsi="Aptos"/>
+          <w:sz w:val="22"/>
+        </w:rPr>
+      </w:pPr>
+      <w:r>
+        <w:rPr>
+          <w:rFonts w:ascii="Aptos" w:hAnsi="Aptos"/>
+          <w:sz w:val="22"/>
+        </w:rPr>
+        <w:t>Other text is sent to the active FixLab agent. If the agent is working, that guidance is queued for its next turn.</w:t>
+      </w:r>
+    </w:p>
+    <w:p>
+      <w:pPr>
+        <w:pStyle w:val="Heading1"/>
+      </w:pPr>
+      <w:r>
+        <w:t>5. Onboard a React frontend and .NET backend</w:t>
+      </w:r>
+    </w:p>
+    <w:p>
+      <w:pPr>
+        <w:spacing w:after="120"/>
+        <w:rPr>
+          <w:rFonts w:ascii="Aptos" w:hAnsi="Aptos"/>
+          <w:sz w:val="22"/>
+        </w:rPr>
+      </w:pPr>
+      <w:r>
+        <w:rPr>
+          <w:rFonts w:ascii="Aptos" w:hAnsi="Aptos"/>
+          <w:sz w:val="22"/>
+        </w:rPr>
+        <w:t>For a new or incomplete repository, ask chat:</w:t>
+      </w:r>
+    </w:p>
+    <w:p>
+      <w:pPr>
+        <w:spacing w:after="120"/>
+        <w:ind w:left="360"/>
+        <w:rPr>
+          <w:rFonts w:ascii="Consolas" w:hAnsi="Consolas"/>
+          <w:sz w:val="18"/>
+        </w:rPr>
+      </w:pPr>
+      <w:r>
+        <w:rPr>
+          <w:rFonts w:ascii="Consolas" w:hAnsi="Consolas"/>
+          <w:sz w:val="18"/>
+        </w:rPr>
         <w:lastRenderedPageBreak/>
-        <w:t>When a dashboard is already running, chat displays the connected repository. Press Enter to keep it or enter another repository path. FixLab starts another repository on the next available loopback port.</w:t>
+        <w:t>Onboard this repository for FixLab. Inspect the React frontend and .NET backend, reuse existing repository commands, configure restore, test, lint, build, startup, ports, health checks, Playwright, authentication, safe environments, and pull-request settings. Explain missing configuration and ask before running setup commands, then run doctor.</w:t>
+      </w:r>
+    </w:p>
+    <w:p>
+      <w:pPr>
+        <w:spacing w:after="120"/>
+        <w:rPr>
+          <w:rFonts w:ascii="Aptos" w:hAnsi="Aptos"/>
+          <w:sz w:val="22"/>
+        </w:rPr>
+      </w:pPr>
+      <w:r>
+        <w:rPr>
+          <w:rFonts w:ascii="Aptos" w:hAnsi="Aptos"/>
+          <w:sz w:val="22"/>
+        </w:rPr>
+        <w:t>Recommended first-run setup prompt for either Copilot or Agency:</w:t>
+      </w:r>
+    </w:p>
+    <w:p>
+      <w:pPr>
+        <w:spacing w:after="120"/>
+        <w:rPr>
+          <w:rFonts w:ascii="Aptos" w:hAnsi="Aptos"/>
+          <w:sz w:val="22"/>
+        </w:rPr>
+      </w:pPr>
+      <w:r>
+        <w:rPr>
+          <w:rFonts w:ascii="Aptos" w:hAnsi="Aptos"/>
+          <w:sz w:val="22"/>
+        </w:rPr>
+        <w:t>Inspect this repository and configure FixLab for its React frontend and .NET backend. Show me the proposed profile and setup plan first. After I approve, restore repository dependencies, install and configure repository-local Playwright and its required browser, configure the repository-owned authentication command without storing secrets, verify frontend and backend startup and health checks, run fixlab doctor, and ask whether to start the dashboard.</w:t>
+      </w:r>
+    </w:p>
+    <w:p>
+      <w:pPr>
+        <w:spacing w:after="120"/>
+        <w:rPr>
+          <w:rFonts w:ascii="Aptos" w:hAnsi="Aptos"/>
+          <w:sz w:val="22"/>
+        </w:rPr>
+      </w:pPr>
+      <w:r>
+        <w:rPr>
+          <w:rFonts w:ascii="Aptos" w:hAnsi="Aptos"/>
+          <w:sz w:val="22"/>
+        </w:rPr>
+        <w:t>Start the same workflow through Copilot:</w:t>
+      </w:r>
+    </w:p>
+    <w:p>
+      <w:pPr>
+        <w:spacing w:after="120"/>
+        <w:rPr>
+          <w:rFonts w:ascii="Aptos" w:hAnsi="Aptos"/>
+          <w:sz w:val="22"/>
+        </w:rPr>
+      </w:pPr>
+      <w:r>
+        <w:rPr>
+          <w:rFonts w:ascii="Aptos" w:hAnsi="Aptos"/>
+          <w:sz w:val="22"/>
+        </w:rPr>
+        <w:t>copilot --agent fixlab:fixlab</w:t>
+      </w:r>
+    </w:p>
+    <w:p>
+      <w:pPr>
+        <w:spacing w:after="120"/>
+        <w:rPr>
+          <w:rFonts w:ascii="Aptos" w:hAnsi="Aptos"/>
+          <w:sz w:val="22"/>
+        </w:rPr>
+      </w:pPr>
+      <w:r>
+        <w:rPr>
+          <w:rFonts w:ascii="Aptos" w:hAnsi="Aptos"/>
+          <w:sz w:val="22"/>
+        </w:rPr>
+        <w:t>Or through the Agency-backed FixLab shell:</w:t>
+      </w:r>
+    </w:p>
+    <w:p>
+      <w:pPr>
+        <w:spacing w:after="120"/>
+        <w:rPr>
+          <w:rFonts w:ascii="Aptos" w:hAnsi="Aptos"/>
+          <w:sz w:val="22"/>
+        </w:rPr>
+      </w:pPr>
+      <w:r>
+        <w:rPr>
+          <w:rFonts w:ascii="Aptos" w:hAnsi="Aptos"/>
+          <w:sz w:val="22"/>
+        </w:rPr>
+        <w:t>fixlab C:\source\application --runtime agency</w:t>
+      </w:r>
+    </w:p>
+    <w:p>
+      <w:pPr>
+        <w:spacing w:after="120"/>
+        <w:rPr>
+          <w:rFonts w:ascii="Aptos" w:hAnsi="Aptos"/>
+          <w:sz w:val="22"/>
+        </w:rPr>
+      </w:pPr>
+      <w:r>
+        <w:rPr>
+          <w:rFonts w:ascii="Aptos" w:hAnsi="Aptos"/>
+          <w:sz w:val="22"/>
+        </w:rPr>
+        <w:t>The first run is plan-first. If the repository profile is new, review and complete it before approving installation. After approval, the agent may run:</w:t>
+      </w:r>
+    </w:p>
+    <w:p>
+      <w:pPr>
+        <w:spacing w:after="120"/>
+        <w:rPr>
+          <w:rFonts w:ascii="Aptos" w:hAnsi="Aptos"/>
+          <w:sz w:val="22"/>
+        </w:rPr>
+      </w:pPr>
+      <w:r>
+        <w:rPr>
+          <w:rFonts w:ascii="Aptos" w:hAnsi="Aptos"/>
+          <w:sz w:val="22"/>
+        </w:rPr>
+        <w:t>fixlab prepare --yes</w:t>
+      </w:r>
+    </w:p>
+    <w:p>
+      <w:pPr>
+        <w:spacing w:after="120"/>
+        <w:rPr>
+          <w:rFonts w:ascii="Aptos" w:hAnsi="Aptos"/>
+          <w:sz w:val="22"/>
+        </w:rPr>
+      </w:pPr>
+      <w:r>
+        <w:rPr>
+          <w:rFonts w:ascii="Aptos" w:hAnsi="Aptos"/>
+          <w:sz w:val="22"/>
+        </w:rPr>
+        <w:t>fixlab setup-playwright --yes</w:t>
+      </w:r>
+    </w:p>
+    <w:p>
+      <w:pPr>
+        <w:spacing w:after="120"/>
+        <w:rPr>
+          <w:rFonts w:ascii="Aptos" w:hAnsi="Aptos"/>
+          <w:sz w:val="22"/>
+        </w:rPr>
+      </w:pPr>
+      <w:r>
+        <w:rPr>
+          <w:rFonts w:ascii="Aptos" w:hAnsi="Aptos"/>
+          <w:sz w:val="22"/>
+        </w:rPr>
+        <w:t>fixlab authenticate</w:t>
+      </w:r>
+    </w:p>
+    <w:p>
+      <w:pPr>
+        <w:spacing w:after="120"/>
+        <w:rPr>
+          <w:rFonts w:ascii="Aptos" w:hAnsi="Aptos"/>
+          <w:sz w:val="22"/>
+        </w:rPr>
+      </w:pPr>
+      <w:r>
+        <w:rPr>
+          <w:rFonts w:ascii="Aptos" w:hAnsi="Aptos"/>
+          <w:sz w:val="22"/>
+        </w:rPr>
+        <w:t>fixlab doctor</w:t>
+      </w:r>
+    </w:p>
+    <w:p>
+      <w:pPr>
+        <w:spacing w:after="120"/>
+        <w:rPr>
+          <w:rFonts w:ascii="Aptos" w:hAnsi="Aptos"/>
+          <w:sz w:val="22"/>
+        </w:rPr>
+      </w:pPr>
+      <w:r>
+        <w:rPr>
+          <w:rFonts w:ascii="Aptos" w:hAnsi="Aptos"/>
+          <w:sz w:val="22"/>
+        </w:rPr>
+        <w:t>fixlab dashboard</w:t>
+      </w:r>
+    </w:p>
+    <w:p>
+      <w:pPr>
+        <w:spacing w:after="120"/>
+        <w:rPr>
+          <w:rFonts w:ascii="Aptos" w:hAnsi="Aptos"/>
+          <w:sz w:val="22"/>
+        </w:rPr>
+      </w:pPr>
+      <w:r>
+        <w:rPr>
+          <w:rFonts w:ascii="Aptos" w:hAnsi="Aptos"/>
+          <w:sz w:val="22"/>
+        </w:rPr>
+        <w:t>Playwright is installed in the application repository, not inside GitHub Copilot or Agency. FixLab verifies the configured package, browser, authentication state, startup commands, and test command before live validation.</w:t>
+      </w:r>
+    </w:p>
+    <w:p>
+      <w:pPr>
+        <w:spacing w:after="120"/>
+        <w:rPr>
+          <w:rFonts w:ascii="Aptos" w:hAnsi="Aptos"/>
+          <w:sz w:val="22"/>
+        </w:rPr>
+      </w:pPr>
+      <w:r>
+        <w:rPr>
+          <w:rFonts w:ascii="Aptos" w:hAnsi="Aptos"/>
+          <w:sz w:val="22"/>
+        </w:rPr>
+        <w:t>FixLab inspects repository-owned files such as package.json, lockfiles, solution and project files, global.json, launchSettings.json, Playwright configuration, CI definitions, local-development documentation, and repository instructions.</w:t>
+      </w:r>
+    </w:p>
+    <w:p>
+      <w:pPr>
+        <w:spacing w:after="120"/>
+        <w:rPr>
+          <w:rFonts w:ascii="Aptos" w:hAnsi="Aptos"/>
+          <w:sz w:val="22"/>
+        </w:rPr>
+      </w:pPr>
+      <w:r>
+        <w:rPr>
+          <w:rFonts w:ascii="Aptos" w:hAnsi="Aptos"/>
+          <w:sz w:val="22"/>
+        </w:rPr>
+        <w:t>- Frontend-only repository: configure only the React application and do not invent a backend.</w:t>
+      </w:r>
+    </w:p>
+    <w:p>
+      <w:pPr>
+        <w:spacing w:after="120"/>
+        <w:rPr>
+          <w:rFonts w:ascii="Aptos" w:hAnsi="Aptos"/>
+          <w:sz w:val="22"/>
+        </w:rPr>
+      </w:pPr>
+      <w:r>
+        <w:rPr>
+          <w:rFonts w:ascii="Aptos" w:hAnsi="Aptos"/>
+          <w:sz w:val="22"/>
+        </w:rPr>
+        <w:t>- Combined repository: configure frontend and backend commands independently.</w:t>
+      </w:r>
+    </w:p>
+    <w:p>
+      <w:pPr>
+        <w:spacing w:after="120"/>
+        <w:rPr>
+          <w:rFonts w:ascii="Aptos" w:hAnsi="Aptos"/>
+          <w:sz w:val="22"/>
+        </w:rPr>
+      </w:pPr>
+      <w:r>
+        <w:rPr>
+          <w:rFonts w:ascii="Aptos" w:hAnsi="Aptos"/>
+          <w:sz w:val="22"/>
+        </w:rPr>
+        <w:t>- Separate frontend and backend repositories: onboard each repository separately.</w:t>
+      </w:r>
+    </w:p>
+    <w:p>
+      <w:pPr>
+        <w:spacing w:after="120"/>
+        <w:rPr>
+          <w:rFonts w:ascii="Aptos" w:hAnsi="Aptos"/>
+          <w:sz w:val="22"/>
+        </w:rPr>
+      </w:pPr>
+      <w:r>
+        <w:rPr>
+          <w:rFonts w:ascii="Aptos" w:hAnsi="Aptos"/>
+          <w:sz w:val="22"/>
+        </w:rPr>
+        <w:t>- Never place credentials, tokens, cookies, browser-state contents, customer data, or production endpoints in the FixLab profile.</w:t>
+      </w:r>
+    </w:p>
+    <w:p>
+      <w:pPr>
+        <w:pStyle w:val="Heading1"/>
+      </w:pPr>
+      <w:r>
+        <w:t>6. Open the browser dashboard</w:t>
+      </w:r>
+    </w:p>
+    <w:p>
+      <w:pPr>
+        <w:spacing w:after="120"/>
+        <w:rPr>
+          <w:rFonts w:ascii="Aptos" w:hAnsi="Aptos"/>
+          <w:sz w:val="22"/>
+        </w:rPr>
+      </w:pPr>
+      <w:r>
+        <w:rPr>
+          <w:rFonts w:ascii="Aptos" w:hAnsi="Aptos"/>
+          <w:sz w:val="22"/>
+        </w:rPr>
+        <w:t>From chat, type:</w:t>
+      </w:r>
+    </w:p>
+    <w:p>
+      <w:pPr>
+        <w:spacing w:after="120"/>
+        <w:ind w:left="360"/>
+        <w:rPr>
+          <w:rFonts w:ascii="Consolas" w:hAnsi="Consolas"/>
+          <w:sz w:val="18"/>
+        </w:rPr>
+      </w:pPr>
+      <w:r>
+        <w:rPr>
+          <w:rFonts w:ascii="Consolas" w:hAnsi="Consolas"/>
+          <w:sz w:val="18"/>
+        </w:rPr>
+        <w:t>start dashboard</w:t>
+      </w:r>
+    </w:p>
+    <w:p>
+      <w:pPr>
+        <w:spacing w:after="120"/>
+        <w:rPr>
+          <w:rFonts w:ascii="Aptos" w:hAnsi="Aptos"/>
+          <w:sz w:val="22"/>
+        </w:rPr>
+      </w:pPr>
+      <w:r>
+        <w:rPr>
+          <w:rFonts w:ascii="Aptos" w:hAnsi="Aptos"/>
+          <w:sz w:val="22"/>
+        </w:rPr>
+        <w:t>FixLab opens the dashboard for the connected repository. The default URL is http://127.0.0.1:4317; additional repositories use another loopback port.</w:t>
+      </w:r>
+    </w:p>
+    <w:p>
+      <w:pPr>
+        <w:pStyle w:val="Heading1"/>
+      </w:pPr>
+      <w:r>
+        <w:t>7. Add a new bug</w:t>
+      </w:r>
+    </w:p>
+    <w:p>
+      <w:pPr>
+        <w:spacing w:after="120"/>
+        <w:rPr>
+          <w:rFonts w:ascii="Aptos" w:hAnsi="Aptos"/>
+          <w:sz w:val="22"/>
+        </w:rPr>
+      </w:pPr>
+      <w:r>
+        <w:rPr>
+          <w:rFonts w:ascii="Aptos" w:hAnsi="Aptos"/>
+          <w:sz w:val="22"/>
+        </w:rPr>
+        <w:t>Create a separate bug job from chat:</w:t>
+      </w:r>
+    </w:p>
+    <w:p>
+      <w:pPr>
+        <w:spacing w:after="120"/>
+        <w:ind w:left="360"/>
+        <w:rPr>
+          <w:rFonts w:ascii="Consolas" w:hAnsi="Consolas"/>
+          <w:sz w:val="18"/>
+        </w:rPr>
+      </w:pPr>
+      <w:r>
+        <w:rPr>
+          <w:rFonts w:ascii="Consolas" w:hAnsi="Consolas"/>
+          <w:sz w:val="18"/>
+        </w:rPr>
+        <w:t>new bug Product search returns duplicate rows</w:t>
+      </w:r>
+    </w:p>
+    <w:p>
+      <w:pPr>
+        <w:spacing w:after="120"/>
+        <w:ind w:left="360"/>
+        <w:rPr>
+          <w:rFonts w:ascii="Consolas" w:hAnsi="Consolas"/>
+          <w:sz w:val="18"/>
+        </w:rPr>
+      </w:pPr>
+      <w:r>
+        <w:rPr>
+          <w:rFonts w:ascii="Consolas" w:hAnsi="Consolas"/>
+          <w:sz w:val="18"/>
+        </w:rPr>
+        <w:t>add a bug: Save remains disabled after validation succeeds</w:t>
+      </w:r>
+    </w:p>
+    <w:p>
+      <w:pPr>
+        <w:spacing w:after="120"/>
+        <w:rPr>
+          <w:rFonts w:ascii="Aptos" w:hAnsi="Aptos"/>
+          <w:sz w:val="22"/>
+        </w:rPr>
+      </w:pPr>
+      <w:r>
+        <w:rPr>
+          <w:rFonts w:ascii="Aptos" w:hAnsi="Aptos"/>
+          <w:sz w:val="22"/>
+        </w:rPr>
+        <w:t>A new bug starts immediately when FixLab is idle or enters the dashboard queue when another job is active. If the instruction belongs to the current job, type it normally without the new bug prefix.</w:t>
       </w:r>
     </w:p>
     <w:p>
@@ -665,24 +1264,319 @@
           <w:rFonts w:ascii="Aptos" w:hAnsi="Aptos"/>
           <w:sz w:val="22"/>
         </w:rPr>
-        <w:t>The following natural-language commands execute immediately:</w:t>
-      </w:r>
-    </w:p>
-    <w:p>
-      <w:pPr>
-        <w:spacing w:after="120"/>
-        <w:ind w:left="360"/>
-        <w:rPr>
-          <w:rFonts w:ascii="Consolas" w:hAnsi="Consolas"/>
-          <w:sz w:val="18"/>
-        </w:rPr>
-      </w:pPr>
-      <w:r>
-        <w:rPr>
-          <w:rFonts w:ascii="Consolas" w:hAnsi="Consolas"/>
-          <w:sz w:val="18"/>
-        </w:rPr>
-        <w:t>start dashboard</w:t>
+        <w:t>UI bug example</w:t>
+      </w:r>
+    </w:p>
+    <w:p>
+      <w:pPr>
+        <w:spacing w:after="120"/>
+        <w:ind w:left="360"/>
+        <w:rPr>
+          <w:rFonts w:ascii="Consolas" w:hAnsi="Consolas"/>
+          <w:sz w:val="18"/>
+        </w:rPr>
+      </w:pPr>
+      <w:r>
+        <w:rPr>
+          <w:rFonts w:ascii="Consolas" w:hAnsi="Consolas"/>
+          <w:sz w:val="18"/>
+        </w:rPr>
+        <w:t>new bug The Product Hierarchy Excel template is missing PFAM formatting. Reproduce the React UI issue, make the smallest fix, run focused tests, lint, type-check and build, start the required applications, validate with Playwright, capture non-sensitive evidence, and create or update the PR.</w:t>
+      </w:r>
+    </w:p>
+    <w:p>
+      <w:pPr>
+        <w:pStyle w:val="Heading2"/>
+        <w:spacing w:after="120"/>
+        <w:rPr>
+          <w:rFonts w:ascii="Aptos" w:hAnsi="Aptos"/>
+          <w:sz w:val="22"/>
+        </w:rPr>
+      </w:pPr>
+      <w:r>
+        <w:rPr>
+          <w:rFonts w:ascii="Aptos" w:hAnsi="Aptos"/>
+          <w:sz w:val="22"/>
+        </w:rPr>
+        <w:t>API bug example</w:t>
+      </w:r>
+    </w:p>
+    <w:p>
+      <w:pPr>
+        <w:spacing w:after="120"/>
+        <w:ind w:left="360"/>
+        <w:rPr>
+          <w:rFonts w:ascii="Consolas" w:hAnsi="Consolas"/>
+          <w:sz w:val="18"/>
+        </w:rPr>
+      </w:pPr>
+      <w:r>
+        <w:rPr>
+          <w:rFonts w:ascii="Consolas" w:hAnsi="Consolas"/>
+          <w:sz w:val="18"/>
+        </w:rPr>
+        <w:t>new bug The create request API returns the wrong status for invalid hierarchy input. Reproduce it with the smallest safe API test, identify the .NET validation path, make the smallest fix, run focused .NET tests and build, start the backend when runtime validation is required, verify the HTTP response, and create or update the PR.</w:t>
+      </w:r>
+    </w:p>
+    <w:p>
+      <w:pPr>
+        <w:pStyle w:val="Heading2"/>
+        <w:spacing w:after="120"/>
+        <w:rPr>
+          <w:rFonts w:ascii="Aptos" w:hAnsi="Aptos"/>
+          <w:sz w:val="22"/>
+        </w:rPr>
+      </w:pPr>
+      <w:r>
+        <w:rPr>
+          <w:rFonts w:ascii="Aptos" w:hAnsi="Aptos"/>
+          <w:sz w:val="22"/>
+        </w:rPr>
+        <w:t>End-to-end UI and API example</w:t>
+      </w:r>
+    </w:p>
+    <w:p>
+      <w:pPr>
+        <w:spacing w:after="120"/>
+        <w:ind w:left="360"/>
+        <w:rPr>
+          <w:rFonts w:ascii="Consolas" w:hAnsi="Consolas"/>
+          <w:sz w:val="18"/>
+        </w:rPr>
+      </w:pPr>
+      <w:r>
+        <w:rPr>
+          <w:rFonts w:ascii="Consolas" w:hAnsi="Consolas"/>
+          <w:sz w:val="18"/>
+        </w:rPr>
+        <w:t>new bug Fix this React workflow end to end. If it depends on the .NET API, restore, build, and start the backend automatically before Playwright. Verify both the API and UI behavior, capture evidence, and create or update the PR.</w:t>
+      </w:r>
+    </w:p>
+    <w:p>
+      <w:pPr>
+        <w:pStyle w:val="Heading1"/>
+      </w:pPr>
+      <w:r>
+        <w:lastRenderedPageBreak/>
+        <w:t>8. End-to-end FixLab lifecycle</w:t>
+      </w:r>
+    </w:p>
+    <w:p>
+      <w:pPr>
+        <w:spacing w:after="120"/>
+        <w:rPr>
+          <w:rFonts w:ascii="Aptos" w:hAnsi="Aptos"/>
+          <w:sz w:val="22"/>
+        </w:rPr>
+      </w:pPr>
+      <w:r>
+        <w:rPr>
+          <w:rFonts w:ascii="Aptos" w:hAnsi="Aptos"/>
+          <w:sz w:val="22"/>
+        </w:rPr>
+        <w:t>FixLab should complete and report these stages:</w:t>
+      </w:r>
+    </w:p>
+    <w:p>
+      <w:pPr>
+        <w:spacing w:after="120"/>
+        <w:rPr>
+          <w:rFonts w:ascii="Aptos" w:hAnsi="Aptos"/>
+          <w:sz w:val="22"/>
+        </w:rPr>
+      </w:pPr>
+      <w:r>
+        <w:rPr>
+          <w:rFonts w:ascii="Aptos" w:hAnsi="Aptos"/>
+          <w:sz w:val="22"/>
+        </w:rPr>
+        <w:t>- Intake: define the measurable bug or enhancement contract.</w:t>
+      </w:r>
+    </w:p>
+    <w:p>
+      <w:pPr>
+        <w:spacing w:after="120"/>
+        <w:rPr>
+          <w:rFonts w:ascii="Aptos" w:hAnsi="Aptos"/>
+          <w:sz w:val="22"/>
+        </w:rPr>
+      </w:pPr>
+      <w:r>
+        <w:rPr>
+          <w:rFonts w:ascii="Aptos" w:hAnsi="Aptos"/>
+          <w:sz w:val="22"/>
+        </w:rPr>
+        <w:t>- Diagnosis: identify the affected frontend, backend, configuration, or external boundary.</w:t>
+      </w:r>
+    </w:p>
+    <w:p>
+      <w:pPr>
+        <w:spacing w:after="120"/>
+        <w:rPr>
+          <w:rFonts w:ascii="Aptos" w:hAnsi="Aptos"/>
+          <w:sz w:val="22"/>
+        </w:rPr>
+      </w:pPr>
+      <w:r>
+        <w:rPr>
+          <w:rFonts w:ascii="Aptos" w:hAnsi="Aptos"/>
+          <w:sz w:val="22"/>
+        </w:rPr>
+        <w:t>- Reproduce: demonstrate the original problem or establish a precise failing check.</w:t>
+      </w:r>
+    </w:p>
+    <w:p>
+      <w:pPr>
+        <w:spacing w:after="120"/>
+        <w:rPr>
+          <w:rFonts w:ascii="Aptos" w:hAnsi="Aptos"/>
+          <w:sz w:val="22"/>
+        </w:rPr>
+      </w:pPr>
+      <w:r>
+        <w:rPr>
+          <w:rFonts w:ascii="Aptos" w:hAnsi="Aptos"/>
+          <w:sz w:val="22"/>
+        </w:rPr>
+        <w:t>- Fix: make the smallest complete change and preserve unrelated work.</w:t>
+      </w:r>
+    </w:p>
+    <w:p>
+      <w:pPr>
+        <w:spacing w:after="120"/>
+        <w:rPr>
+          <w:rFonts w:ascii="Aptos" w:hAnsi="Aptos"/>
+          <w:sz w:val="22"/>
+        </w:rPr>
+      </w:pPr>
+      <w:r>
+        <w:rPr>
+          <w:rFonts w:ascii="Aptos" w:hAnsi="Aptos"/>
+          <w:sz w:val="22"/>
+        </w:rPr>
+        <w:t>- Review: inspect the effective diff and exclude generated or sensitive artifacts.</w:t>
+      </w:r>
+    </w:p>
+    <w:p>
+      <w:pPr>
+        <w:spacing w:after="120"/>
+        <w:rPr>
+          <w:rFonts w:ascii="Aptos" w:hAnsi="Aptos"/>
+          <w:sz w:val="22"/>
+        </w:rPr>
+      </w:pPr>
+      <w:r>
+        <w:rPr>
+          <w:rFonts w:ascii="Aptos" w:hAnsi="Aptos"/>
+          <w:sz w:val="22"/>
+        </w:rPr>
+        <w:t>- Local stack: run focused tests, lint, type-check, builds, and required application startup.</w:t>
+      </w:r>
+    </w:p>
+    <w:p>
+      <w:pPr>
+        <w:spacing w:after="120"/>
+        <w:rPr>
+          <w:rFonts w:ascii="Aptos" w:hAnsi="Aptos"/>
+          <w:sz w:val="22"/>
+        </w:rPr>
+      </w:pPr>
+      <w:r>
+        <w:rPr>
+          <w:rFonts w:ascii="Aptos" w:hAnsi="Aptos"/>
+          <w:sz w:val="22"/>
+        </w:rPr>
+        <w:t>- Live test: validate the required UI journey or API behavior with safe data.</w:t>
+      </w:r>
+    </w:p>
+    <w:p>
+      <w:pPr>
+        <w:spacing w:after="120"/>
+        <w:rPr>
+          <w:rFonts w:ascii="Aptos" w:hAnsi="Aptos"/>
+          <w:sz w:val="22"/>
+        </w:rPr>
+      </w:pPr>
+      <w:r>
+        <w:rPr>
+          <w:rFonts w:ascii="Aptos" w:hAnsi="Aptos"/>
+          <w:sz w:val="22"/>
+        </w:rPr>
+        <w:t>- Pull request: commit, push, create or update the authorized PR, and report validation evidence.</w:t>
+      </w:r>
+    </w:p>
+    <w:p>
+      <w:pPr>
+        <w:pStyle w:val="Heading1"/>
+      </w:pPr>
+      <w:r>
+        <w:t>9. Pull request creation</w:t>
+      </w:r>
+    </w:p>
+    <w:p>
+      <w:pPr>
+        <w:spacing w:after="120"/>
+        <w:rPr>
+          <w:rFonts w:ascii="Aptos" w:hAnsi="Aptos"/>
+          <w:sz w:val="22"/>
+        </w:rPr>
+      </w:pPr>
+      <w:r>
+        <w:rPr>
+          <w:rFonts w:ascii="Aptos" w:hAnsi="Aptos"/>
+          <w:sz w:val="22"/>
+        </w:rPr>
+        <w:t>Include PR creation in the bug request when code changes are expected:</w:t>
+      </w:r>
+    </w:p>
+    <w:p>
+      <w:pPr>
+        <w:spacing w:after="120"/>
+        <w:ind w:left="360"/>
+        <w:rPr>
+          <w:rFonts w:ascii="Consolas" w:hAnsi="Consolas"/>
+          <w:sz w:val="18"/>
+        </w:rPr>
+      </w:pPr>
+      <w:r>
+        <w:rPr>
+          <w:rFonts w:ascii="Consolas" w:hAnsi="Consolas"/>
+          <w:sz w:val="18"/>
+        </w:rPr>
+        <w:t>Finish the required validation and create or update the pull request using my authorized developer account. Do not stop after local validation.</w:t>
+      </w:r>
+    </w:p>
+    <w:p>
+      <w:pPr>
+        <w:spacing w:after="120"/>
+        <w:rPr>
+          <w:rFonts w:ascii="Aptos" w:hAnsi="Aptos"/>
+          <w:sz w:val="22"/>
+        </w:rPr>
+      </w:pPr>
+      <w:r>
+        <w:rPr>
+          <w:rFonts w:ascii="Aptos" w:hAnsi="Aptos"/>
+          <w:sz w:val="22"/>
+        </w:rPr>
+        <w:t>Check progress from chat:</w:t>
+      </w:r>
+    </w:p>
+    <w:p>
+      <w:pPr>
+        <w:spacing w:after="120"/>
+        <w:ind w:left="360"/>
+        <w:rPr>
+          <w:rFonts w:ascii="Consolas" w:hAnsi="Consolas"/>
+          <w:sz w:val="18"/>
+        </w:rPr>
+      </w:pPr>
+      <w:r>
+        <w:rPr>
+          <w:rFonts w:ascii="Consolas" w:hAnsi="Consolas"/>
+          <w:sz w:val="18"/>
+        </w:rPr>
+        <w:t>show pull request</w:t>
       </w:r>
     </w:p>
     <w:p>
@@ -705,984 +1599,171 @@
     <w:p>
       <w:pPr>
         <w:spacing w:after="120"/>
-        <w:ind w:left="360"/>
-        <w:rPr>
-          <w:rFonts w:ascii="Consolas" w:hAnsi="Consolas"/>
-          <w:sz w:val="18"/>
-        </w:rPr>
-      </w:pPr>
-      <w:r>
-        <w:rPr>
-          <w:rFonts w:ascii="Consolas" w:hAnsi="Consolas"/>
-          <w:sz w:val="18"/>
-        </w:rPr>
-        <w:t>show logs 50</w:t>
-      </w:r>
-    </w:p>
-    <w:p>
-      <w:pPr>
-        <w:spacing w:after="120"/>
-        <w:ind w:left="360"/>
-        <w:rPr>
-          <w:rFonts w:ascii="Consolas" w:hAnsi="Consolas"/>
-          <w:sz w:val="18"/>
-        </w:rPr>
-      </w:pPr>
-      <w:r>
-        <w:rPr>
-          <w:rFonts w:ascii="Consolas" w:hAnsi="Consolas"/>
-          <w:sz w:val="18"/>
-        </w:rPr>
-        <w:t>show pull request</w:t>
-      </w:r>
-    </w:p>
-    <w:p>
-      <w:pPr>
-        <w:spacing w:after="120"/>
-        <w:ind w:left="360"/>
-        <w:rPr>
-          <w:rFonts w:ascii="Consolas" w:hAnsi="Consolas"/>
-          <w:sz w:val="18"/>
-        </w:rPr>
-      </w:pPr>
-      <w:r>
-        <w:rPr>
-          <w:rFonts w:ascii="Consolas" w:hAnsi="Consolas"/>
-          <w:sz w:val="18"/>
-        </w:rPr>
-        <w:t>show evidence</w:t>
-      </w:r>
-    </w:p>
-    <w:p>
-      <w:pPr>
-        <w:spacing w:after="120"/>
-        <w:ind w:left="360"/>
-        <w:rPr>
-          <w:rFonts w:ascii="Consolas" w:hAnsi="Consolas"/>
-          <w:sz w:val="18"/>
-        </w:rPr>
-      </w:pPr>
-      <w:r>
-        <w:rPr>
-          <w:rFonts w:ascii="Consolas" w:hAnsi="Consolas"/>
-          <w:sz w:val="18"/>
-        </w:rPr>
-        <w:t>switch repository</w:t>
-      </w:r>
-    </w:p>
-    <w:p>
-      <w:pPr>
-        <w:spacing w:after="120"/>
-        <w:ind w:left="360"/>
-        <w:rPr>
-          <w:rFonts w:ascii="Consolas" w:hAnsi="Consolas"/>
-          <w:sz w:val="18"/>
-        </w:rPr>
-      </w:pPr>
-      <w:r>
-        <w:rPr>
-          <w:rFonts w:ascii="Consolas" w:hAnsi="Consolas"/>
-          <w:sz w:val="18"/>
-        </w:rPr>
-        <w:t>switch repository to C:\source\another-application</w:t>
-      </w:r>
-    </w:p>
-    <w:p>
-      <w:pPr>
-        <w:spacing w:after="120"/>
-        <w:ind w:left="360"/>
-        <w:rPr>
-          <w:rFonts w:ascii="Consolas" w:hAnsi="Consolas"/>
-          <w:sz w:val="18"/>
-        </w:rPr>
-      </w:pPr>
-      <w:r>
-        <w:rPr>
-          <w:rFonts w:ascii="Consolas" w:hAnsi="Consolas"/>
-          <w:sz w:val="18"/>
-        </w:rPr>
-        <w:t>help</w:t>
-      </w:r>
-    </w:p>
-    <w:p>
-      <w:pPr>
-        <w:spacing w:after="120"/>
-        <w:rPr>
-          <w:rFonts w:ascii="Aptos" w:hAnsi="Aptos"/>
-          <w:sz w:val="22"/>
-        </w:rPr>
-      </w:pPr>
-      <w:r>
-        <w:rPr>
-          <w:rFonts w:ascii="Aptos" w:hAnsi="Aptos"/>
-          <w:sz w:val="22"/>
-        </w:rPr>
-        <w:t>Other text is sent to the active FixLab agent. If the agent is working, that guidance is queued for its next turn.</w:t>
-      </w:r>
-    </w:p>
-    <w:p>
-      <w:pPr>
-        <w:spacing w:after="120"/>
-        <w:rPr>
-          <w:rFonts w:ascii="Aptos" w:eastAsiaTheme="majorEastAsia" w:hAnsi="Aptos" w:cstheme="majorBidi"/>
-          <w:color w:val="0F4761" w:themeColor="accent1" w:themeShade="BF"/>
-          <w:sz w:val="22"/>
-          <w:szCs w:val="40"/>
-        </w:rPr>
-      </w:pPr>
-      <w:r>
-        <w:rPr>
-          <w:rFonts w:ascii="Aptos" w:eastAsiaTheme="majorEastAsia" w:hAnsi="Aptos" w:cstheme="majorBidi"/>
-          <w:color w:val="0F4761" w:themeColor="accent1" w:themeShade="BF"/>
-          <w:sz w:val="22"/>
-          <w:szCs w:val="40"/>
-        </w:rPr>
-        <w:t>5. Onboard a React frontend and .NET backend</w:t>
-      </w:r>
-    </w:p>
-    <w:p>
-      <w:pPr>
-        <w:spacing w:after="120"/>
-        <w:rPr>
-          <w:rFonts w:ascii="Aptos" w:hAnsi="Aptos"/>
-          <w:sz w:val="22"/>
-        </w:rPr>
-      </w:pPr>
-      <w:r>
-        <w:rPr>
-          <w:rFonts w:ascii="Aptos" w:hAnsi="Aptos"/>
-          <w:sz w:val="22"/>
-        </w:rPr>
-        <w:t>For a new or incomplete repository, ask chat:</w:t>
-      </w:r>
-    </w:p>
-    <w:p>
-      <w:pPr>
-        <w:spacing w:after="120"/>
-        <w:ind w:left="360"/>
-        <w:rPr>
-          <w:rFonts w:ascii="Consolas" w:hAnsi="Consolas"/>
-          <w:sz w:val="18"/>
-        </w:rPr>
-      </w:pPr>
-      <w:r>
-        <w:rPr>
-          <w:rFonts w:ascii="Consolas" w:hAnsi="Consolas"/>
-          <w:sz w:val="18"/>
-        </w:rPr>
-        <w:t>Onboard this repository for FixLab. Inspect the React frontend and .NET backend, reuse existing repository commands, configure restore, test, lint, build, startup, ports, health checks, Playwright, authentication, safe environments, and pull-request settings. Explain missing configuration and ask before running setup commands, then run doctor.</w:t>
-      </w:r>
-    </w:p>
-    <w:p>
-      <w:pPr>
-        <w:spacing w:after="120"/>
-        <w:rPr>
-          <w:rFonts w:ascii="Aptos" w:hAnsi="Aptos"/>
-          <w:sz w:val="22"/>
-        </w:rPr>
-      </w:pPr>
-      <w:r>
-        <w:rPr>
-          <w:rFonts w:ascii="Aptos" w:hAnsi="Aptos"/>
-          <w:sz w:val="22"/>
-        </w:rPr>
-        <w:t>FixLab inspects repository-owned files such as package.json, lockfiles, solution and project files, global.json, launchSettings.json, Playwright configuration, CI definitions, local-development documentation, and repository instructions.</w:t>
-      </w:r>
-    </w:p>
-    <w:p>
-      <w:pPr>
-        <w:spacing w:after="120"/>
-        <w:rPr>
-          <w:rFonts w:ascii="Aptos" w:hAnsi="Aptos"/>
-          <w:sz w:val="22"/>
-        </w:rPr>
-      </w:pPr>
-      <w:r>
-        <w:rPr>
-          <w:rFonts w:ascii="Aptos" w:hAnsi="Aptos"/>
-          <w:sz w:val="22"/>
-        </w:rPr>
-        <w:t>- Frontend-only repository: configure only the React application and do not invent a backend.</w:t>
-      </w:r>
-    </w:p>
-    <w:p>
-      <w:pPr>
-        <w:spacing w:after="120"/>
-        <w:rPr>
-          <w:rFonts w:ascii="Aptos" w:hAnsi="Aptos"/>
-          <w:sz w:val="22"/>
-        </w:rPr>
-      </w:pPr>
-      <w:r>
-        <w:rPr>
-          <w:rFonts w:ascii="Aptos" w:hAnsi="Aptos"/>
-          <w:sz w:val="22"/>
-        </w:rPr>
-        <w:t>- Combined repository: configure frontend and backend commands independently.</w:t>
-      </w:r>
-    </w:p>
-    <w:p>
-      <w:pPr>
-        <w:spacing w:after="120"/>
-        <w:rPr>
-          <w:rFonts w:ascii="Aptos" w:hAnsi="Aptos"/>
-          <w:sz w:val="22"/>
-        </w:rPr>
-      </w:pPr>
-      <w:r>
-        <w:rPr>
-          <w:rFonts w:ascii="Aptos" w:hAnsi="Aptos"/>
-          <w:sz w:val="22"/>
-        </w:rPr>
-        <w:t>- Separate frontend and backend repositories: onboard each repository separately.</w:t>
-      </w:r>
-    </w:p>
-    <w:p>
-      <w:pPr>
-        <w:spacing w:after="120"/>
-        <w:rPr>
-          <w:rFonts w:ascii="Aptos" w:hAnsi="Aptos"/>
-          <w:sz w:val="22"/>
-        </w:rPr>
-      </w:pPr>
-      <w:r>
-        <w:rPr>
-          <w:rFonts w:ascii="Aptos" w:hAnsi="Aptos"/>
-          <w:sz w:val="22"/>
-        </w:rPr>
-        <w:t>- Never place credentials, tokens, cookies, browser-state contents, customer data, or production endpoints in the FixLab profile.</w:t>
-      </w:r>
-    </w:p>
-    <w:p>
-      <w:pPr>
-        <w:spacing w:after="120"/>
-        <w:rPr>
-          <w:rFonts w:ascii="Aptos" w:eastAsiaTheme="majorEastAsia" w:hAnsi="Aptos" w:cstheme="majorBidi"/>
-          <w:color w:val="0F4761" w:themeColor="accent1" w:themeShade="BF"/>
-          <w:sz w:val="22"/>
-          <w:szCs w:val="40"/>
-        </w:rPr>
-      </w:pPr>
-      <w:r>
-        <w:rPr>
-          <w:rFonts w:ascii="Aptos" w:eastAsiaTheme="majorEastAsia" w:hAnsi="Aptos" w:cstheme="majorBidi"/>
-          <w:color w:val="0F4761" w:themeColor="accent1" w:themeShade="BF"/>
-          <w:sz w:val="22"/>
-          <w:szCs w:val="40"/>
-        </w:rPr>
-        <w:t>6. Open the browser dashboard</w:t>
-      </w:r>
-    </w:p>
-    <w:p>
-      <w:pPr>
-        <w:spacing w:after="120"/>
-        <w:rPr>
-          <w:rFonts w:ascii="Aptos" w:hAnsi="Aptos"/>
-          <w:sz w:val="22"/>
-        </w:rPr>
-      </w:pPr>
-      <w:r>
-        <w:rPr>
-          <w:rFonts w:ascii="Aptos" w:hAnsi="Aptos"/>
-          <w:sz w:val="22"/>
-        </w:rPr>
-        <w:t>From chat, type:</w:t>
-      </w:r>
-    </w:p>
-    <w:p>
-      <w:pPr>
-        <w:spacing w:after="120"/>
-        <w:ind w:left="360"/>
-        <w:rPr>
-          <w:rFonts w:ascii="Consolas" w:hAnsi="Consolas"/>
-          <w:sz w:val="18"/>
-        </w:rPr>
-      </w:pPr>
-      <w:r>
-        <w:rPr>
-          <w:rFonts w:ascii="Consolas" w:hAnsi="Consolas"/>
-          <w:sz w:val="18"/>
-        </w:rPr>
-        <w:t>start dashboard</w:t>
-      </w:r>
-    </w:p>
-    <w:p>
-      <w:pPr>
-        <w:spacing w:after="120"/>
-        <w:rPr>
-          <w:rFonts w:ascii="Aptos" w:hAnsi="Aptos"/>
-          <w:sz w:val="22"/>
-        </w:rPr>
-      </w:pPr>
-      <w:r>
-        <w:rPr>
-          <w:rFonts w:ascii="Aptos" w:hAnsi="Aptos"/>
-          <w:sz w:val="22"/>
-        </w:rPr>
-        <w:t>FixLab opens the dashboard for the connected repository. The default URL is http://127.0.0.1:4317; additional repositories use another loopback port.</w:t>
-      </w:r>
-    </w:p>
-    <w:p>
-      <w:pPr>
-        <w:spacing w:after="120"/>
-        <w:rPr>
-          <w:rFonts w:ascii="Aptos" w:eastAsiaTheme="majorEastAsia" w:hAnsi="Aptos" w:cstheme="majorBidi"/>
-          <w:color w:val="0F4761" w:themeColor="accent1" w:themeShade="BF"/>
-          <w:sz w:val="22"/>
-          <w:szCs w:val="40"/>
-        </w:rPr>
-      </w:pPr>
-      <w:r>
-        <w:rPr>
-          <w:rFonts w:ascii="Aptos" w:eastAsiaTheme="majorEastAsia" w:hAnsi="Aptos" w:cstheme="majorBidi"/>
-          <w:color w:val="0F4761" w:themeColor="accent1" w:themeShade="BF"/>
-          <w:sz w:val="22"/>
-          <w:szCs w:val="40"/>
-        </w:rPr>
-        <w:t>7. Add a new bug</w:t>
-      </w:r>
-    </w:p>
-    <w:p>
-      <w:pPr>
-        <w:spacing w:after="120"/>
-        <w:rPr>
-          <w:rFonts w:ascii="Aptos" w:hAnsi="Aptos"/>
-          <w:sz w:val="22"/>
-        </w:rPr>
-      </w:pPr>
-      <w:r>
-        <w:rPr>
-          <w:rFonts w:ascii="Aptos" w:hAnsi="Aptos"/>
-          <w:sz w:val="22"/>
-        </w:rPr>
-        <w:t>Create a separate bug job from chat:</w:t>
-      </w:r>
-    </w:p>
-    <w:p>
-      <w:pPr>
-        <w:spacing w:after="120"/>
-        <w:ind w:left="360"/>
-        <w:rPr>
-          <w:rFonts w:ascii="Consolas" w:hAnsi="Consolas"/>
-          <w:sz w:val="18"/>
-        </w:rPr>
-      </w:pPr>
-      <w:r>
-        <w:rPr>
-          <w:rFonts w:ascii="Consolas" w:hAnsi="Consolas"/>
-          <w:sz w:val="18"/>
+        <w:rPr>
+          <w:rFonts w:ascii="Aptos" w:hAnsi="Aptos"/>
+          <w:sz w:val="22"/>
+        </w:rPr>
+      </w:pPr>
+      <w:r>
+        <w:rPr>
+          <w:rFonts w:ascii="Aptos" w:hAnsi="Aptos"/>
+          <w:sz w:val="22"/>
+        </w:rPr>
+        <w:t>Validation-only mode must not edit source, commit, push, or change the pull request.</w:t>
+      </w:r>
+    </w:p>
+    <w:p>
+      <w:pPr>
+        <w:pStyle w:val="Heading1"/>
+      </w:pPr>
+      <w:r>
+        <w:t>10. Keep localhost running for manual testing</w:t>
+      </w:r>
+    </w:p>
+    <w:p>
+      <w:pPr>
+        <w:spacing w:after="120"/>
+        <w:rPr>
+          <w:rFonts w:ascii="Aptos" w:hAnsi="Aptos"/>
+          <w:sz w:val="22"/>
+        </w:rPr>
+      </w:pPr>
+      <w:r>
+        <w:rPr>
+          <w:rFonts w:ascii="Aptos" w:hAnsi="Aptos"/>
+          <w:sz w:val="22"/>
+        </w:rPr>
+        <w:t>By default, FixLab stops only the frontend and backend processes it started when the job finishes. To keep them available, say:</w:t>
+      </w:r>
+    </w:p>
+    <w:p>
+      <w:pPr>
+        <w:spacing w:after="120"/>
+        <w:ind w:left="360"/>
+        <w:rPr>
+          <w:rFonts w:ascii="Consolas" w:hAnsi="Consolas"/>
+          <w:sz w:val="18"/>
+        </w:rPr>
+      </w:pPr>
+      <w:r>
+        <w:rPr>
+          <w:rFonts w:ascii="Consolas" w:hAnsi="Consolas"/>
+          <w:sz w:val="18"/>
+        </w:rPr>
+        <w:t>Keep the frontend localhost running with hot reload after validation so I can test it manually. If the UI requires the .NET backend, keep that FixLab-owned backend running too until I confirm testing is complete.</w:t>
+      </w:r>
+    </w:p>
+    <w:p>
+      <w:pPr>
+        <w:spacing w:after="120"/>
+        <w:rPr>
+          <w:rFonts w:ascii="Aptos" w:hAnsi="Aptos"/>
+          <w:sz w:val="22"/>
+        </w:rPr>
+      </w:pPr>
+      <w:r>
+        <w:rPr>
+          <w:rFonts w:ascii="Aptos" w:hAnsi="Aptos"/>
+          <w:sz w:val="22"/>
+        </w:rPr>
+        <w:t>The dashboard also provides Hold after Playwright for manual local testing.</w:t>
+      </w:r>
+    </w:p>
+    <w:p>
+      <w:pPr>
+        <w:pStyle w:val="Heading1"/>
+      </w:pPr>
+      <w:r>
+        <w:t>11. Recover an interrupted job</w:t>
+      </w:r>
+    </w:p>
+    <w:p>
+      <w:pPr>
+        <w:spacing w:after="120"/>
+        <w:ind w:left="360"/>
+        <w:rPr>
+          <w:rFonts w:ascii="Consolas" w:hAnsi="Consolas"/>
+          <w:sz w:val="18"/>
+        </w:rPr>
+      </w:pPr>
+      <w:r>
+        <w:rPr>
+          <w:rFonts w:ascii="Consolas" w:hAnsi="Consolas"/>
+          <w:sz w:val="18"/>
+        </w:rPr>
+        <w:t>Continue the same job, preserve existing changes, finish all required validation, and create or update the PR.</w:t>
+      </w:r>
+    </w:p>
+    <w:p>
+      <w:pPr>
+        <w:spacing w:after="120"/>
+        <w:rPr>
+          <w:rFonts w:ascii="Aptos" w:hAnsi="Aptos"/>
+          <w:sz w:val="22"/>
+        </w:rPr>
+      </w:pPr>
+      <w:r>
+        <w:rPr>
+          <w:rFonts w:ascii="Aptos" w:hAnsi="Aptos"/>
+          <w:sz w:val="22"/>
+        </w:rPr>
+        <w:t>Use retry only when the current executor cannot safely resume. FixLab must preserve the worktree and must not discard prior changes.</w:t>
+      </w:r>
+    </w:p>
+    <w:p>
+      <w:pPr>
+        <w:pStyle w:val="Heading1"/>
+      </w:pPr>
+      <w:r>
+        <w:t>12. Expected completion evidence</w:t>
+      </w:r>
+    </w:p>
+    <w:p>
+      <w:pPr>
+        <w:spacing w:after="120"/>
+        <w:rPr>
+          <w:rFonts w:ascii="Aptos" w:hAnsi="Aptos"/>
+          <w:sz w:val="22"/>
+        </w:rPr>
+      </w:pPr>
+      <w:r>
+        <w:rPr>
+          <w:rFonts w:ascii="Aptos" w:hAnsi="Aptos"/>
+          <w:sz w:val="22"/>
+        </w:rPr>
+        <w:t>- Focused tests and required build/type-check results.</w:t>
+      </w:r>
+    </w:p>
+    <w:p>
+      <w:pPr>
+        <w:spacing w:after="120"/>
+        <w:rPr>
+          <w:rFonts w:ascii="Aptos" w:hAnsi="Aptos"/>
+          <w:sz w:val="22"/>
+        </w:rPr>
+      </w:pPr>
+      <w:r>
+        <w:rPr>
+          <w:rFonts w:ascii="Aptos" w:hAnsi="Aptos"/>
+          <w:sz w:val="22"/>
+        </w:rPr>
+        <w:t>- Explicit pass, failure, skipped, blocked, or timeout status for every required gate.</w:t>
+      </w:r>
+    </w:p>
+    <w:p>
+      <w:pPr>
+        <w:spacing w:after="120"/>
+        <w:rPr>
+          <w:rFonts w:ascii="Aptos" w:hAnsi="Aptos"/>
+          <w:sz w:val="22"/>
+        </w:rPr>
+      </w:pPr>
+      <w:r>
+        <w:rPr>
+          <w:rFonts w:ascii="Aptos" w:hAnsi="Aptos"/>
+          <w:sz w:val="22"/>
         </w:rPr>
         <w:lastRenderedPageBreak/>
-        <w:t>new bug Product search returns duplicate rows</w:t>
-      </w:r>
-    </w:p>
-    <w:p>
-      <w:pPr>
-        <w:spacing w:after="120"/>
-        <w:ind w:left="360"/>
-        <w:rPr>
-          <w:rFonts w:ascii="Consolas" w:hAnsi="Consolas"/>
-          <w:sz w:val="18"/>
-        </w:rPr>
-      </w:pPr>
-      <w:r>
-        <w:rPr>
-          <w:rFonts w:ascii="Consolas" w:hAnsi="Consolas"/>
-          <w:sz w:val="18"/>
-        </w:rPr>
-        <w:t>add a bug: Save remains disabled after validation succeeds</w:t>
-      </w:r>
-    </w:p>
-    <w:p>
-      <w:pPr>
-        <w:spacing w:after="120"/>
-        <w:rPr>
-          <w:rFonts w:ascii="Aptos" w:hAnsi="Aptos"/>
-          <w:sz w:val="22"/>
-        </w:rPr>
-      </w:pPr>
-      <w:r>
-        <w:rPr>
-          <w:rFonts w:ascii="Aptos" w:hAnsi="Aptos"/>
-          <w:sz w:val="22"/>
-        </w:rPr>
-        <w:t>A new bug starts immediately when FixLab is idle or enters the dashboard queue when another job is active. If the instruction belongs to the current job, type it normally without the new bug prefix.</w:t>
-      </w:r>
-    </w:p>
-    <w:p>
-      <w:pPr>
-        <w:pStyle w:val="Heading2"/>
-        <w:spacing w:after="120"/>
-        <w:rPr>
-          <w:rFonts w:ascii="Aptos" w:hAnsi="Aptos"/>
-          <w:sz w:val="22"/>
-        </w:rPr>
-      </w:pPr>
-      <w:r>
-        <w:rPr>
-          <w:rFonts w:ascii="Aptos" w:hAnsi="Aptos"/>
-          <w:sz w:val="22"/>
-        </w:rPr>
-        <w:t>UI bug example</w:t>
-      </w:r>
-    </w:p>
-    <w:p>
-      <w:pPr>
-        <w:spacing w:after="120"/>
-        <w:ind w:left="360"/>
-        <w:rPr>
-          <w:rFonts w:ascii="Consolas" w:hAnsi="Consolas"/>
-          <w:sz w:val="18"/>
-        </w:rPr>
-      </w:pPr>
-      <w:r>
-        <w:rPr>
-          <w:rFonts w:ascii="Consolas" w:hAnsi="Consolas"/>
-          <w:sz w:val="18"/>
-        </w:rPr>
-        <w:t>new bug The Product Hierarchy Excel template is missing PFAM formatting. Reproduce the React UI issue, make the smallest fix, run focused tests, lint, type-check and build, start the required applications, validate with Playwright, capture non-sensitive evidence, and create or update the PR.</w:t>
-      </w:r>
-    </w:p>
-    <w:p>
-      <w:pPr>
-        <w:pStyle w:val="Heading2"/>
-        <w:spacing w:after="120"/>
-        <w:rPr>
-          <w:rFonts w:ascii="Aptos" w:hAnsi="Aptos"/>
-          <w:sz w:val="22"/>
-        </w:rPr>
-      </w:pPr>
-      <w:r>
-        <w:rPr>
-          <w:rFonts w:ascii="Aptos" w:hAnsi="Aptos"/>
-          <w:sz w:val="22"/>
-        </w:rPr>
-        <w:t>API bug example</w:t>
-      </w:r>
-    </w:p>
-    <w:p>
-      <w:pPr>
-        <w:spacing w:after="120"/>
-        <w:ind w:left="360"/>
-        <w:rPr>
-          <w:rFonts w:ascii="Consolas" w:hAnsi="Consolas"/>
-          <w:sz w:val="18"/>
-        </w:rPr>
-      </w:pPr>
-      <w:r>
-        <w:rPr>
-          <w:rFonts w:ascii="Consolas" w:hAnsi="Consolas"/>
-          <w:sz w:val="18"/>
-        </w:rPr>
-        <w:t>new bug The create request API returns the wrong status for invalid hierarchy input. Reproduce it with the smallest safe API test, identify the .NET validation path, make the smallest fix, run focused .NET tests and build, start the backend when runtime validation is required, verify the HTTP response, and create or update the PR.</w:t>
-      </w:r>
-    </w:p>
-    <w:p>
-      <w:pPr>
-        <w:pStyle w:val="Heading2"/>
-        <w:spacing w:after="120"/>
-        <w:rPr>
-          <w:rFonts w:ascii="Aptos" w:hAnsi="Aptos"/>
-          <w:sz w:val="22"/>
-        </w:rPr>
-      </w:pPr>
-      <w:r>
-        <w:rPr>
-          <w:rFonts w:ascii="Aptos" w:hAnsi="Aptos"/>
-          <w:sz w:val="22"/>
-        </w:rPr>
-        <w:t>End-to-end UI and API example</w:t>
-      </w:r>
-    </w:p>
-    <w:p>
-      <w:pPr>
-        <w:spacing w:after="120"/>
-        <w:ind w:left="360"/>
-        <w:rPr>
-          <w:rFonts w:ascii="Consolas" w:hAnsi="Consolas"/>
-          <w:sz w:val="18"/>
-        </w:rPr>
-      </w:pPr>
-      <w:r>
-        <w:rPr>
-          <w:rFonts w:ascii="Consolas" w:hAnsi="Consolas"/>
-          <w:sz w:val="18"/>
-        </w:rPr>
-        <w:t>new bug Fix this React workflow end to end. If it depends on the .NET API, restore, build, and start the backend automatically before Playwright. Verify both the API and UI behavior, capture evidence, and create or update the PR.</w:t>
-      </w:r>
-    </w:p>
-    <w:p>
-      <w:pPr>
-        <w:spacing w:after="120"/>
-        <w:rPr>
-          <w:rFonts w:ascii="Aptos" w:eastAsiaTheme="majorEastAsia" w:hAnsi="Aptos" w:cstheme="majorBidi"/>
-          <w:color w:val="0F4761" w:themeColor="accent1" w:themeShade="BF"/>
-          <w:sz w:val="22"/>
-          <w:szCs w:val="40"/>
-        </w:rPr>
-      </w:pPr>
-      <w:r>
-        <w:rPr>
-          <w:rFonts w:ascii="Aptos" w:eastAsiaTheme="majorEastAsia" w:hAnsi="Aptos" w:cstheme="majorBidi"/>
-          <w:color w:val="0F4761" w:themeColor="accent1" w:themeShade="BF"/>
-          <w:sz w:val="22"/>
-          <w:szCs w:val="40"/>
-        </w:rPr>
-        <w:t>8. End-to-end FixLab lifecycle</w:t>
-      </w:r>
-    </w:p>
-    <w:p>
-      <w:pPr>
-        <w:spacing w:after="120"/>
-        <w:rPr>
-          <w:rFonts w:ascii="Aptos" w:hAnsi="Aptos"/>
-          <w:sz w:val="22"/>
-        </w:rPr>
-      </w:pPr>
-      <w:r>
-        <w:rPr>
-          <w:rFonts w:ascii="Aptos" w:hAnsi="Aptos"/>
-          <w:sz w:val="22"/>
-        </w:rPr>
-        <w:t>FixLab should complete and report these stages:</w:t>
-      </w:r>
-    </w:p>
-    <w:p>
-      <w:pPr>
-        <w:spacing w:after="120"/>
-        <w:rPr>
-          <w:rFonts w:ascii="Aptos" w:hAnsi="Aptos"/>
-          <w:sz w:val="22"/>
-        </w:rPr>
-      </w:pPr>
-      <w:r>
-        <w:rPr>
-          <w:rFonts w:ascii="Aptos" w:hAnsi="Aptos"/>
-          <w:sz w:val="22"/>
-        </w:rPr>
-        <w:t>- Intake: define the measurable bug or enhancement contract.</w:t>
-      </w:r>
-    </w:p>
-    <w:p>
-      <w:pPr>
-        <w:spacing w:after="120"/>
-        <w:rPr>
-          <w:rFonts w:ascii="Aptos" w:hAnsi="Aptos"/>
-          <w:sz w:val="22"/>
-        </w:rPr>
-      </w:pPr>
-      <w:r>
-        <w:rPr>
-          <w:rFonts w:ascii="Aptos" w:hAnsi="Aptos"/>
-          <w:sz w:val="22"/>
-        </w:rPr>
-        <w:t>- Diagnosis: identify the affected frontend, backend, configuration, or external boundary.</w:t>
-      </w:r>
-    </w:p>
-    <w:p>
-      <w:pPr>
-        <w:spacing w:after="120"/>
-        <w:rPr>
-          <w:rFonts w:ascii="Aptos" w:hAnsi="Aptos"/>
-          <w:sz w:val="22"/>
-        </w:rPr>
-      </w:pPr>
-      <w:r>
-        <w:rPr>
-          <w:rFonts w:ascii="Aptos" w:hAnsi="Aptos"/>
-          <w:sz w:val="22"/>
-        </w:rPr>
-        <w:t>- Reproduce: demonstrate the original problem or establish a precise failing check.</w:t>
-      </w:r>
-    </w:p>
-    <w:p>
-      <w:pPr>
-        <w:spacing w:after="120"/>
-        <w:rPr>
-          <w:rFonts w:ascii="Aptos" w:hAnsi="Aptos"/>
-          <w:sz w:val="22"/>
-        </w:rPr>
-      </w:pPr>
-      <w:r>
-        <w:rPr>
-          <w:rFonts w:ascii="Aptos" w:hAnsi="Aptos"/>
-          <w:sz w:val="22"/>
-        </w:rPr>
-        <w:t>- Fix: make the smallest complete change and preserve unrelated work.</w:t>
-      </w:r>
-    </w:p>
-    <w:p>
-      <w:pPr>
-        <w:spacing w:after="120"/>
-        <w:rPr>
-          <w:rFonts w:ascii="Aptos" w:hAnsi="Aptos"/>
-          <w:sz w:val="22"/>
-        </w:rPr>
-      </w:pPr>
-      <w:r>
-        <w:rPr>
-          <w:rFonts w:ascii="Aptos" w:hAnsi="Aptos"/>
-          <w:sz w:val="22"/>
-        </w:rPr>
-        <w:t>- Review: inspect the effective diff and exclude generated or sensitive artifacts.</w:t>
-      </w:r>
-    </w:p>
-    <w:p>
-      <w:pPr>
-        <w:spacing w:after="120"/>
-        <w:rPr>
-          <w:rFonts w:ascii="Aptos" w:hAnsi="Aptos"/>
-          <w:sz w:val="22"/>
-        </w:rPr>
-      </w:pPr>
-      <w:r>
-        <w:rPr>
-          <w:rFonts w:ascii="Aptos" w:hAnsi="Aptos"/>
-          <w:sz w:val="22"/>
-        </w:rPr>
-        <w:t>- Local stack: run focused tests, lint, type-check, builds, and required application startup.</w:t>
-      </w:r>
-    </w:p>
-    <w:p>
-      <w:pPr>
-        <w:spacing w:after="120"/>
-        <w:rPr>
-          <w:rFonts w:ascii="Aptos" w:hAnsi="Aptos"/>
-          <w:sz w:val="22"/>
-        </w:rPr>
-      </w:pPr>
-      <w:r>
-        <w:rPr>
-          <w:rFonts w:ascii="Aptos" w:hAnsi="Aptos"/>
-          <w:sz w:val="22"/>
-        </w:rPr>
-        <w:t>- Live test: validate the required UI journey or API behavior with safe data.</w:t>
-      </w:r>
-    </w:p>
-    <w:p>
-      <w:pPr>
-        <w:spacing w:after="120"/>
-        <w:rPr>
-          <w:rFonts w:ascii="Aptos" w:hAnsi="Aptos"/>
-          <w:sz w:val="22"/>
-        </w:rPr>
-      </w:pPr>
-      <w:r>
-        <w:rPr>
-          <w:rFonts w:ascii="Aptos" w:hAnsi="Aptos"/>
-          <w:sz w:val="22"/>
-        </w:rPr>
-        <w:t>- Pull request: commit, push, create or update the authorized PR, and report validation evidence.</w:t>
-      </w:r>
-    </w:p>
-    <w:p>
-      <w:pPr>
-        <w:spacing w:after="120"/>
-        <w:rPr>
-          <w:rFonts w:ascii="Aptos" w:eastAsiaTheme="majorEastAsia" w:hAnsi="Aptos" w:cstheme="majorBidi"/>
-          <w:color w:val="0F4761" w:themeColor="accent1" w:themeShade="BF"/>
-          <w:sz w:val="22"/>
-          <w:szCs w:val="40"/>
-        </w:rPr>
-      </w:pPr>
-      <w:r>
-        <w:rPr>
-          <w:rFonts w:ascii="Aptos" w:eastAsiaTheme="majorEastAsia" w:hAnsi="Aptos" w:cstheme="majorBidi"/>
-          <w:color w:val="0F4761" w:themeColor="accent1" w:themeShade="BF"/>
-          <w:sz w:val="22"/>
-          <w:szCs w:val="40"/>
-        </w:rPr>
-        <w:t>9. Pull request creation</w:t>
-      </w:r>
-    </w:p>
-    <w:p>
-      <w:pPr>
-        <w:spacing w:after="120"/>
-        <w:rPr>
-          <w:rFonts w:ascii="Aptos" w:hAnsi="Aptos"/>
-          <w:sz w:val="22"/>
-        </w:rPr>
-      </w:pPr>
-      <w:r>
-        <w:rPr>
-          <w:rFonts w:ascii="Aptos" w:hAnsi="Aptos"/>
-          <w:sz w:val="22"/>
-        </w:rPr>
-        <w:t>Include PR creation in the bug request when code changes are expected:</w:t>
-      </w:r>
-    </w:p>
-    <w:p>
-      <w:pPr>
-        <w:spacing w:after="120"/>
-        <w:ind w:left="360"/>
-        <w:rPr>
-          <w:rFonts w:ascii="Consolas" w:hAnsi="Consolas"/>
-          <w:sz w:val="18"/>
-        </w:rPr>
-      </w:pPr>
-      <w:r>
-        <w:rPr>
-          <w:rFonts w:ascii="Consolas" w:hAnsi="Consolas"/>
-          <w:sz w:val="18"/>
-        </w:rPr>
-        <w:t>Finish the required validation and create or update the pull request using my authorized developer account. Do not stop after local validation.</w:t>
-      </w:r>
-    </w:p>
-    <w:p>
-      <w:pPr>
-        <w:spacing w:after="120"/>
-        <w:rPr>
-          <w:rFonts w:ascii="Aptos" w:hAnsi="Aptos"/>
-          <w:sz w:val="22"/>
-        </w:rPr>
-      </w:pPr>
-      <w:r>
-        <w:rPr>
-          <w:rFonts w:ascii="Aptos" w:hAnsi="Aptos"/>
-          <w:sz w:val="22"/>
-        </w:rPr>
-        <w:t>Check progress from chat:</w:t>
-      </w:r>
-    </w:p>
-    <w:p>
-      <w:pPr>
-        <w:spacing w:after="120"/>
-        <w:ind w:left="360"/>
-        <w:rPr>
-          <w:rFonts w:ascii="Consolas" w:hAnsi="Consolas"/>
-          <w:sz w:val="18"/>
-        </w:rPr>
-      </w:pPr>
-      <w:r>
-        <w:rPr>
-          <w:rFonts w:ascii="Consolas" w:hAnsi="Consolas"/>
-          <w:sz w:val="18"/>
-        </w:rPr>
-        <w:t>show pull request</w:t>
-      </w:r>
-    </w:p>
-    <w:p>
-      <w:pPr>
-        <w:spacing w:after="120"/>
-        <w:ind w:left="360"/>
-        <w:rPr>
-          <w:rFonts w:ascii="Consolas" w:hAnsi="Consolas"/>
-          <w:sz w:val="18"/>
-        </w:rPr>
-      </w:pPr>
-      <w:r>
-        <w:rPr>
-          <w:rFonts w:ascii="Consolas" w:hAnsi="Consolas"/>
-          <w:sz w:val="18"/>
-        </w:rPr>
-        <w:t>show status</w:t>
-      </w:r>
-    </w:p>
-    <w:p>
-      <w:pPr>
-        <w:spacing w:after="120"/>
-        <w:rPr>
-          <w:rFonts w:ascii="Aptos" w:hAnsi="Aptos"/>
-          <w:sz w:val="22"/>
-        </w:rPr>
-      </w:pPr>
-      <w:r>
-        <w:rPr>
-          <w:rFonts w:ascii="Aptos" w:hAnsi="Aptos"/>
-          <w:sz w:val="22"/>
-        </w:rPr>
-        <w:lastRenderedPageBreak/>
-        <w:t>Validation-only mode must not edit source, commit, push, or change the pull request.</w:t>
-      </w:r>
-    </w:p>
-    <w:p>
-      <w:pPr>
-        <w:spacing w:after="120"/>
-        <w:rPr>
-          <w:rFonts w:ascii="Aptos" w:eastAsiaTheme="majorEastAsia" w:hAnsi="Aptos" w:cstheme="majorBidi"/>
-          <w:color w:val="0F4761" w:themeColor="accent1" w:themeShade="BF"/>
-          <w:sz w:val="22"/>
-          <w:szCs w:val="40"/>
-        </w:rPr>
-      </w:pPr>
-      <w:r>
-        <w:rPr>
-          <w:rFonts w:ascii="Aptos" w:eastAsiaTheme="majorEastAsia" w:hAnsi="Aptos" w:cstheme="majorBidi"/>
-          <w:color w:val="0F4761" w:themeColor="accent1" w:themeShade="BF"/>
-          <w:sz w:val="22"/>
-          <w:szCs w:val="40"/>
-        </w:rPr>
-        <w:t>10. Keep localhost running for manual testing</w:t>
-      </w:r>
-    </w:p>
-    <w:p>
-      <w:pPr>
-        <w:spacing w:after="120"/>
-        <w:rPr>
-          <w:rFonts w:ascii="Aptos" w:hAnsi="Aptos"/>
-          <w:sz w:val="22"/>
-        </w:rPr>
-      </w:pPr>
-      <w:r>
-        <w:rPr>
-          <w:rFonts w:ascii="Aptos" w:hAnsi="Aptos"/>
-          <w:sz w:val="22"/>
-        </w:rPr>
-        <w:t>By default, FixLab stops only the frontend and backend processes it started when the job finishes. To keep them available, say:</w:t>
-      </w:r>
-    </w:p>
-    <w:p>
-      <w:pPr>
-        <w:spacing w:after="120"/>
-        <w:ind w:left="360"/>
-        <w:rPr>
-          <w:rFonts w:ascii="Consolas" w:hAnsi="Consolas"/>
-          <w:sz w:val="18"/>
-        </w:rPr>
-      </w:pPr>
-      <w:r>
-        <w:rPr>
-          <w:rFonts w:ascii="Consolas" w:hAnsi="Consolas"/>
-          <w:sz w:val="18"/>
-        </w:rPr>
-        <w:t>Keep the frontend localhost running with hot reload after validation so I can test it manually. If the UI requires the .NET backend, keep that FixLab-owned backend running too until I confirm testing is complete.</w:t>
-      </w:r>
-    </w:p>
-    <w:p>
-      <w:pPr>
-        <w:spacing w:after="120"/>
-        <w:rPr>
-          <w:rFonts w:ascii="Aptos" w:hAnsi="Aptos"/>
-          <w:sz w:val="22"/>
-        </w:rPr>
-      </w:pPr>
-      <w:r>
-        <w:rPr>
-          <w:rFonts w:ascii="Aptos" w:hAnsi="Aptos"/>
-          <w:sz w:val="22"/>
-        </w:rPr>
-        <w:t>The dashboard also provides Hold after Playwright for manual local testing.</w:t>
-      </w:r>
-    </w:p>
-    <w:p>
-      <w:pPr>
-        <w:spacing w:after="120"/>
-        <w:ind w:left="360"/>
-        <w:rPr>
-          <w:rFonts w:ascii="Aptos" w:eastAsiaTheme="majorEastAsia" w:hAnsi="Aptos" w:cstheme="majorBidi"/>
-          <w:color w:val="0F4761" w:themeColor="accent1" w:themeShade="BF"/>
-          <w:sz w:val="22"/>
-          <w:szCs w:val="40"/>
-        </w:rPr>
-      </w:pPr>
-      <w:r>
-        <w:rPr>
-          <w:rFonts w:ascii="Aptos" w:eastAsiaTheme="majorEastAsia" w:hAnsi="Aptos" w:cstheme="majorBidi"/>
-          <w:color w:val="0F4761" w:themeColor="accent1" w:themeShade="BF"/>
-          <w:sz w:val="22"/>
-          <w:szCs w:val="40"/>
-        </w:rPr>
-        <w:t>11. Recover an interrupted job</w:t>
-      </w:r>
-    </w:p>
-    <w:p>
-      <w:pPr>
-        <w:spacing w:after="120"/>
-        <w:ind w:left="360"/>
-        <w:rPr>
-          <w:rFonts w:ascii="Consolas" w:hAnsi="Consolas"/>
-          <w:sz w:val="18"/>
-        </w:rPr>
-      </w:pPr>
-      <w:r>
-        <w:rPr>
-          <w:rFonts w:ascii="Consolas" w:hAnsi="Consolas"/>
-          <w:sz w:val="18"/>
-        </w:rPr>
-        <w:t>Continue the same job, preserve existing changes, finish all required validation, and create or update the PR.</w:t>
-      </w:r>
-    </w:p>
-    <w:p>
-      <w:pPr>
-        <w:spacing w:after="120"/>
-        <w:rPr>
-          <w:rFonts w:ascii="Aptos" w:hAnsi="Aptos"/>
-          <w:sz w:val="22"/>
-        </w:rPr>
-      </w:pPr>
-      <w:r>
-        <w:rPr>
-          <w:rFonts w:ascii="Aptos" w:hAnsi="Aptos"/>
-          <w:sz w:val="22"/>
-        </w:rPr>
-        <w:t>Use retry only when the current executor cannot safely resume. FixLab must preserve the worktree and must not discard prior changes.</w:t>
-      </w:r>
-    </w:p>
-    <w:p>
-      <w:pPr>
-        <w:spacing w:after="120"/>
-        <w:rPr>
-          <w:rFonts w:ascii="Aptos" w:eastAsiaTheme="majorEastAsia" w:hAnsi="Aptos" w:cstheme="majorBidi"/>
-          <w:color w:val="0F4761" w:themeColor="accent1" w:themeShade="BF"/>
-          <w:sz w:val="22"/>
-          <w:szCs w:val="40"/>
-        </w:rPr>
-      </w:pPr>
-      <w:r>
-        <w:rPr>
-          <w:rFonts w:ascii="Aptos" w:eastAsiaTheme="majorEastAsia" w:hAnsi="Aptos" w:cstheme="majorBidi"/>
-          <w:color w:val="0F4761" w:themeColor="accent1" w:themeShade="BF"/>
-          <w:sz w:val="22"/>
-          <w:szCs w:val="40"/>
-        </w:rPr>
-        <w:t>12. Expected completion evidence</w:t>
-      </w:r>
-    </w:p>
-    <w:p>
-      <w:pPr>
-        <w:spacing w:after="120"/>
-        <w:rPr>
-          <w:rFonts w:ascii="Aptos" w:hAnsi="Aptos"/>
-          <w:sz w:val="22"/>
-        </w:rPr>
-      </w:pPr>
-      <w:r>
-        <w:rPr>
-          <w:rFonts w:ascii="Aptos" w:hAnsi="Aptos"/>
-          <w:sz w:val="22"/>
-        </w:rPr>
-        <w:t>- Focused tests and required build/type-check results.</w:t>
-      </w:r>
-    </w:p>
-    <w:p>
-      <w:pPr>
-        <w:spacing w:after="120"/>
-        <w:rPr>
-          <w:rFonts w:ascii="Aptos" w:hAnsi="Aptos"/>
-          <w:sz w:val="22"/>
-        </w:rPr>
-      </w:pPr>
-      <w:r>
-        <w:rPr>
-          <w:rFonts w:ascii="Aptos" w:hAnsi="Aptos"/>
-          <w:sz w:val="22"/>
-        </w:rPr>
-        <w:t>- Explicit pass, failure, skipped, blocked, or timeout status for every required gate.</w:t>
-      </w:r>
-    </w:p>
-    <w:p>
-      <w:pPr>
-        <w:spacing w:after="120"/>
-        <w:rPr>
-          <w:rFonts w:ascii="Aptos" w:hAnsi="Aptos"/>
-          <w:sz w:val="22"/>
-        </w:rPr>
-      </w:pPr>
-      <w:r>
-        <w:rPr>
-          <w:rFonts w:ascii="Aptos" w:hAnsi="Aptos"/>
-          <w:sz w:val="22"/>
-        </w:rPr>
         <w:t>- Non-sensitive Playwright screenshots or API assertions when required.</w:t>
       </w:r>
     </w:p>
@@ -1720,21 +1801,9 @@
     </w:p>
     <w:p>
       <w:pPr>
-        <w:spacing w:after="120"/>
-        <w:rPr>
-          <w:rFonts w:ascii="Aptos" w:eastAsiaTheme="majorEastAsia" w:hAnsi="Aptos" w:cstheme="majorBidi"/>
-          <w:color w:val="0F4761" w:themeColor="accent1" w:themeShade="BF"/>
-          <w:sz w:val="22"/>
-          <w:szCs w:val="40"/>
-        </w:rPr>
-      </w:pPr>
-      <w:r>
-        <w:rPr>
-          <w:rFonts w:ascii="Aptos" w:eastAsiaTheme="majorEastAsia" w:hAnsi="Aptos" w:cstheme="majorBidi"/>
-          <w:color w:val="0F4761" w:themeColor="accent1" w:themeShade="BF"/>
-          <w:sz w:val="22"/>
-          <w:szCs w:val="40"/>
-        </w:rPr>
+        <w:pStyle w:val="Heading1"/>
+      </w:pPr>
+      <w:r>
         <w:t>13. Troubleshooting</w:t>
       </w:r>
     </w:p>
@@ -1896,7 +1965,6 @@
           <w:rFonts w:ascii="Aptos" w:hAnsi="Aptos"/>
           <w:sz w:val="22"/>
         </w:rPr>
-        <w:lastRenderedPageBreak/>
         <w:t>Detailed installation: docs/installation.md</w:t>
       </w:r>
     </w:p>

</xml_diff>

<commit_message>
Document separate repository onboarding
Explain how to onboard combined React and .NET repositories from their common root and how to configure separate frontend and backend repositories with independent profiles and pull requests.

Co-authored-by: Copilot <223556219+Copilot@users.noreply.github.com>

Copilot-Session: 9168917c-fadb-448b-afda-9613a02dd02d
</commit_message>
<xml_diff>
--- a/docs/FixLab-Installation-and-Smoke-Test.docx
+++ b/docs/FixLab-Installation-and-Smoke-Test.docx
@@ -416,6 +416,7 @@
           <w:sz w:val="22"/>
           <w:szCs w:val="40"/>
         </w:rPr>
+        <w:lastRenderedPageBreak/>
         <w:t>Start Copilot CLI from the repository and select the FixLab agent:</w:t>
       </w:r>
     </w:p>
@@ -437,7 +438,6 @@
           <w:sz w:val="22"/>
           <w:szCs w:val="40"/>
         </w:rPr>
-        <w:lastRenderedPageBreak/>
         <w:t>copilot --agent fixlab:fixlab</w:t>
       </w:r>
     </w:p>
@@ -794,6 +794,7 @@
         <w:pStyle w:val="Heading1"/>
       </w:pPr>
       <w:r>
+        <w:lastRenderedPageBreak/>
         <w:t>5. Onboard a React frontend and .NET backend</w:t>
       </w:r>
     </w:p>
@@ -827,296 +828,601 @@
           <w:rFonts w:ascii="Consolas" w:hAnsi="Consolas"/>
           <w:sz w:val="18"/>
         </w:rPr>
+        <w:t>Onboard this repository for FixLab. Inspect the React frontend and .NET backend, reuse existing repository commands, configure restore, test, lint, build, startup, ports, health checks, Playwright, authentication, safe environments, and pull-request settings. Explain missing configuration and ask before running setup commands, then run doctor.</w:t>
+      </w:r>
+    </w:p>
+    <w:p>
+      <w:pPr>
+        <w:spacing w:after="120"/>
+        <w:rPr>
+          <w:rFonts w:ascii="Aptos" w:hAnsi="Aptos"/>
+          <w:sz w:val="22"/>
+        </w:rPr>
+      </w:pPr>
+      <w:r>
+        <w:rPr>
+          <w:rFonts w:ascii="Aptos" w:hAnsi="Aptos"/>
+          <w:sz w:val="22"/>
+        </w:rPr>
+        <w:t>Recommended first-run setup prompt for either Copilot or Agency:</w:t>
+      </w:r>
+    </w:p>
+    <w:p>
+      <w:pPr>
+        <w:spacing w:after="120"/>
+        <w:rPr>
+          <w:rFonts w:ascii="Aptos" w:hAnsi="Aptos"/>
+          <w:sz w:val="22"/>
+        </w:rPr>
+      </w:pPr>
+      <w:r>
+        <w:rPr>
+          <w:rFonts w:ascii="Aptos" w:hAnsi="Aptos"/>
+          <w:sz w:val="22"/>
+        </w:rPr>
+        <w:t>Inspect this repository and configure FixLab for its React frontend and .NET backend. Show me the proposed profile and setup plan first. After I approve, restore repository dependencies, install and configure repository-local Playwright and its required browser, configure the repository-owned authentication command without storing secrets, verify frontend and backend startup and health checks, run fixlab doctor, and ask whether to start the dashboard.</w:t>
+      </w:r>
+    </w:p>
+    <w:p>
+      <w:pPr>
+        <w:spacing w:after="120"/>
+        <w:rPr>
+          <w:rFonts w:ascii="Aptos" w:hAnsi="Aptos"/>
+          <w:sz w:val="22"/>
+        </w:rPr>
+      </w:pPr>
+      <w:r>
+        <w:rPr>
+          <w:rFonts w:ascii="Aptos" w:hAnsi="Aptos"/>
+          <w:sz w:val="22"/>
+        </w:rPr>
+        <w:t>Start the same workflow through Copilot:</w:t>
+      </w:r>
+    </w:p>
+    <w:p>
+      <w:pPr>
+        <w:spacing w:after="120"/>
+        <w:rPr>
+          <w:rFonts w:ascii="Aptos" w:hAnsi="Aptos"/>
+          <w:sz w:val="22"/>
+        </w:rPr>
+      </w:pPr>
+      <w:r>
+        <w:rPr>
+          <w:rFonts w:ascii="Aptos" w:hAnsi="Aptos"/>
+          <w:sz w:val="22"/>
+        </w:rPr>
+        <w:t>copilot --agent fixlab:fixlab</w:t>
+      </w:r>
+    </w:p>
+    <w:p>
+      <w:pPr>
+        <w:spacing w:after="120"/>
+        <w:rPr>
+          <w:rFonts w:ascii="Aptos" w:hAnsi="Aptos"/>
+          <w:sz w:val="22"/>
+        </w:rPr>
+      </w:pPr>
+      <w:r>
+        <w:rPr>
+          <w:rFonts w:ascii="Aptos" w:hAnsi="Aptos"/>
+          <w:sz w:val="22"/>
+        </w:rPr>
+        <w:t>Or through the Agency-backed FixLab shell:</w:t>
+      </w:r>
+    </w:p>
+    <w:p>
+      <w:pPr>
+        <w:spacing w:after="120"/>
+        <w:rPr>
+          <w:rFonts w:ascii="Aptos" w:hAnsi="Aptos"/>
+          <w:sz w:val="22"/>
+        </w:rPr>
+      </w:pPr>
+      <w:r>
+        <w:rPr>
+          <w:rFonts w:ascii="Aptos" w:hAnsi="Aptos"/>
+          <w:sz w:val="22"/>
+        </w:rPr>
+        <w:t>fixlab C:\source\application --runtime agency</w:t>
+      </w:r>
+    </w:p>
+    <w:p>
+      <w:pPr>
+        <w:spacing w:after="120"/>
+        <w:rPr>
+          <w:rFonts w:ascii="Aptos" w:hAnsi="Aptos"/>
+          <w:sz w:val="22"/>
+        </w:rPr>
+      </w:pPr>
+      <w:r>
+        <w:rPr>
+          <w:rFonts w:ascii="Aptos" w:hAnsi="Aptos"/>
+          <w:sz w:val="22"/>
+        </w:rPr>
+        <w:t>The first run is plan-first. If the repository profile is new, review and complete it before approving installation. After approval, the agent may run:</w:t>
+      </w:r>
+    </w:p>
+    <w:p>
+      <w:pPr>
+        <w:spacing w:after="120"/>
+        <w:rPr>
+          <w:rFonts w:ascii="Aptos" w:hAnsi="Aptos"/>
+          <w:sz w:val="22"/>
+        </w:rPr>
+      </w:pPr>
+      <w:r>
+        <w:rPr>
+          <w:rFonts w:ascii="Aptos" w:hAnsi="Aptos"/>
+          <w:sz w:val="22"/>
+        </w:rPr>
+        <w:t>fixlab prepare --yes</w:t>
+      </w:r>
+    </w:p>
+    <w:p>
+      <w:pPr>
+        <w:spacing w:after="120"/>
+        <w:rPr>
+          <w:rFonts w:ascii="Aptos" w:hAnsi="Aptos"/>
+          <w:sz w:val="22"/>
+        </w:rPr>
+      </w:pPr>
+      <w:r>
+        <w:rPr>
+          <w:rFonts w:ascii="Aptos" w:hAnsi="Aptos"/>
+          <w:sz w:val="22"/>
+        </w:rPr>
+        <w:t>fixlab setup-playwright --yes</w:t>
+      </w:r>
+    </w:p>
+    <w:p>
+      <w:pPr>
+        <w:spacing w:after="120"/>
+        <w:rPr>
+          <w:rFonts w:ascii="Aptos" w:hAnsi="Aptos"/>
+          <w:sz w:val="22"/>
+        </w:rPr>
+      </w:pPr>
+      <w:r>
+        <w:rPr>
+          <w:rFonts w:ascii="Aptos" w:hAnsi="Aptos"/>
+          <w:sz w:val="22"/>
+        </w:rPr>
+        <w:t>fixlab authenticate</w:t>
+      </w:r>
+    </w:p>
+    <w:p>
+      <w:pPr>
+        <w:spacing w:after="120"/>
+        <w:rPr>
+          <w:rFonts w:ascii="Aptos" w:hAnsi="Aptos"/>
+          <w:sz w:val="22"/>
+        </w:rPr>
+      </w:pPr>
+      <w:r>
+        <w:rPr>
+          <w:rFonts w:ascii="Aptos" w:hAnsi="Aptos"/>
+          <w:sz w:val="22"/>
+        </w:rPr>
+        <w:t>fixlab doctor</w:t>
+      </w:r>
+    </w:p>
+    <w:p>
+      <w:pPr>
+        <w:spacing w:after="120"/>
+        <w:rPr>
+          <w:rFonts w:ascii="Aptos" w:hAnsi="Aptos"/>
+          <w:sz w:val="22"/>
+        </w:rPr>
+      </w:pPr>
+      <w:r>
+        <w:rPr>
+          <w:rFonts w:ascii="Aptos" w:hAnsi="Aptos"/>
+          <w:sz w:val="22"/>
+        </w:rPr>
+        <w:t>fixlab dashboard</w:t>
+      </w:r>
+    </w:p>
+    <w:p>
+      <w:pPr>
+        <w:spacing w:after="120"/>
+        <w:rPr>
+          <w:rFonts w:ascii="Aptos" w:hAnsi="Aptos"/>
+          <w:sz w:val="22"/>
+        </w:rPr>
+      </w:pPr>
+      <w:r>
+        <w:rPr>
+          <w:rFonts w:ascii="Aptos" w:hAnsi="Aptos"/>
+          <w:sz w:val="22"/>
+        </w:rPr>
+        <w:t>Playwright is installed in the application repository, not inside GitHub Copilot or Agency. FixLab verifies the configured package, browser, authentication state, startup commands, and test command before live validation.</w:t>
+      </w:r>
+    </w:p>
+    <w:p>
+      <w:pPr>
+        <w:spacing w:after="120"/>
+        <w:rPr>
+          <w:rFonts w:ascii="Aptos" w:hAnsi="Aptos"/>
+          <w:sz w:val="22"/>
+        </w:rPr>
+      </w:pPr>
+      <w:r>
+        <w:rPr>
+          <w:rFonts w:ascii="Aptos" w:hAnsi="Aptos"/>
+          <w:sz w:val="22"/>
+        </w:rPr>
+        <w:t>FixLab inspects repository-owned files such as package.json, lockfiles, solution and project files, global.json, launchSettings.json, Playwright configuration, CI definitions, local-development documentation, and repository instructions.</w:t>
+      </w:r>
+    </w:p>
+    <w:p>
+      <w:pPr>
+        <w:spacing w:after="120"/>
+        <w:rPr>
+          <w:rFonts w:ascii="Aptos" w:hAnsi="Aptos"/>
+          <w:sz w:val="22"/>
+        </w:rPr>
+      </w:pPr>
+      <w:r>
+        <w:rPr>
+          <w:rFonts w:ascii="Aptos" w:hAnsi="Aptos"/>
+          <w:sz w:val="22"/>
+        </w:rPr>
+        <w:t>- Frontend-only repository: configure only the React application and do not invent a backend.</w:t>
+      </w:r>
+    </w:p>
+    <w:p>
+      <w:pPr>
+        <w:spacing w:after="120"/>
+        <w:rPr>
+          <w:rFonts w:ascii="Aptos" w:hAnsi="Aptos"/>
+          <w:sz w:val="22"/>
+        </w:rPr>
+      </w:pPr>
+      <w:r>
+        <w:rPr>
+          <w:rFonts w:ascii="Aptos" w:hAnsi="Aptos"/>
+          <w:sz w:val="22"/>
+        </w:rPr>
+        <w:t>- Combined repository: configure frontend and backend commands independently.</w:t>
+      </w:r>
+    </w:p>
+    <w:p>
+      <w:pPr>
+        <w:spacing w:after="120"/>
+        <w:rPr>
+          <w:rFonts w:ascii="Aptos" w:hAnsi="Aptos"/>
+          <w:sz w:val="22"/>
+        </w:rPr>
+      </w:pPr>
+      <w:r>
+        <w:rPr>
+          <w:rFonts w:ascii="Aptos" w:hAnsi="Aptos"/>
+          <w:sz w:val="22"/>
+        </w:rPr>
+        <w:t>- Separate frontend and backend repositories: onboard each repository separately.</w:t>
+      </w:r>
+    </w:p>
+    <w:p>
+      <w:pPr>
+        <w:pStyle w:val="Heading2"/>
+      </w:pPr>
+      <w:r>
+        <w:t>Repository layout choices</w:t>
+      </w:r>
+    </w:p>
+    <w:p>
+      <w:pPr>
+        <w:spacing w:after="120"/>
+        <w:rPr>
+          <w:rFonts w:ascii="Aptos" w:hAnsi="Aptos"/>
+          <w:sz w:val="22"/>
+        </w:rPr>
+      </w:pPr>
+      <w:r>
+        <w:rPr>
+          <w:rFonts w:ascii="Aptos" w:hAnsi="Aptos"/>
+          <w:sz w:val="22"/>
+        </w:rPr>
+        <w:t>If the React frontend and .NET backend are in the same Git repository, start FixLab from their common repository root so one profile can describe both components:</w:t>
+      </w:r>
+    </w:p>
+    <w:p>
+      <w:pPr>
+        <w:spacing w:after="120"/>
+        <w:rPr>
+          <w:rFonts w:ascii="Aptos" w:hAnsi="Aptos"/>
+          <w:sz w:val="22"/>
+        </w:rPr>
+      </w:pPr>
+      <w:r>
+        <w:rPr>
+          <w:rFonts w:ascii="Aptos" w:hAnsi="Aptos"/>
+          <w:sz w:val="22"/>
+        </w:rPr>
+        <w:t>cd C:\source\combined-repository</w:t>
+      </w:r>
+    </w:p>
+    <w:p>
+      <w:pPr>
+        <w:spacing w:after="120"/>
+        <w:rPr>
+          <w:rFonts w:ascii="Aptos" w:hAnsi="Aptos"/>
+          <w:sz w:val="22"/>
+        </w:rPr>
+      </w:pPr>
+      <w:r>
+        <w:rPr>
+          <w:rFonts w:ascii="Aptos" w:hAnsi="Aptos"/>
+          <w:sz w:val="22"/>
+        </w:rPr>
+        <w:t>copilot --agent fixlab:fixlab</w:t>
+      </w:r>
+    </w:p>
+    <w:p>
+      <w:pPr>
+        <w:spacing w:after="120"/>
+        <w:rPr>
+          <w:rFonts w:ascii="Aptos" w:hAnsi="Aptos"/>
+          <w:sz w:val="22"/>
+        </w:rPr>
+      </w:pPr>
+      <w:r>
+        <w:rPr>
+          <w:rFonts w:ascii="Aptos" w:hAnsi="Aptos"/>
+          <w:sz w:val="22"/>
+        </w:rPr>
+        <w:t>Do not start from only the frontend subdirectory when the backend is part of the same repository.</w:t>
+      </w:r>
+    </w:p>
+    <w:p>
+      <w:pPr>
+        <w:spacing w:after="120"/>
+        <w:rPr>
+          <w:rFonts w:ascii="Aptos" w:hAnsi="Aptos"/>
+          <w:sz w:val="22"/>
+        </w:rPr>
+      </w:pPr>
+      <w:r>
+        <w:rPr>
+          <w:rFonts w:ascii="Aptos" w:hAnsi="Aptos"/>
+          <w:sz w:val="22"/>
+        </w:rPr>
+        <w:t>If the frontend and backend are different Git repositories, onboard them separately.</w:t>
+      </w:r>
+    </w:p>
+    <w:p>
+      <w:pPr>
+        <w:spacing w:after="120"/>
+        <w:rPr>
+          <w:rFonts w:ascii="Aptos" w:hAnsi="Aptos"/>
+          <w:sz w:val="22"/>
+        </w:rPr>
+      </w:pPr>
+      <w:r>
+        <w:rPr>
+          <w:rFonts w:ascii="Aptos" w:hAnsi="Aptos"/>
+          <w:sz w:val="22"/>
+        </w:rPr>
+        <w:t>Frontend repository:</w:t>
+      </w:r>
+    </w:p>
+    <w:p>
+      <w:pPr>
+        <w:spacing w:after="120"/>
+        <w:rPr>
+          <w:rFonts w:ascii="Aptos" w:hAnsi="Aptos"/>
+          <w:sz w:val="22"/>
+        </w:rPr>
+      </w:pPr>
+      <w:r>
+        <w:rPr>
+          <w:rFonts w:ascii="Aptos" w:hAnsi="Aptos"/>
+          <w:sz w:val="22"/>
+        </w:rPr>
+        <w:t>cd C:\source\frontend-repository</w:t>
+      </w:r>
+    </w:p>
+    <w:p>
+      <w:pPr>
+        <w:spacing w:after="120"/>
+        <w:rPr>
+          <w:rFonts w:ascii="Aptos" w:hAnsi="Aptos"/>
+          <w:sz w:val="22"/>
+        </w:rPr>
+      </w:pPr>
+      <w:r>
+        <w:rPr>
+          <w:rFonts w:ascii="Aptos" w:hAnsi="Aptos"/>
+          <w:sz w:val="22"/>
+        </w:rPr>
+        <w:t>copilot --agent fixlab:fixlab</w:t>
+      </w:r>
+    </w:p>
+    <w:p>
+      <w:pPr>
+        <w:spacing w:after="120"/>
+        <w:rPr>
+          <w:rFonts w:ascii="Aptos" w:hAnsi="Aptos"/>
+          <w:sz w:val="22"/>
+        </w:rPr>
+      </w:pPr>
+      <w:r>
+        <w:rPr>
+          <w:rFonts w:ascii="Aptos" w:hAnsi="Aptos"/>
+          <w:sz w:val="22"/>
+        </w:rPr>
+        <w:t>Prompt: Onboard this React frontend repository for FixLab. Configure its tests, build, startup, Playwright, authentication, and environments.</w:t>
+      </w:r>
+    </w:p>
+    <w:p>
+      <w:pPr>
+        <w:spacing w:after="120"/>
+        <w:rPr>
+          <w:rFonts w:ascii="Aptos" w:hAnsi="Aptos"/>
+          <w:sz w:val="22"/>
+        </w:rPr>
+      </w:pPr>
+      <w:r>
+        <w:rPr>
+          <w:rFonts w:ascii="Aptos" w:hAnsi="Aptos"/>
+          <w:sz w:val="22"/>
+        </w:rPr>
+        <w:t>Backend repository:</w:t>
+      </w:r>
+    </w:p>
+    <w:p>
+      <w:pPr>
+        <w:spacing w:after="120"/>
+        <w:rPr>
+          <w:rFonts w:ascii="Aptos" w:hAnsi="Aptos"/>
+          <w:sz w:val="22"/>
+        </w:rPr>
+      </w:pPr>
+      <w:r>
+        <w:rPr>
+          <w:rFonts w:ascii="Aptos" w:hAnsi="Aptos"/>
+          <w:sz w:val="22"/>
+        </w:rPr>
+        <w:t>cd C:\source\backend-repository</w:t>
+      </w:r>
+    </w:p>
+    <w:p>
+      <w:pPr>
+        <w:spacing w:after="120"/>
+        <w:rPr>
+          <w:rFonts w:ascii="Aptos" w:hAnsi="Aptos"/>
+          <w:sz w:val="22"/>
+        </w:rPr>
+      </w:pPr>
+      <w:r>
+        <w:rPr>
+          <w:rFonts w:ascii="Aptos" w:hAnsi="Aptos"/>
+          <w:sz w:val="22"/>
+        </w:rPr>
+        <w:t>copilot --agent fixlab:fixlab</w:t>
+      </w:r>
+    </w:p>
+    <w:p>
+      <w:pPr>
+        <w:spacing w:after="120"/>
+        <w:rPr>
+          <w:rFonts w:ascii="Aptos" w:hAnsi="Aptos"/>
+          <w:sz w:val="22"/>
+        </w:rPr>
+      </w:pPr>
+      <w:r>
+        <w:rPr>
+          <w:rFonts w:ascii="Aptos" w:hAnsi="Aptos"/>
+          <w:sz w:val="22"/>
+        </w:rPr>
+        <w:t>Prompt: Onboard this .NET backend repository for FixLab. Configure restore, tests, build, startup, ports, health checks, and environments.</w:t>
+      </w:r>
+    </w:p>
+    <w:p>
+      <w:pPr>
+        <w:spacing w:after="120"/>
+        <w:rPr>
+          <w:rFonts w:ascii="Aptos" w:hAnsi="Aptos"/>
+          <w:sz w:val="22"/>
+        </w:rPr>
+      </w:pPr>
+      <w:r>
+        <w:rPr>
+          <w:rFonts w:ascii="Aptos" w:hAnsi="Aptos"/>
+          <w:sz w:val="22"/>
+        </w:rPr>
+        <w:t>Each repository receives its own .github\fixlab\repository-profile.json, branch, validation results, dashboard job, and pull request.</w:t>
+      </w:r>
+    </w:p>
+    <w:p>
+      <w:pPr>
+        <w:spacing w:after="120"/>
+        <w:rPr>
+          <w:rFonts w:ascii="Aptos" w:hAnsi="Aptos"/>
+          <w:sz w:val="22"/>
+        </w:rPr>
+      </w:pPr>
+      <w:r>
+        <w:rPr>
+          <w:rFonts w:ascii="Aptos" w:hAnsi="Aptos"/>
+          <w:sz w:val="22"/>
+        </w:rPr>
+        <w:t>For a bug that spans both repositories, run one FixLab session for each repository and provide the same shared API and UI scenario. Keep frontend and backend changes in separate pull requests unless the organization has an approved coordinated multi-repository workflow.</w:t>
+      </w:r>
+    </w:p>
+    <w:p>
+      <w:pPr>
+        <w:spacing w:after="120"/>
+        <w:rPr>
+          <w:rFonts w:ascii="Aptos" w:hAnsi="Aptos"/>
+          <w:sz w:val="22"/>
+        </w:rPr>
+      </w:pPr>
+      <w:r>
+        <w:rPr>
+          <w:rFonts w:ascii="Aptos" w:hAnsi="Aptos"/>
+          <w:sz w:val="22"/>
+        </w:rPr>
+        <w:t>- Never place credentials, tokens, cookies, browser-state contents, customer data, or production endpoints in the FixLab profile.</w:t>
+      </w:r>
+    </w:p>
+    <w:p>
+      <w:pPr>
+        <w:pStyle w:val="Heading1"/>
+      </w:pPr>
+      <w:r>
         <w:lastRenderedPageBreak/>
-        <w:t>Onboard this repository for FixLab. Inspect the React frontend and .NET backend, reuse existing repository commands, configure restore, test, lint, build, startup, ports, health checks, Playwright, authentication, safe environments, and pull-request settings. Explain missing configuration and ask before running setup commands, then run doctor.</w:t>
-      </w:r>
-    </w:p>
-    <w:p>
-      <w:pPr>
-        <w:spacing w:after="120"/>
-        <w:rPr>
-          <w:rFonts w:ascii="Aptos" w:hAnsi="Aptos"/>
-          <w:sz w:val="22"/>
-        </w:rPr>
-      </w:pPr>
-      <w:r>
-        <w:rPr>
-          <w:rFonts w:ascii="Aptos" w:hAnsi="Aptos"/>
-          <w:sz w:val="22"/>
-        </w:rPr>
-        <w:t>Recommended first-run setup prompt for either Copilot or Agency:</w:t>
-      </w:r>
-    </w:p>
-    <w:p>
-      <w:pPr>
-        <w:spacing w:after="120"/>
-        <w:rPr>
-          <w:rFonts w:ascii="Aptos" w:hAnsi="Aptos"/>
-          <w:sz w:val="22"/>
-        </w:rPr>
-      </w:pPr>
-      <w:r>
-        <w:rPr>
-          <w:rFonts w:ascii="Aptos" w:hAnsi="Aptos"/>
-          <w:sz w:val="22"/>
-        </w:rPr>
-        <w:t>Inspect this repository and configure FixLab for its React frontend and .NET backend. Show me the proposed profile and setup plan first. After I approve, restore repository dependencies, install and configure repository-local Playwright and its required browser, configure the repository-owned authentication command without storing secrets, verify frontend and backend startup and health checks, run fixlab doctor, and ask whether to start the dashboard.</w:t>
-      </w:r>
-    </w:p>
-    <w:p>
-      <w:pPr>
-        <w:spacing w:after="120"/>
-        <w:rPr>
-          <w:rFonts w:ascii="Aptos" w:hAnsi="Aptos"/>
-          <w:sz w:val="22"/>
-        </w:rPr>
-      </w:pPr>
-      <w:r>
-        <w:rPr>
-          <w:rFonts w:ascii="Aptos" w:hAnsi="Aptos"/>
-          <w:sz w:val="22"/>
-        </w:rPr>
-        <w:t>Start the same workflow through Copilot:</w:t>
-      </w:r>
-    </w:p>
-    <w:p>
-      <w:pPr>
-        <w:spacing w:after="120"/>
-        <w:rPr>
-          <w:rFonts w:ascii="Aptos" w:hAnsi="Aptos"/>
-          <w:sz w:val="22"/>
-        </w:rPr>
-      </w:pPr>
-      <w:r>
-        <w:rPr>
-          <w:rFonts w:ascii="Aptos" w:hAnsi="Aptos"/>
-          <w:sz w:val="22"/>
-        </w:rPr>
-        <w:t>copilot --agent fixlab:fixlab</w:t>
-      </w:r>
-    </w:p>
-    <w:p>
-      <w:pPr>
-        <w:spacing w:after="120"/>
-        <w:rPr>
-          <w:rFonts w:ascii="Aptos" w:hAnsi="Aptos"/>
-          <w:sz w:val="22"/>
-        </w:rPr>
-      </w:pPr>
-      <w:r>
-        <w:rPr>
-          <w:rFonts w:ascii="Aptos" w:hAnsi="Aptos"/>
-          <w:sz w:val="22"/>
-        </w:rPr>
-        <w:t>Or through the Agency-backed FixLab shell:</w:t>
-      </w:r>
-    </w:p>
-    <w:p>
-      <w:pPr>
-        <w:spacing w:after="120"/>
-        <w:rPr>
-          <w:rFonts w:ascii="Aptos" w:hAnsi="Aptos"/>
-          <w:sz w:val="22"/>
-        </w:rPr>
-      </w:pPr>
-      <w:r>
-        <w:rPr>
-          <w:rFonts w:ascii="Aptos" w:hAnsi="Aptos"/>
-          <w:sz w:val="22"/>
-        </w:rPr>
-        <w:t>fixlab C:\source\application --runtime agency</w:t>
-      </w:r>
-    </w:p>
-    <w:p>
-      <w:pPr>
-        <w:spacing w:after="120"/>
-        <w:rPr>
-          <w:rFonts w:ascii="Aptos" w:hAnsi="Aptos"/>
-          <w:sz w:val="22"/>
-        </w:rPr>
-      </w:pPr>
-      <w:r>
-        <w:rPr>
-          <w:rFonts w:ascii="Aptos" w:hAnsi="Aptos"/>
-          <w:sz w:val="22"/>
-        </w:rPr>
-        <w:t>The first run is plan-first. If the repository profile is new, review and complete it before approving installation. After approval, the agent may run:</w:t>
-      </w:r>
-    </w:p>
-    <w:p>
-      <w:pPr>
-        <w:spacing w:after="120"/>
-        <w:rPr>
-          <w:rFonts w:ascii="Aptos" w:hAnsi="Aptos"/>
-          <w:sz w:val="22"/>
-        </w:rPr>
-      </w:pPr>
-      <w:r>
-        <w:rPr>
-          <w:rFonts w:ascii="Aptos" w:hAnsi="Aptos"/>
-          <w:sz w:val="22"/>
-        </w:rPr>
-        <w:t>fixlab prepare --yes</w:t>
-      </w:r>
-    </w:p>
-    <w:p>
-      <w:pPr>
-        <w:spacing w:after="120"/>
-        <w:rPr>
-          <w:rFonts w:ascii="Aptos" w:hAnsi="Aptos"/>
-          <w:sz w:val="22"/>
-        </w:rPr>
-      </w:pPr>
-      <w:r>
-        <w:rPr>
-          <w:rFonts w:ascii="Aptos" w:hAnsi="Aptos"/>
-          <w:sz w:val="22"/>
-        </w:rPr>
-        <w:t>fixlab setup-playwright --yes</w:t>
-      </w:r>
-    </w:p>
-    <w:p>
-      <w:pPr>
-        <w:spacing w:after="120"/>
-        <w:rPr>
-          <w:rFonts w:ascii="Aptos" w:hAnsi="Aptos"/>
-          <w:sz w:val="22"/>
-        </w:rPr>
-      </w:pPr>
-      <w:r>
-        <w:rPr>
-          <w:rFonts w:ascii="Aptos" w:hAnsi="Aptos"/>
-          <w:sz w:val="22"/>
-        </w:rPr>
-        <w:t>fixlab authenticate</w:t>
-      </w:r>
-    </w:p>
-    <w:p>
-      <w:pPr>
-        <w:spacing w:after="120"/>
-        <w:rPr>
-          <w:rFonts w:ascii="Aptos" w:hAnsi="Aptos"/>
-          <w:sz w:val="22"/>
-        </w:rPr>
-      </w:pPr>
-      <w:r>
-        <w:rPr>
-          <w:rFonts w:ascii="Aptos" w:hAnsi="Aptos"/>
-          <w:sz w:val="22"/>
-        </w:rPr>
-        <w:t>fixlab doctor</w:t>
-      </w:r>
-    </w:p>
-    <w:p>
-      <w:pPr>
-        <w:spacing w:after="120"/>
-        <w:rPr>
-          <w:rFonts w:ascii="Aptos" w:hAnsi="Aptos"/>
-          <w:sz w:val="22"/>
-        </w:rPr>
-      </w:pPr>
-      <w:r>
-        <w:rPr>
-          <w:rFonts w:ascii="Aptos" w:hAnsi="Aptos"/>
-          <w:sz w:val="22"/>
-        </w:rPr>
-        <w:t>fixlab dashboard</w:t>
-      </w:r>
-    </w:p>
-    <w:p>
-      <w:pPr>
-        <w:spacing w:after="120"/>
-        <w:rPr>
-          <w:rFonts w:ascii="Aptos" w:hAnsi="Aptos"/>
-          <w:sz w:val="22"/>
-        </w:rPr>
-      </w:pPr>
-      <w:r>
-        <w:rPr>
-          <w:rFonts w:ascii="Aptos" w:hAnsi="Aptos"/>
-          <w:sz w:val="22"/>
-        </w:rPr>
-        <w:t>Playwright is installed in the application repository, not inside GitHub Copilot or Agency. FixLab verifies the configured package, browser, authentication state, startup commands, and test command before live validation.</w:t>
-      </w:r>
-    </w:p>
-    <w:p>
-      <w:pPr>
-        <w:spacing w:after="120"/>
-        <w:rPr>
-          <w:rFonts w:ascii="Aptos" w:hAnsi="Aptos"/>
-          <w:sz w:val="22"/>
-        </w:rPr>
-      </w:pPr>
-      <w:r>
-        <w:rPr>
-          <w:rFonts w:ascii="Aptos" w:hAnsi="Aptos"/>
-          <w:sz w:val="22"/>
-        </w:rPr>
-        <w:t>FixLab inspects repository-owned files such as package.json, lockfiles, solution and project files, global.json, launchSettings.json, Playwright configuration, CI definitions, local-development documentation, and repository instructions.</w:t>
-      </w:r>
-    </w:p>
-    <w:p>
-      <w:pPr>
-        <w:spacing w:after="120"/>
-        <w:rPr>
-          <w:rFonts w:ascii="Aptos" w:hAnsi="Aptos"/>
-          <w:sz w:val="22"/>
-        </w:rPr>
-      </w:pPr>
-      <w:r>
-        <w:rPr>
-          <w:rFonts w:ascii="Aptos" w:hAnsi="Aptos"/>
-          <w:sz w:val="22"/>
-        </w:rPr>
-        <w:t>- Frontend-only repository: configure only the React application and do not invent a backend.</w:t>
-      </w:r>
-    </w:p>
-    <w:p>
-      <w:pPr>
-        <w:spacing w:after="120"/>
-        <w:rPr>
-          <w:rFonts w:ascii="Aptos" w:hAnsi="Aptos"/>
-          <w:sz w:val="22"/>
-        </w:rPr>
-      </w:pPr>
-      <w:r>
-        <w:rPr>
-          <w:rFonts w:ascii="Aptos" w:hAnsi="Aptos"/>
-          <w:sz w:val="22"/>
-        </w:rPr>
-        <w:t>- Combined repository: configure frontend and backend commands independently.</w:t>
-      </w:r>
-    </w:p>
-    <w:p>
-      <w:pPr>
-        <w:spacing w:after="120"/>
-        <w:rPr>
-          <w:rFonts w:ascii="Aptos" w:hAnsi="Aptos"/>
-          <w:sz w:val="22"/>
-        </w:rPr>
-      </w:pPr>
-      <w:r>
-        <w:rPr>
-          <w:rFonts w:ascii="Aptos" w:hAnsi="Aptos"/>
-          <w:sz w:val="22"/>
-        </w:rPr>
-        <w:t>- Separate frontend and backend repositories: onboard each repository separately.</w:t>
-      </w:r>
-    </w:p>
-    <w:p>
-      <w:pPr>
-        <w:spacing w:after="120"/>
-        <w:rPr>
-          <w:rFonts w:ascii="Aptos" w:hAnsi="Aptos"/>
-          <w:sz w:val="22"/>
-        </w:rPr>
-      </w:pPr>
-      <w:r>
-        <w:rPr>
-          <w:rFonts w:ascii="Aptos" w:hAnsi="Aptos"/>
-          <w:sz w:val="22"/>
-        </w:rPr>
-        <w:t>- Never place credentials, tokens, cookies, browser-state contents, customer data, or production endpoints in the FixLab profile.</w:t>
+        <w:t>6. Open the browser dashboard</w:t>
+      </w:r>
+    </w:p>
+    <w:p>
+      <w:pPr>
+        <w:spacing w:after="120"/>
+        <w:rPr>
+          <w:rFonts w:ascii="Aptos" w:hAnsi="Aptos"/>
+          <w:sz w:val="22"/>
+        </w:rPr>
+      </w:pPr>
+      <w:r>
+        <w:rPr>
+          <w:rFonts w:ascii="Aptos" w:hAnsi="Aptos"/>
+          <w:sz w:val="22"/>
+        </w:rPr>
+        <w:t>From chat, type:</w:t>
+      </w:r>
+    </w:p>
+    <w:p>
+      <w:pPr>
+        <w:spacing w:after="120"/>
+        <w:ind w:left="360"/>
+        <w:rPr>
+          <w:rFonts w:ascii="Consolas" w:hAnsi="Consolas"/>
+          <w:sz w:val="18"/>
+        </w:rPr>
+      </w:pPr>
+      <w:r>
+        <w:rPr>
+          <w:rFonts w:ascii="Consolas" w:hAnsi="Consolas"/>
+          <w:sz w:val="18"/>
+        </w:rPr>
+        <w:t>start dashboard</w:t>
+      </w:r>
+    </w:p>
+    <w:p>
+      <w:pPr>
+        <w:spacing w:after="120"/>
+        <w:rPr>
+          <w:rFonts w:ascii="Aptos" w:hAnsi="Aptos"/>
+          <w:sz w:val="22"/>
+        </w:rPr>
+      </w:pPr>
+      <w:r>
+        <w:rPr>
+          <w:rFonts w:ascii="Aptos" w:hAnsi="Aptos"/>
+          <w:sz w:val="22"/>
+        </w:rPr>
+        <w:t>FixLab opens the dashboard for the connected repository. The default URL is http://127.0.0.1:4317; additional repositories use another loopback port.</w:t>
       </w:r>
     </w:p>
     <w:p>
@@ -1124,56 +1430,175 @@
         <w:pStyle w:val="Heading1"/>
       </w:pPr>
       <w:r>
-        <w:t>6. Open the browser dashboard</w:t>
-      </w:r>
-    </w:p>
-    <w:p>
-      <w:pPr>
-        <w:spacing w:after="120"/>
-        <w:rPr>
-          <w:rFonts w:ascii="Aptos" w:hAnsi="Aptos"/>
-          <w:sz w:val="22"/>
-        </w:rPr>
-      </w:pPr>
-      <w:r>
-        <w:rPr>
-          <w:rFonts w:ascii="Aptos" w:hAnsi="Aptos"/>
-          <w:sz w:val="22"/>
-        </w:rPr>
-        <w:t>From chat, type:</w:t>
-      </w:r>
-    </w:p>
-    <w:p>
-      <w:pPr>
-        <w:spacing w:after="120"/>
-        <w:ind w:left="360"/>
-        <w:rPr>
-          <w:rFonts w:ascii="Consolas" w:hAnsi="Consolas"/>
-          <w:sz w:val="18"/>
-        </w:rPr>
-      </w:pPr>
-      <w:r>
-        <w:rPr>
-          <w:rFonts w:ascii="Consolas" w:hAnsi="Consolas"/>
-          <w:sz w:val="18"/>
-        </w:rPr>
-        <w:t>start dashboard</w:t>
-      </w:r>
-    </w:p>
-    <w:p>
-      <w:pPr>
-        <w:spacing w:after="120"/>
-        <w:rPr>
-          <w:rFonts w:ascii="Aptos" w:hAnsi="Aptos"/>
-          <w:sz w:val="22"/>
-        </w:rPr>
-      </w:pPr>
-      <w:r>
-        <w:rPr>
-          <w:rFonts w:ascii="Aptos" w:hAnsi="Aptos"/>
-          <w:sz w:val="22"/>
-        </w:rPr>
-        <w:t>FixLab opens the dashboard for the connected repository. The default URL is http://127.0.0.1:4317; additional repositories use another loopback port.</w:t>
+        <w:t>7. Add a new bug</w:t>
+      </w:r>
+    </w:p>
+    <w:p>
+      <w:pPr>
+        <w:spacing w:after="120"/>
+        <w:rPr>
+          <w:rFonts w:ascii="Aptos" w:hAnsi="Aptos"/>
+          <w:sz w:val="22"/>
+        </w:rPr>
+      </w:pPr>
+      <w:r>
+        <w:rPr>
+          <w:rFonts w:ascii="Aptos" w:hAnsi="Aptos"/>
+          <w:sz w:val="22"/>
+        </w:rPr>
+        <w:t>Create a separate bug job from chat:</w:t>
+      </w:r>
+    </w:p>
+    <w:p>
+      <w:pPr>
+        <w:spacing w:after="120"/>
+        <w:ind w:left="360"/>
+        <w:rPr>
+          <w:rFonts w:ascii="Consolas" w:hAnsi="Consolas"/>
+          <w:sz w:val="18"/>
+        </w:rPr>
+      </w:pPr>
+      <w:r>
+        <w:rPr>
+          <w:rFonts w:ascii="Consolas" w:hAnsi="Consolas"/>
+          <w:sz w:val="18"/>
+        </w:rPr>
+        <w:t>new bug Product search returns duplicate rows</w:t>
+      </w:r>
+    </w:p>
+    <w:p>
+      <w:pPr>
+        <w:spacing w:after="120"/>
+        <w:ind w:left="360"/>
+        <w:rPr>
+          <w:rFonts w:ascii="Consolas" w:hAnsi="Consolas"/>
+          <w:sz w:val="18"/>
+        </w:rPr>
+      </w:pPr>
+      <w:r>
+        <w:rPr>
+          <w:rFonts w:ascii="Consolas" w:hAnsi="Consolas"/>
+          <w:sz w:val="18"/>
+        </w:rPr>
+        <w:t>add a bug: Save remains disabled after validation succeeds</w:t>
+      </w:r>
+    </w:p>
+    <w:p>
+      <w:pPr>
+        <w:spacing w:after="120"/>
+        <w:rPr>
+          <w:rFonts w:ascii="Aptos" w:hAnsi="Aptos"/>
+          <w:sz w:val="22"/>
+        </w:rPr>
+      </w:pPr>
+      <w:r>
+        <w:rPr>
+          <w:rFonts w:ascii="Aptos" w:hAnsi="Aptos"/>
+          <w:sz w:val="22"/>
+        </w:rPr>
+        <w:t>A new bug starts immediately when FixLab is idle or enters the dashboard queue when another job is active. If the instruction belongs to the current job, type it normally without the new bug prefix.</w:t>
+      </w:r>
+    </w:p>
+    <w:p>
+      <w:pPr>
+        <w:pStyle w:val="Heading2"/>
+        <w:spacing w:after="120"/>
+        <w:rPr>
+          <w:rFonts w:ascii="Aptos" w:hAnsi="Aptos"/>
+          <w:sz w:val="22"/>
+        </w:rPr>
+      </w:pPr>
+      <w:r>
+        <w:rPr>
+          <w:rFonts w:ascii="Aptos" w:hAnsi="Aptos"/>
+          <w:sz w:val="22"/>
+        </w:rPr>
+        <w:t>UI bug example</w:t>
+      </w:r>
+    </w:p>
+    <w:p>
+      <w:pPr>
+        <w:spacing w:after="120"/>
+        <w:ind w:left="360"/>
+        <w:rPr>
+          <w:rFonts w:ascii="Consolas" w:hAnsi="Consolas"/>
+          <w:sz w:val="18"/>
+        </w:rPr>
+      </w:pPr>
+      <w:r>
+        <w:rPr>
+          <w:rFonts w:ascii="Consolas" w:hAnsi="Consolas"/>
+          <w:sz w:val="18"/>
+        </w:rPr>
+        <w:t>new bug The Product Hierarchy Excel template is missing PFAM formatting. Reproduce the React UI issue, make the smallest fix, run focused tests, lint, type-check and build, start the required applications, validate with Playwright, capture non-sensitive evidence, and create or update the PR.</w:t>
+      </w:r>
+    </w:p>
+    <w:p>
+      <w:pPr>
+        <w:pStyle w:val="Heading2"/>
+        <w:spacing w:after="120"/>
+        <w:rPr>
+          <w:rFonts w:ascii="Aptos" w:hAnsi="Aptos"/>
+          <w:sz w:val="22"/>
+        </w:rPr>
+      </w:pPr>
+      <w:r>
+        <w:rPr>
+          <w:rFonts w:ascii="Aptos" w:hAnsi="Aptos"/>
+          <w:sz w:val="22"/>
+        </w:rPr>
+        <w:t>API bug example</w:t>
+      </w:r>
+    </w:p>
+    <w:p>
+      <w:pPr>
+        <w:spacing w:after="120"/>
+        <w:ind w:left="360"/>
+        <w:rPr>
+          <w:rFonts w:ascii="Consolas" w:hAnsi="Consolas"/>
+          <w:sz w:val="18"/>
+        </w:rPr>
+      </w:pPr>
+      <w:r>
+        <w:rPr>
+          <w:rFonts w:ascii="Consolas" w:hAnsi="Consolas"/>
+          <w:sz w:val="18"/>
+        </w:rPr>
+        <w:t>new bug The create request API returns the wrong status for invalid hierarchy input. Reproduce it with the smallest safe API test, identify the .NET validation path, make the smallest fix, run focused .NET tests and build, start the backend when runtime validation is required, verify the HTTP response, and create or update the PR.</w:t>
+      </w:r>
+    </w:p>
+    <w:p>
+      <w:pPr>
+        <w:pStyle w:val="Heading2"/>
+        <w:spacing w:after="120"/>
+        <w:rPr>
+          <w:rFonts w:ascii="Aptos" w:hAnsi="Aptos"/>
+          <w:sz w:val="22"/>
+        </w:rPr>
+      </w:pPr>
+      <w:r>
+        <w:rPr>
+          <w:rFonts w:ascii="Aptos" w:hAnsi="Aptos"/>
+          <w:sz w:val="22"/>
+        </w:rPr>
+        <w:t>End-to-end UI and API example</w:t>
+      </w:r>
+    </w:p>
+    <w:p>
+      <w:pPr>
+        <w:spacing w:after="120"/>
+        <w:ind w:left="360"/>
+        <w:rPr>
+          <w:rFonts w:ascii="Consolas" w:hAnsi="Consolas"/>
+          <w:sz w:val="18"/>
+        </w:rPr>
+      </w:pPr>
+      <w:r>
+        <w:rPr>
+          <w:rFonts w:ascii="Consolas" w:hAnsi="Consolas"/>
+          <w:sz w:val="18"/>
+        </w:rPr>
+        <w:t>new bug Fix this React workflow end to end. If it depends on the .NET API, restore, build, and start the backend automatically before Playwright. Verify both the API and UI behavior, capture evidence, and create or update the PR.</w:t>
       </w:r>
     </w:p>
     <w:p>
@@ -1181,175 +1606,152 @@
         <w:pStyle w:val="Heading1"/>
       </w:pPr>
       <w:r>
-        <w:t>7. Add a new bug</w:t>
-      </w:r>
-    </w:p>
-    <w:p>
-      <w:pPr>
-        <w:spacing w:after="120"/>
-        <w:rPr>
-          <w:rFonts w:ascii="Aptos" w:hAnsi="Aptos"/>
-          <w:sz w:val="22"/>
-        </w:rPr>
-      </w:pPr>
-      <w:r>
-        <w:rPr>
-          <w:rFonts w:ascii="Aptos" w:hAnsi="Aptos"/>
-          <w:sz w:val="22"/>
-        </w:rPr>
-        <w:t>Create a separate bug job from chat:</w:t>
-      </w:r>
-    </w:p>
-    <w:p>
-      <w:pPr>
-        <w:spacing w:after="120"/>
-        <w:ind w:left="360"/>
-        <w:rPr>
-          <w:rFonts w:ascii="Consolas" w:hAnsi="Consolas"/>
-          <w:sz w:val="18"/>
-        </w:rPr>
-      </w:pPr>
-      <w:r>
-        <w:rPr>
-          <w:rFonts w:ascii="Consolas" w:hAnsi="Consolas"/>
-          <w:sz w:val="18"/>
-        </w:rPr>
-        <w:t>new bug Product search returns duplicate rows</w:t>
-      </w:r>
-    </w:p>
-    <w:p>
-      <w:pPr>
-        <w:spacing w:after="120"/>
-        <w:ind w:left="360"/>
-        <w:rPr>
-          <w:rFonts w:ascii="Consolas" w:hAnsi="Consolas"/>
-          <w:sz w:val="18"/>
-        </w:rPr>
-      </w:pPr>
-      <w:r>
-        <w:rPr>
-          <w:rFonts w:ascii="Consolas" w:hAnsi="Consolas"/>
-          <w:sz w:val="18"/>
-        </w:rPr>
-        <w:t>add a bug: Save remains disabled after validation succeeds</w:t>
-      </w:r>
-    </w:p>
-    <w:p>
-      <w:pPr>
-        <w:spacing w:after="120"/>
-        <w:rPr>
-          <w:rFonts w:ascii="Aptos" w:hAnsi="Aptos"/>
-          <w:sz w:val="22"/>
-        </w:rPr>
-      </w:pPr>
-      <w:r>
-        <w:rPr>
-          <w:rFonts w:ascii="Aptos" w:hAnsi="Aptos"/>
-          <w:sz w:val="22"/>
-        </w:rPr>
-        <w:t>A new bug starts immediately when FixLab is idle or enters the dashboard queue when another job is active. If the instruction belongs to the current job, type it normally without the new bug prefix.</w:t>
-      </w:r>
-    </w:p>
-    <w:p>
-      <w:pPr>
-        <w:pStyle w:val="Heading2"/>
-        <w:spacing w:after="120"/>
-        <w:rPr>
-          <w:rFonts w:ascii="Aptos" w:hAnsi="Aptos"/>
-          <w:sz w:val="22"/>
-        </w:rPr>
-      </w:pPr>
-      <w:r>
-        <w:rPr>
-          <w:rFonts w:ascii="Aptos" w:hAnsi="Aptos"/>
-          <w:sz w:val="22"/>
-        </w:rPr>
-        <w:t>UI bug example</w:t>
-      </w:r>
-    </w:p>
-    <w:p>
-      <w:pPr>
-        <w:spacing w:after="120"/>
-        <w:ind w:left="360"/>
-        <w:rPr>
-          <w:rFonts w:ascii="Consolas" w:hAnsi="Consolas"/>
-          <w:sz w:val="18"/>
-        </w:rPr>
-      </w:pPr>
-      <w:r>
-        <w:rPr>
-          <w:rFonts w:ascii="Consolas" w:hAnsi="Consolas"/>
-          <w:sz w:val="18"/>
-        </w:rPr>
-        <w:t>new bug The Product Hierarchy Excel template is missing PFAM formatting. Reproduce the React UI issue, make the smallest fix, run focused tests, lint, type-check and build, start the required applications, validate with Playwright, capture non-sensitive evidence, and create or update the PR.</w:t>
-      </w:r>
-    </w:p>
-    <w:p>
-      <w:pPr>
-        <w:pStyle w:val="Heading2"/>
-        <w:spacing w:after="120"/>
-        <w:rPr>
-          <w:rFonts w:ascii="Aptos" w:hAnsi="Aptos"/>
-          <w:sz w:val="22"/>
-        </w:rPr>
-      </w:pPr>
-      <w:r>
-        <w:rPr>
-          <w:rFonts w:ascii="Aptos" w:hAnsi="Aptos"/>
-          <w:sz w:val="22"/>
-        </w:rPr>
-        <w:t>API bug example</w:t>
-      </w:r>
-    </w:p>
-    <w:p>
-      <w:pPr>
-        <w:spacing w:after="120"/>
-        <w:ind w:left="360"/>
-        <w:rPr>
-          <w:rFonts w:ascii="Consolas" w:hAnsi="Consolas"/>
-          <w:sz w:val="18"/>
-        </w:rPr>
-      </w:pPr>
-      <w:r>
-        <w:rPr>
-          <w:rFonts w:ascii="Consolas" w:hAnsi="Consolas"/>
-          <w:sz w:val="18"/>
-        </w:rPr>
-        <w:t>new bug The create request API returns the wrong status for invalid hierarchy input. Reproduce it with the smallest safe API test, identify the .NET validation path, make the smallest fix, run focused .NET tests and build, start the backend when runtime validation is required, verify the HTTP response, and create or update the PR.</w:t>
-      </w:r>
-    </w:p>
-    <w:p>
-      <w:pPr>
-        <w:pStyle w:val="Heading2"/>
-        <w:spacing w:after="120"/>
-        <w:rPr>
-          <w:rFonts w:ascii="Aptos" w:hAnsi="Aptos"/>
-          <w:sz w:val="22"/>
-        </w:rPr>
-      </w:pPr>
-      <w:r>
-        <w:rPr>
-          <w:rFonts w:ascii="Aptos" w:hAnsi="Aptos"/>
-          <w:sz w:val="22"/>
-        </w:rPr>
-        <w:t>End-to-end UI and API example</w:t>
-      </w:r>
-    </w:p>
-    <w:p>
-      <w:pPr>
-        <w:spacing w:after="120"/>
-        <w:ind w:left="360"/>
-        <w:rPr>
-          <w:rFonts w:ascii="Consolas" w:hAnsi="Consolas"/>
-          <w:sz w:val="18"/>
-        </w:rPr>
-      </w:pPr>
-      <w:r>
-        <w:rPr>
-          <w:rFonts w:ascii="Consolas" w:hAnsi="Consolas"/>
-          <w:sz w:val="18"/>
-        </w:rPr>
-        <w:t>new bug Fix this React workflow end to end. If it depends on the .NET API, restore, build, and start the backend automatically before Playwright. Verify both the API and UI behavior, capture evidence, and create or update the PR.</w:t>
+        <w:t>8. End-to-end FixLab lifecycle</w:t>
+      </w:r>
+    </w:p>
+    <w:p>
+      <w:pPr>
+        <w:spacing w:after="120"/>
+        <w:rPr>
+          <w:rFonts w:ascii="Aptos" w:hAnsi="Aptos"/>
+          <w:sz w:val="22"/>
+        </w:rPr>
+      </w:pPr>
+      <w:r>
+        <w:rPr>
+          <w:rFonts w:ascii="Aptos" w:hAnsi="Aptos"/>
+          <w:sz w:val="22"/>
+        </w:rPr>
+        <w:t>FixLab should complete and report these stages:</w:t>
+      </w:r>
+    </w:p>
+    <w:p>
+      <w:pPr>
+        <w:spacing w:after="120"/>
+        <w:rPr>
+          <w:rFonts w:ascii="Aptos" w:hAnsi="Aptos"/>
+          <w:sz w:val="22"/>
+        </w:rPr>
+      </w:pPr>
+      <w:r>
+        <w:rPr>
+          <w:rFonts w:ascii="Aptos" w:hAnsi="Aptos"/>
+          <w:sz w:val="22"/>
+        </w:rPr>
+        <w:t>- Intake: define the measurable bug or enhancement contract.</w:t>
+      </w:r>
+    </w:p>
+    <w:p>
+      <w:pPr>
+        <w:spacing w:after="120"/>
+        <w:rPr>
+          <w:rFonts w:ascii="Aptos" w:hAnsi="Aptos"/>
+          <w:sz w:val="22"/>
+        </w:rPr>
+      </w:pPr>
+      <w:r>
+        <w:rPr>
+          <w:rFonts w:ascii="Aptos" w:hAnsi="Aptos"/>
+          <w:sz w:val="22"/>
+        </w:rPr>
+        <w:t>- Diagnosis: identify the affected frontend, backend, configuration, or external boundary.</w:t>
+      </w:r>
+    </w:p>
+    <w:p>
+      <w:pPr>
+        <w:spacing w:after="120"/>
+        <w:rPr>
+          <w:rFonts w:ascii="Aptos" w:hAnsi="Aptos"/>
+          <w:sz w:val="22"/>
+        </w:rPr>
+      </w:pPr>
+      <w:r>
+        <w:rPr>
+          <w:rFonts w:ascii="Aptos" w:hAnsi="Aptos"/>
+          <w:sz w:val="22"/>
+        </w:rPr>
+        <w:t>- Reproduce: demonstrate the original problem or establish a precise failing check.</w:t>
+      </w:r>
+    </w:p>
+    <w:p>
+      <w:pPr>
+        <w:spacing w:after="120"/>
+        <w:rPr>
+          <w:rFonts w:ascii="Aptos" w:hAnsi="Aptos"/>
+          <w:sz w:val="22"/>
+        </w:rPr>
+      </w:pPr>
+      <w:r>
+        <w:rPr>
+          <w:rFonts w:ascii="Aptos" w:hAnsi="Aptos"/>
+          <w:sz w:val="22"/>
+        </w:rPr>
+        <w:t>- Fix: make the smallest complete change and preserve unrelated work.</w:t>
+      </w:r>
+    </w:p>
+    <w:p>
+      <w:pPr>
+        <w:spacing w:after="120"/>
+        <w:rPr>
+          <w:rFonts w:ascii="Aptos" w:hAnsi="Aptos"/>
+          <w:sz w:val="22"/>
+        </w:rPr>
+      </w:pPr>
+      <w:r>
+        <w:rPr>
+          <w:rFonts w:ascii="Aptos" w:hAnsi="Aptos"/>
+          <w:sz w:val="22"/>
+        </w:rPr>
+        <w:t>- Review: inspect the effective diff and exclude generated or sensitive artifacts.</w:t>
+      </w:r>
+    </w:p>
+    <w:p>
+      <w:pPr>
+        <w:spacing w:after="120"/>
+        <w:rPr>
+          <w:rFonts w:ascii="Aptos" w:hAnsi="Aptos"/>
+          <w:sz w:val="22"/>
+        </w:rPr>
+      </w:pPr>
+      <w:r>
+        <w:rPr>
+          <w:rFonts w:ascii="Aptos" w:hAnsi="Aptos"/>
+          <w:sz w:val="22"/>
+        </w:rPr>
+        <w:lastRenderedPageBreak/>
+        <w:t>- Local stack: run focused tests, lint, type-check, builds, and required application startup.</w:t>
+      </w:r>
+    </w:p>
+    <w:p>
+      <w:pPr>
+        <w:spacing w:after="120"/>
+        <w:rPr>
+          <w:rFonts w:ascii="Aptos" w:hAnsi="Aptos"/>
+          <w:sz w:val="22"/>
+        </w:rPr>
+      </w:pPr>
+      <w:r>
+        <w:rPr>
+          <w:rFonts w:ascii="Aptos" w:hAnsi="Aptos"/>
+          <w:sz w:val="22"/>
+        </w:rPr>
+        <w:t>- Live test: validate the required UI journey or API behavior with safe data.</w:t>
+      </w:r>
+    </w:p>
+    <w:p>
+      <w:pPr>
+        <w:spacing w:after="120"/>
+        <w:rPr>
+          <w:rFonts w:ascii="Aptos" w:hAnsi="Aptos"/>
+          <w:sz w:val="22"/>
+        </w:rPr>
+      </w:pPr>
+      <w:r>
+        <w:rPr>
+          <w:rFonts w:ascii="Aptos" w:hAnsi="Aptos"/>
+          <w:sz w:val="22"/>
+        </w:rPr>
+        <w:t>- Pull request: commit, push, create or update the authorized PR, and report validation evidence.</w:t>
       </w:r>
     </w:p>
     <w:p>
@@ -1357,445 +1759,292 @@
         <w:pStyle w:val="Heading1"/>
       </w:pPr>
       <w:r>
+        <w:t>9. Pull request creation</w:t>
+      </w:r>
+    </w:p>
+    <w:p>
+      <w:pPr>
+        <w:spacing w:after="120"/>
+        <w:rPr>
+          <w:rFonts w:ascii="Aptos" w:hAnsi="Aptos"/>
+          <w:sz w:val="22"/>
+        </w:rPr>
+      </w:pPr>
+      <w:r>
+        <w:rPr>
+          <w:rFonts w:ascii="Aptos" w:hAnsi="Aptos"/>
+          <w:sz w:val="22"/>
+        </w:rPr>
+        <w:t>Include PR creation in the bug request when code changes are expected:</w:t>
+      </w:r>
+    </w:p>
+    <w:p>
+      <w:pPr>
+        <w:spacing w:after="120"/>
+        <w:ind w:left="360"/>
+        <w:rPr>
+          <w:rFonts w:ascii="Consolas" w:hAnsi="Consolas"/>
+          <w:sz w:val="18"/>
+        </w:rPr>
+      </w:pPr>
+      <w:r>
+        <w:rPr>
+          <w:rFonts w:ascii="Consolas" w:hAnsi="Consolas"/>
+          <w:sz w:val="18"/>
+        </w:rPr>
+        <w:t>Finish the required validation and create or update the pull request using my authorized developer account. Do not stop after local validation.</w:t>
+      </w:r>
+    </w:p>
+    <w:p>
+      <w:pPr>
+        <w:spacing w:after="120"/>
+        <w:rPr>
+          <w:rFonts w:ascii="Aptos" w:hAnsi="Aptos"/>
+          <w:sz w:val="22"/>
+        </w:rPr>
+      </w:pPr>
+      <w:r>
+        <w:rPr>
+          <w:rFonts w:ascii="Aptos" w:hAnsi="Aptos"/>
+          <w:sz w:val="22"/>
+        </w:rPr>
+        <w:t>Check progress from chat:</w:t>
+      </w:r>
+    </w:p>
+    <w:p>
+      <w:pPr>
+        <w:spacing w:after="120"/>
+        <w:ind w:left="360"/>
+        <w:rPr>
+          <w:rFonts w:ascii="Consolas" w:hAnsi="Consolas"/>
+          <w:sz w:val="18"/>
+        </w:rPr>
+      </w:pPr>
+      <w:r>
+        <w:rPr>
+          <w:rFonts w:ascii="Consolas" w:hAnsi="Consolas"/>
+          <w:sz w:val="18"/>
+        </w:rPr>
+        <w:t>show pull request</w:t>
+      </w:r>
+    </w:p>
+    <w:p>
+      <w:pPr>
+        <w:spacing w:after="120"/>
+        <w:ind w:left="360"/>
+        <w:rPr>
+          <w:rFonts w:ascii="Consolas" w:hAnsi="Consolas"/>
+          <w:sz w:val="18"/>
+        </w:rPr>
+      </w:pPr>
+      <w:r>
+        <w:rPr>
+          <w:rFonts w:ascii="Consolas" w:hAnsi="Consolas"/>
+          <w:sz w:val="18"/>
+        </w:rPr>
+        <w:t>show status</w:t>
+      </w:r>
+    </w:p>
+    <w:p>
+      <w:pPr>
+        <w:spacing w:after="120"/>
+        <w:rPr>
+          <w:rFonts w:ascii="Aptos" w:hAnsi="Aptos"/>
+          <w:sz w:val="22"/>
+        </w:rPr>
+      </w:pPr>
+      <w:r>
+        <w:rPr>
+          <w:rFonts w:ascii="Aptos" w:hAnsi="Aptos"/>
+          <w:sz w:val="22"/>
+        </w:rPr>
+        <w:t>Validation-only mode must not edit source, commit, push, or change the pull request.</w:t>
+      </w:r>
+    </w:p>
+    <w:p>
+      <w:pPr>
+        <w:pStyle w:val="Heading1"/>
+      </w:pPr>
+      <w:r>
+        <w:t>10. Keep localhost running for manual testing</w:t>
+      </w:r>
+    </w:p>
+    <w:p>
+      <w:pPr>
+        <w:spacing w:after="120"/>
+        <w:rPr>
+          <w:rFonts w:ascii="Aptos" w:hAnsi="Aptos"/>
+          <w:sz w:val="22"/>
+        </w:rPr>
+      </w:pPr>
+      <w:r>
+        <w:rPr>
+          <w:rFonts w:ascii="Aptos" w:hAnsi="Aptos"/>
+          <w:sz w:val="22"/>
+        </w:rPr>
+        <w:t>By default, FixLab stops only the frontend and backend processes it started when the job finishes. To keep them available, say:</w:t>
+      </w:r>
+    </w:p>
+    <w:p>
+      <w:pPr>
+        <w:spacing w:after="120"/>
+        <w:ind w:left="360"/>
+        <w:rPr>
+          <w:rFonts w:ascii="Consolas" w:hAnsi="Consolas"/>
+          <w:sz w:val="18"/>
+        </w:rPr>
+      </w:pPr>
+      <w:r>
+        <w:rPr>
+          <w:rFonts w:ascii="Consolas" w:hAnsi="Consolas"/>
+          <w:sz w:val="18"/>
+        </w:rPr>
+        <w:t>Keep the frontend localhost running with hot reload after validation so I can test it manually. If the UI requires the .NET backend, keep that FixLab-owned backend running too until I confirm testing is complete.</w:t>
+      </w:r>
+    </w:p>
+    <w:p>
+      <w:pPr>
+        <w:spacing w:after="120"/>
+        <w:rPr>
+          <w:rFonts w:ascii="Aptos" w:hAnsi="Aptos"/>
+          <w:sz w:val="22"/>
+        </w:rPr>
+      </w:pPr>
+      <w:r>
+        <w:rPr>
+          <w:rFonts w:ascii="Aptos" w:hAnsi="Aptos"/>
+          <w:sz w:val="22"/>
+        </w:rPr>
+        <w:t>The dashboard also provides Hold after Playwright for manual local testing.</w:t>
+      </w:r>
+    </w:p>
+    <w:p>
+      <w:pPr>
+        <w:pStyle w:val="Heading1"/>
+      </w:pPr>
+      <w:r>
+        <w:t>11. Recover an interrupted job</w:t>
+      </w:r>
+    </w:p>
+    <w:p>
+      <w:pPr>
+        <w:spacing w:after="120"/>
+        <w:ind w:left="360"/>
+        <w:rPr>
+          <w:rFonts w:ascii="Consolas" w:hAnsi="Consolas"/>
+          <w:sz w:val="18"/>
+        </w:rPr>
+      </w:pPr>
+      <w:r>
+        <w:rPr>
+          <w:rFonts w:ascii="Consolas" w:hAnsi="Consolas"/>
+          <w:sz w:val="18"/>
+        </w:rPr>
+        <w:t>Continue the same job, preserve existing changes, finish all required validation, and create or update the PR.</w:t>
+      </w:r>
+    </w:p>
+    <w:p>
+      <w:pPr>
+        <w:spacing w:after="120"/>
+        <w:rPr>
+          <w:rFonts w:ascii="Aptos" w:hAnsi="Aptos"/>
+          <w:sz w:val="22"/>
+        </w:rPr>
+      </w:pPr>
+      <w:r>
+        <w:rPr>
+          <w:rFonts w:ascii="Aptos" w:hAnsi="Aptos"/>
+          <w:sz w:val="22"/>
+        </w:rPr>
+        <w:t>Use retry only when the current executor cannot safely resume. FixLab must preserve the worktree and must not discard prior changes.</w:t>
+      </w:r>
+    </w:p>
+    <w:p>
+      <w:pPr>
+        <w:pStyle w:val="Heading1"/>
+      </w:pPr>
+      <w:r>
+        <w:t>12. Expected completion evidence</w:t>
+      </w:r>
+    </w:p>
+    <w:p>
+      <w:pPr>
+        <w:spacing w:after="120"/>
+        <w:rPr>
+          <w:rFonts w:ascii="Aptos" w:hAnsi="Aptos"/>
+          <w:sz w:val="22"/>
+        </w:rPr>
+      </w:pPr>
+      <w:r>
+        <w:rPr>
+          <w:rFonts w:ascii="Aptos" w:hAnsi="Aptos"/>
+          <w:sz w:val="22"/>
+        </w:rPr>
+        <w:t>- Focused tests and required build/type-check results.</w:t>
+      </w:r>
+    </w:p>
+    <w:p>
+      <w:pPr>
+        <w:spacing w:after="120"/>
+        <w:rPr>
+          <w:rFonts w:ascii="Aptos" w:hAnsi="Aptos"/>
+          <w:sz w:val="22"/>
+        </w:rPr>
+      </w:pPr>
+      <w:r>
+        <w:rPr>
+          <w:rFonts w:ascii="Aptos" w:hAnsi="Aptos"/>
+          <w:sz w:val="22"/>
+        </w:rPr>
+        <w:t>- Explicit pass, failure, skipped, blocked, or timeout status for every required gate.</w:t>
+      </w:r>
+    </w:p>
+    <w:p>
+      <w:pPr>
+        <w:spacing w:after="120"/>
+        <w:rPr>
+          <w:rFonts w:ascii="Aptos" w:hAnsi="Aptos"/>
+          <w:sz w:val="22"/>
+        </w:rPr>
+      </w:pPr>
+      <w:r>
+        <w:rPr>
+          <w:rFonts w:ascii="Aptos" w:hAnsi="Aptos"/>
+          <w:sz w:val="22"/>
+        </w:rPr>
+        <w:t>- Non-sensitive Playwright screenshots or API assertions when required.</w:t>
+      </w:r>
+    </w:p>
+    <w:p>
+      <w:pPr>
+        <w:spacing w:after="120"/>
+        <w:rPr>
+          <w:rFonts w:ascii="Aptos" w:hAnsi="Aptos"/>
+          <w:sz w:val="22"/>
+        </w:rPr>
+      </w:pPr>
+      <w:r>
+        <w:rPr>
+          <w:rFonts w:ascii="Aptos" w:hAnsi="Aptos"/>
+          <w:sz w:val="22"/>
+        </w:rPr>
+        <w:t>- The branch, commit, pull-request URL or number, and remote policy status when available.</w:t>
+      </w:r>
+    </w:p>
+    <w:p>
+      <w:pPr>
+        <w:spacing w:after="120"/>
+        <w:rPr>
+          <w:rFonts w:ascii="Aptos" w:hAnsi="Aptos"/>
+          <w:sz w:val="22"/>
+        </w:rPr>
+      </w:pPr>
+      <w:r>
+        <w:rPr>
+          <w:rFonts w:ascii="Aptos" w:hAnsi="Aptos"/>
+          <w:sz w:val="22"/>
+        </w:rPr>
         <w:lastRenderedPageBreak/>
-        <w:t>8. End-to-end FixLab lifecycle</w:t>
-      </w:r>
-    </w:p>
-    <w:p>
-      <w:pPr>
-        <w:spacing w:after="120"/>
-        <w:rPr>
-          <w:rFonts w:ascii="Aptos" w:hAnsi="Aptos"/>
-          <w:sz w:val="22"/>
-        </w:rPr>
-      </w:pPr>
-      <w:r>
-        <w:rPr>
-          <w:rFonts w:ascii="Aptos" w:hAnsi="Aptos"/>
-          <w:sz w:val="22"/>
-        </w:rPr>
-        <w:t>FixLab should complete and report these stages:</w:t>
-      </w:r>
-    </w:p>
-    <w:p>
-      <w:pPr>
-        <w:spacing w:after="120"/>
-        <w:rPr>
-          <w:rFonts w:ascii="Aptos" w:hAnsi="Aptos"/>
-          <w:sz w:val="22"/>
-        </w:rPr>
-      </w:pPr>
-      <w:r>
-        <w:rPr>
-          <w:rFonts w:ascii="Aptos" w:hAnsi="Aptos"/>
-          <w:sz w:val="22"/>
-        </w:rPr>
-        <w:t>- Intake: define the measurable bug or enhancement contract.</w:t>
-      </w:r>
-    </w:p>
-    <w:p>
-      <w:pPr>
-        <w:spacing w:after="120"/>
-        <w:rPr>
-          <w:rFonts w:ascii="Aptos" w:hAnsi="Aptos"/>
-          <w:sz w:val="22"/>
-        </w:rPr>
-      </w:pPr>
-      <w:r>
-        <w:rPr>
-          <w:rFonts w:ascii="Aptos" w:hAnsi="Aptos"/>
-          <w:sz w:val="22"/>
-        </w:rPr>
-        <w:t>- Diagnosis: identify the affected frontend, backend, configuration, or external boundary.</w:t>
-      </w:r>
-    </w:p>
-    <w:p>
-      <w:pPr>
-        <w:spacing w:after="120"/>
-        <w:rPr>
-          <w:rFonts w:ascii="Aptos" w:hAnsi="Aptos"/>
-          <w:sz w:val="22"/>
-        </w:rPr>
-      </w:pPr>
-      <w:r>
-        <w:rPr>
-          <w:rFonts w:ascii="Aptos" w:hAnsi="Aptos"/>
-          <w:sz w:val="22"/>
-        </w:rPr>
-        <w:t>- Reproduce: demonstrate the original problem or establish a precise failing check.</w:t>
-      </w:r>
-    </w:p>
-    <w:p>
-      <w:pPr>
-        <w:spacing w:after="120"/>
-        <w:rPr>
-          <w:rFonts w:ascii="Aptos" w:hAnsi="Aptos"/>
-          <w:sz w:val="22"/>
-        </w:rPr>
-      </w:pPr>
-      <w:r>
-        <w:rPr>
-          <w:rFonts w:ascii="Aptos" w:hAnsi="Aptos"/>
-          <w:sz w:val="22"/>
-        </w:rPr>
-        <w:t>- Fix: make the smallest complete change and preserve unrelated work.</w:t>
-      </w:r>
-    </w:p>
-    <w:p>
-      <w:pPr>
-        <w:spacing w:after="120"/>
-        <w:rPr>
-          <w:rFonts w:ascii="Aptos" w:hAnsi="Aptos"/>
-          <w:sz w:val="22"/>
-        </w:rPr>
-      </w:pPr>
-      <w:r>
-        <w:rPr>
-          <w:rFonts w:ascii="Aptos" w:hAnsi="Aptos"/>
-          <w:sz w:val="22"/>
-        </w:rPr>
-        <w:t>- Review: inspect the effective diff and exclude generated or sensitive artifacts.</w:t>
-      </w:r>
-    </w:p>
-    <w:p>
-      <w:pPr>
-        <w:spacing w:after="120"/>
-        <w:rPr>
-          <w:rFonts w:ascii="Aptos" w:hAnsi="Aptos"/>
-          <w:sz w:val="22"/>
-        </w:rPr>
-      </w:pPr>
-      <w:r>
-        <w:rPr>
-          <w:rFonts w:ascii="Aptos" w:hAnsi="Aptos"/>
-          <w:sz w:val="22"/>
-        </w:rPr>
-        <w:t>- Local stack: run focused tests, lint, type-check, builds, and required application startup.</w:t>
-      </w:r>
-    </w:p>
-    <w:p>
-      <w:pPr>
-        <w:spacing w:after="120"/>
-        <w:rPr>
-          <w:rFonts w:ascii="Aptos" w:hAnsi="Aptos"/>
-          <w:sz w:val="22"/>
-        </w:rPr>
-      </w:pPr>
-      <w:r>
-        <w:rPr>
-          <w:rFonts w:ascii="Aptos" w:hAnsi="Aptos"/>
-          <w:sz w:val="22"/>
-        </w:rPr>
-        <w:t>- Live test: validate the required UI journey or API behavior with safe data.</w:t>
-      </w:r>
-    </w:p>
-    <w:p>
-      <w:pPr>
-        <w:spacing w:after="120"/>
-        <w:rPr>
-          <w:rFonts w:ascii="Aptos" w:hAnsi="Aptos"/>
-          <w:sz w:val="22"/>
-        </w:rPr>
-      </w:pPr>
-      <w:r>
-        <w:rPr>
-          <w:rFonts w:ascii="Aptos" w:hAnsi="Aptos"/>
-          <w:sz w:val="22"/>
-        </w:rPr>
-        <w:t>- Pull request: commit, push, create or update the authorized PR, and report validation evidence.</w:t>
-      </w:r>
-    </w:p>
-    <w:p>
-      <w:pPr>
-        <w:pStyle w:val="Heading1"/>
-      </w:pPr>
-      <w:r>
-        <w:t>9. Pull request creation</w:t>
-      </w:r>
-    </w:p>
-    <w:p>
-      <w:pPr>
-        <w:spacing w:after="120"/>
-        <w:rPr>
-          <w:rFonts w:ascii="Aptos" w:hAnsi="Aptos"/>
-          <w:sz w:val="22"/>
-        </w:rPr>
-      </w:pPr>
-      <w:r>
-        <w:rPr>
-          <w:rFonts w:ascii="Aptos" w:hAnsi="Aptos"/>
-          <w:sz w:val="22"/>
-        </w:rPr>
-        <w:t>Include PR creation in the bug request when code changes are expected:</w:t>
-      </w:r>
-    </w:p>
-    <w:p>
-      <w:pPr>
-        <w:spacing w:after="120"/>
-        <w:ind w:left="360"/>
-        <w:rPr>
-          <w:rFonts w:ascii="Consolas" w:hAnsi="Consolas"/>
-          <w:sz w:val="18"/>
-        </w:rPr>
-      </w:pPr>
-      <w:r>
-        <w:rPr>
-          <w:rFonts w:ascii="Consolas" w:hAnsi="Consolas"/>
-          <w:sz w:val="18"/>
-        </w:rPr>
-        <w:t>Finish the required validation and create or update the pull request using my authorized developer account. Do not stop after local validation.</w:t>
-      </w:r>
-    </w:p>
-    <w:p>
-      <w:pPr>
-        <w:spacing w:after="120"/>
-        <w:rPr>
-          <w:rFonts w:ascii="Aptos" w:hAnsi="Aptos"/>
-          <w:sz w:val="22"/>
-        </w:rPr>
-      </w:pPr>
-      <w:r>
-        <w:rPr>
-          <w:rFonts w:ascii="Aptos" w:hAnsi="Aptos"/>
-          <w:sz w:val="22"/>
-        </w:rPr>
-        <w:t>Check progress from chat:</w:t>
-      </w:r>
-    </w:p>
-    <w:p>
-      <w:pPr>
-        <w:spacing w:after="120"/>
-        <w:ind w:left="360"/>
-        <w:rPr>
-          <w:rFonts w:ascii="Consolas" w:hAnsi="Consolas"/>
-          <w:sz w:val="18"/>
-        </w:rPr>
-      </w:pPr>
-      <w:r>
-        <w:rPr>
-          <w:rFonts w:ascii="Consolas" w:hAnsi="Consolas"/>
-          <w:sz w:val="18"/>
-        </w:rPr>
-        <w:t>show pull request</w:t>
-      </w:r>
-    </w:p>
-    <w:p>
-      <w:pPr>
-        <w:spacing w:after="120"/>
-        <w:ind w:left="360"/>
-        <w:rPr>
-          <w:rFonts w:ascii="Consolas" w:hAnsi="Consolas"/>
-          <w:sz w:val="18"/>
-        </w:rPr>
-      </w:pPr>
-      <w:r>
-        <w:rPr>
-          <w:rFonts w:ascii="Consolas" w:hAnsi="Consolas"/>
-          <w:sz w:val="18"/>
-        </w:rPr>
-        <w:t>show status</w:t>
-      </w:r>
-    </w:p>
-    <w:p>
-      <w:pPr>
-        <w:spacing w:after="120"/>
-        <w:rPr>
-          <w:rFonts w:ascii="Aptos" w:hAnsi="Aptos"/>
-          <w:sz w:val="22"/>
-        </w:rPr>
-      </w:pPr>
-      <w:r>
-        <w:rPr>
-          <w:rFonts w:ascii="Aptos" w:hAnsi="Aptos"/>
-          <w:sz w:val="22"/>
-        </w:rPr>
-        <w:t>Validation-only mode must not edit source, commit, push, or change the pull request.</w:t>
-      </w:r>
-    </w:p>
-    <w:p>
-      <w:pPr>
-        <w:pStyle w:val="Heading1"/>
-      </w:pPr>
-      <w:r>
-        <w:t>10. Keep localhost running for manual testing</w:t>
-      </w:r>
-    </w:p>
-    <w:p>
-      <w:pPr>
-        <w:spacing w:after="120"/>
-        <w:rPr>
-          <w:rFonts w:ascii="Aptos" w:hAnsi="Aptos"/>
-          <w:sz w:val="22"/>
-        </w:rPr>
-      </w:pPr>
-      <w:r>
-        <w:rPr>
-          <w:rFonts w:ascii="Aptos" w:hAnsi="Aptos"/>
-          <w:sz w:val="22"/>
-        </w:rPr>
-        <w:t>By default, FixLab stops only the frontend and backend processes it started when the job finishes. To keep them available, say:</w:t>
-      </w:r>
-    </w:p>
-    <w:p>
-      <w:pPr>
-        <w:spacing w:after="120"/>
-        <w:ind w:left="360"/>
-        <w:rPr>
-          <w:rFonts w:ascii="Consolas" w:hAnsi="Consolas"/>
-          <w:sz w:val="18"/>
-        </w:rPr>
-      </w:pPr>
-      <w:r>
-        <w:rPr>
-          <w:rFonts w:ascii="Consolas" w:hAnsi="Consolas"/>
-          <w:sz w:val="18"/>
-        </w:rPr>
-        <w:t>Keep the frontend localhost running with hot reload after validation so I can test it manually. If the UI requires the .NET backend, keep that FixLab-owned backend running too until I confirm testing is complete.</w:t>
-      </w:r>
-    </w:p>
-    <w:p>
-      <w:pPr>
-        <w:spacing w:after="120"/>
-        <w:rPr>
-          <w:rFonts w:ascii="Aptos" w:hAnsi="Aptos"/>
-          <w:sz w:val="22"/>
-        </w:rPr>
-      </w:pPr>
-      <w:r>
-        <w:rPr>
-          <w:rFonts w:ascii="Aptos" w:hAnsi="Aptos"/>
-          <w:sz w:val="22"/>
-        </w:rPr>
-        <w:t>The dashboard also provides Hold after Playwright for manual local testing.</w:t>
-      </w:r>
-    </w:p>
-    <w:p>
-      <w:pPr>
-        <w:pStyle w:val="Heading1"/>
-      </w:pPr>
-      <w:r>
-        <w:t>11. Recover an interrupted job</w:t>
-      </w:r>
-    </w:p>
-    <w:p>
-      <w:pPr>
-        <w:spacing w:after="120"/>
-        <w:ind w:left="360"/>
-        <w:rPr>
-          <w:rFonts w:ascii="Consolas" w:hAnsi="Consolas"/>
-          <w:sz w:val="18"/>
-        </w:rPr>
-      </w:pPr>
-      <w:r>
-        <w:rPr>
-          <w:rFonts w:ascii="Consolas" w:hAnsi="Consolas"/>
-          <w:sz w:val="18"/>
-        </w:rPr>
-        <w:t>Continue the same job, preserve existing changes, finish all required validation, and create or update the PR.</w:t>
-      </w:r>
-    </w:p>
-    <w:p>
-      <w:pPr>
-        <w:spacing w:after="120"/>
-        <w:rPr>
-          <w:rFonts w:ascii="Aptos" w:hAnsi="Aptos"/>
-          <w:sz w:val="22"/>
-        </w:rPr>
-      </w:pPr>
-      <w:r>
-        <w:rPr>
-          <w:rFonts w:ascii="Aptos" w:hAnsi="Aptos"/>
-          <w:sz w:val="22"/>
-        </w:rPr>
-        <w:t>Use retry only when the current executor cannot safely resume. FixLab must preserve the worktree and must not discard prior changes.</w:t>
-      </w:r>
-    </w:p>
-    <w:p>
-      <w:pPr>
-        <w:pStyle w:val="Heading1"/>
-      </w:pPr>
-      <w:r>
-        <w:t>12. Expected completion evidence</w:t>
-      </w:r>
-    </w:p>
-    <w:p>
-      <w:pPr>
-        <w:spacing w:after="120"/>
-        <w:rPr>
-          <w:rFonts w:ascii="Aptos" w:hAnsi="Aptos"/>
-          <w:sz w:val="22"/>
-        </w:rPr>
-      </w:pPr>
-      <w:r>
-        <w:rPr>
-          <w:rFonts w:ascii="Aptos" w:hAnsi="Aptos"/>
-          <w:sz w:val="22"/>
-        </w:rPr>
-        <w:t>- Focused tests and required build/type-check results.</w:t>
-      </w:r>
-    </w:p>
-    <w:p>
-      <w:pPr>
-        <w:spacing w:after="120"/>
-        <w:rPr>
-          <w:rFonts w:ascii="Aptos" w:hAnsi="Aptos"/>
-          <w:sz w:val="22"/>
-        </w:rPr>
-      </w:pPr>
-      <w:r>
-        <w:rPr>
-          <w:rFonts w:ascii="Aptos" w:hAnsi="Aptos"/>
-          <w:sz w:val="22"/>
-        </w:rPr>
-        <w:t>- Explicit pass, failure, skipped, blocked, or timeout status for every required gate.</w:t>
-      </w:r>
-    </w:p>
-    <w:p>
-      <w:pPr>
-        <w:spacing w:after="120"/>
-        <w:rPr>
-          <w:rFonts w:ascii="Aptos" w:hAnsi="Aptos"/>
-          <w:sz w:val="22"/>
-        </w:rPr>
-      </w:pPr>
-      <w:r>
-        <w:rPr>
-          <w:rFonts w:ascii="Aptos" w:hAnsi="Aptos"/>
-          <w:sz w:val="22"/>
-        </w:rPr>
-        <w:lastRenderedPageBreak/>
-        <w:t>- Non-sensitive Playwright screenshots or API assertions when required.</w:t>
-      </w:r>
-    </w:p>
-    <w:p>
-      <w:pPr>
-        <w:spacing w:after="120"/>
-        <w:rPr>
-          <w:rFonts w:ascii="Aptos" w:hAnsi="Aptos"/>
-          <w:sz w:val="22"/>
-        </w:rPr>
-      </w:pPr>
-      <w:r>
-        <w:rPr>
-          <w:rFonts w:ascii="Aptos" w:hAnsi="Aptos"/>
-          <w:sz w:val="22"/>
-        </w:rPr>
-        <w:t>- The branch, commit, pull-request URL or number, and remote policy status when available.</w:t>
-      </w:r>
-    </w:p>
-    <w:p>
-      <w:pPr>
-        <w:spacing w:after="120"/>
-        <w:rPr>
-          <w:rFonts w:ascii="Aptos" w:hAnsi="Aptos"/>
-          <w:sz w:val="22"/>
-        </w:rPr>
-      </w:pPr>
-      <w:r>
-        <w:rPr>
-          <w:rFonts w:ascii="Aptos" w:hAnsi="Aptos"/>
-          <w:sz w:val="22"/>
-        </w:rPr>
         <w:t>- No unrelated files, credentials, authenticated browser state, or temporary generated tests in the product PR.</w:t>
       </w:r>
     </w:p>

</xml_diff>